<commit_message>
layoutuudistus: kaksipalstainen sovellusrakenne (sivupalkki + näkymät), sisältö ennallaan
Co-Authored-By: Claude Fable 5 <noreply@anthropic.com>
Claude-Session: https://claude.ai/code/session_01WLu7m3NNTZnXJVQ9kuPvzX
</commit_message>
<xml_diff>
--- a/downloads/bittibiomi-tyopaketti.docx
+++ b/downloads/bittibiomi-tyopaketti.docx
@@ -11,7 +11,7 @@
         <w:rPr>
           <w:b/>
           <w:bCs/>
-          <w:color w:val="1B5E20"/>
+          <w:color w:val="1b5e20"/>
           <w:sz w:val="72"/>
           <w:szCs w:val="72"/>
         </w:rPr>
@@ -28,7 +28,7 @@
           <w:sz w:val="28"/>
           <w:szCs w:val="28"/>
         </w:rPr>
-        <w:t xml:space="preserve">Paperinen työpaketti · ohjattu näyttöprojekti</w:t>
+        <w:t xml:space="preserve">Paperinen työpaketti</w:t>
       </w:r>
     </w:p>
     <w:p>
@@ -71,7 +71,7 @@
           <w:sz w:val="21"/>
           <w:szCs w:val="21"/>
         </w:rPr>
-        <w:t xml:space="preserve">Tämä paketti on aikataulu ja tarkistuslista tilanteisiin, joissa sivusto ei ole auki. Projektipäiväkirja kirjoitetaan sivustolla ja viedään repositorion project-docs-kansioon. Rasti tässä vihossa ei ole palautus — työnäyte on aina Git-repositoryssa.</w:t>
+        <w:t xml:space="preserve">Tämä paketti on aikataulu ja tarkistuslista tilanteisiin, joissa sivusto ei ole auki. Projektipäiväkirja kirjoitetaan sivustolla ja viedään repositoryn project-docs-kansioon. Rasti tässä vihossa ei ole palautus: työ on aina Git-repositoryssa.</w:t>
       </w:r>
     </w:p>
     <w:p>
@@ -102,7 +102,7 @@
         <w:rPr>
           <w:b/>
           <w:bCs/>
-          <w:color w:val="1B5E20"/>
+          <w:color w:val="1b5e20"/>
         </w:rPr>
         <w:t xml:space="preserve">Aikataulu yhdellä aukeamalla</w:t>
       </w:r>
@@ -120,10 +120,10 @@
         </w:tblBorders>
       </w:tblPr>
       <w:tblGrid>
-        <w:gridCol w:w="900"/>
-        <w:gridCol w:w="1800"/>
-        <w:gridCol w:w="5138"/>
-        <w:gridCol w:w="1800"/>
+        <w:gridCol w:w="904"/>
+        <w:gridCol w:w="1807"/>
+        <w:gridCol w:w="5120"/>
+        <w:gridCol w:w="1807"/>
       </w:tblGrid>
       <w:tr>
         <w:trPr>
@@ -131,8 +131,8 @@
         </w:trPr>
         <w:tc>
           <w:tcPr>
-            <w:tcW w:type="dxa" w:w="900"/>
-            <w:shd w:fill="E8F5E9" w:val="clear"/>
+            <w:tcW w:type="dxa" w:w="904"/>
+            <w:shd w:fill="e8f5e9" w:val="clear"/>
             <w:tcMar>
               <w:top w:type="dxa" w:w="60"/>
               <w:left w:type="dxa" w:w="100"/>
@@ -157,8 +157,8 @@
         </w:tc>
         <w:tc>
           <w:tcPr>
-            <w:tcW w:type="dxa" w:w="1800"/>
-            <w:shd w:fill="E8F5E9" w:val="clear"/>
+            <w:tcW w:type="dxa" w:w="1807"/>
+            <w:shd w:fill="e8f5e9" w:val="clear"/>
             <w:tcMar>
               <w:top w:type="dxa" w:w="60"/>
               <w:left w:type="dxa" w:w="100"/>
@@ -183,8 +183,8 @@
         </w:tc>
         <w:tc>
           <w:tcPr>
-            <w:tcW w:type="dxa" w:w="5138"/>
-            <w:shd w:fill="E8F5E9" w:val="clear"/>
+            <w:tcW w:type="dxa" w:w="5120"/>
+            <w:shd w:fill="e8f5e9" w:val="clear"/>
             <w:tcMar>
               <w:top w:type="dxa" w:w="60"/>
               <w:left w:type="dxa" w:w="100"/>
@@ -209,8 +209,8 @@
         </w:tc>
         <w:tc>
           <w:tcPr>
-            <w:tcW w:type="dxa" w:w="1800"/>
-            <w:shd w:fill="E8F5E9" w:val="clear"/>
+            <w:tcW w:type="dxa" w:w="1807"/>
+            <w:shd w:fill="e8f5e9" w:val="clear"/>
             <w:tcMar>
               <w:top w:type="dxa" w:w="60"/>
               <w:left w:type="dxa" w:w="100"/>
@@ -237,7 +237,7 @@
       <w:tr>
         <w:tc>
           <w:tcPr>
-            <w:tcW w:type="dxa" w:w="900"/>
+            <w:tcW w:type="dxa" w:w="904"/>
             <w:tcMar>
               <w:top w:type="dxa" w:w="60"/>
               <w:left w:type="dxa" w:w="100"/>
@@ -262,7 +262,7 @@
         </w:tc>
         <w:tc>
           <w:tcPr>
-            <w:tcW w:type="dxa" w:w="1800"/>
+            <w:tcW w:type="dxa" w:w="1807"/>
             <w:tcMar>
               <w:top w:type="dxa" w:w="60"/>
               <w:left w:type="dxa" w:w="100"/>
@@ -285,7 +285,7 @@
         </w:tc>
         <w:tc>
           <w:tcPr>
-            <w:tcW w:type="dxa" w:w="5138"/>
+            <w:tcW w:type="dxa" w:w="5120"/>
             <w:tcMar>
               <w:top w:type="dxa" w:w="60"/>
               <w:left w:type="dxa" w:w="100"/>
@@ -308,7 +308,7 @@
         </w:tc>
         <w:tc>
           <w:tcPr>
-            <w:tcW w:type="dxa" w:w="1800"/>
+            <w:tcW w:type="dxa" w:w="1807"/>
             <w:tcMar>
               <w:top w:type="dxa" w:w="60"/>
               <w:left w:type="dxa" w:w="100"/>
@@ -333,7 +333,7 @@
       <w:tr>
         <w:tc>
           <w:tcPr>
-            <w:tcW w:type="dxa" w:w="900"/>
+            <w:tcW w:type="dxa" w:w="904"/>
             <w:tcMar>
               <w:top w:type="dxa" w:w="60"/>
               <w:left w:type="dxa" w:w="100"/>
@@ -358,7 +358,7 @@
         </w:tc>
         <w:tc>
           <w:tcPr>
-            <w:tcW w:type="dxa" w:w="1800"/>
+            <w:tcW w:type="dxa" w:w="1807"/>
             <w:tcMar>
               <w:top w:type="dxa" w:w="60"/>
               <w:left w:type="dxa" w:w="100"/>
@@ -381,7 +381,7 @@
         </w:tc>
         <w:tc>
           <w:tcPr>
-            <w:tcW w:type="dxa" w:w="5138"/>
+            <w:tcW w:type="dxa" w:w="5120"/>
             <w:tcMar>
               <w:top w:type="dxa" w:w="60"/>
               <w:left w:type="dxa" w:w="100"/>
@@ -404,7 +404,7 @@
         </w:tc>
         <w:tc>
           <w:tcPr>
-            <w:tcW w:type="dxa" w:w="1800"/>
+            <w:tcW w:type="dxa" w:w="1807"/>
             <w:tcMar>
               <w:top w:type="dxa" w:w="60"/>
               <w:left w:type="dxa" w:w="100"/>
@@ -429,7 +429,7 @@
       <w:tr>
         <w:tc>
           <w:tcPr>
-            <w:tcW w:type="dxa" w:w="900"/>
+            <w:tcW w:type="dxa" w:w="904"/>
             <w:tcMar>
               <w:top w:type="dxa" w:w="60"/>
               <w:left w:type="dxa" w:w="100"/>
@@ -454,7 +454,7 @@
         </w:tc>
         <w:tc>
           <w:tcPr>
-            <w:tcW w:type="dxa" w:w="1800"/>
+            <w:tcW w:type="dxa" w:w="1807"/>
             <w:tcMar>
               <w:top w:type="dxa" w:w="60"/>
               <w:left w:type="dxa" w:w="100"/>
@@ -477,7 +477,7 @@
         </w:tc>
         <w:tc>
           <w:tcPr>
-            <w:tcW w:type="dxa" w:w="5138"/>
+            <w:tcW w:type="dxa" w:w="5120"/>
             <w:tcMar>
               <w:top w:type="dxa" w:w="60"/>
               <w:left w:type="dxa" w:w="100"/>
@@ -500,7 +500,7 @@
         </w:tc>
         <w:tc>
           <w:tcPr>
-            <w:tcW w:type="dxa" w:w="1800"/>
+            <w:tcW w:type="dxa" w:w="1807"/>
             <w:tcMar>
               <w:top w:type="dxa" w:w="60"/>
               <w:left w:type="dxa" w:w="100"/>
@@ -525,7 +525,7 @@
       <w:tr>
         <w:tc>
           <w:tcPr>
-            <w:tcW w:type="dxa" w:w="900"/>
+            <w:tcW w:type="dxa" w:w="904"/>
             <w:tcMar>
               <w:top w:type="dxa" w:w="60"/>
               <w:left w:type="dxa" w:w="100"/>
@@ -550,7 +550,7 @@
         </w:tc>
         <w:tc>
           <w:tcPr>
-            <w:tcW w:type="dxa" w:w="1800"/>
+            <w:tcW w:type="dxa" w:w="1807"/>
             <w:tcMar>
               <w:top w:type="dxa" w:w="60"/>
               <w:left w:type="dxa" w:w="100"/>
@@ -573,7 +573,7 @@
         </w:tc>
         <w:tc>
           <w:tcPr>
-            <w:tcW w:type="dxa" w:w="5138"/>
+            <w:tcW w:type="dxa" w:w="5120"/>
             <w:tcMar>
               <w:top w:type="dxa" w:w="60"/>
               <w:left w:type="dxa" w:w="100"/>
@@ -596,7 +596,7 @@
         </w:tc>
         <w:tc>
           <w:tcPr>
-            <w:tcW w:type="dxa" w:w="1800"/>
+            <w:tcW w:type="dxa" w:w="1807"/>
             <w:tcMar>
               <w:top w:type="dxa" w:w="60"/>
               <w:left w:type="dxa" w:w="100"/>
@@ -621,7 +621,7 @@
       <w:tr>
         <w:tc>
           <w:tcPr>
-            <w:tcW w:type="dxa" w:w="900"/>
+            <w:tcW w:type="dxa" w:w="904"/>
             <w:tcMar>
               <w:top w:type="dxa" w:w="60"/>
               <w:left w:type="dxa" w:w="100"/>
@@ -646,7 +646,7 @@
         </w:tc>
         <w:tc>
           <w:tcPr>
-            <w:tcW w:type="dxa" w:w="1800"/>
+            <w:tcW w:type="dxa" w:w="1807"/>
             <w:tcMar>
               <w:top w:type="dxa" w:w="60"/>
               <w:left w:type="dxa" w:w="100"/>
@@ -669,7 +669,7 @@
         </w:tc>
         <w:tc>
           <w:tcPr>
-            <w:tcW w:type="dxa" w:w="5138"/>
+            <w:tcW w:type="dxa" w:w="5120"/>
             <w:tcMar>
               <w:top w:type="dxa" w:w="60"/>
               <w:left w:type="dxa" w:w="100"/>
@@ -692,7 +692,7 @@
         </w:tc>
         <w:tc>
           <w:tcPr>
-            <w:tcW w:type="dxa" w:w="1800"/>
+            <w:tcW w:type="dxa" w:w="1807"/>
             <w:tcMar>
               <w:top w:type="dxa" w:w="60"/>
               <w:left w:type="dxa" w:w="100"/>
@@ -717,7 +717,7 @@
       <w:tr>
         <w:tc>
           <w:tcPr>
-            <w:tcW w:type="dxa" w:w="900"/>
+            <w:tcW w:type="dxa" w:w="904"/>
             <w:tcMar>
               <w:top w:type="dxa" w:w="60"/>
               <w:left w:type="dxa" w:w="100"/>
@@ -742,7 +742,7 @@
         </w:tc>
         <w:tc>
           <w:tcPr>
-            <w:tcW w:type="dxa" w:w="1800"/>
+            <w:tcW w:type="dxa" w:w="1807"/>
             <w:tcMar>
               <w:top w:type="dxa" w:w="60"/>
               <w:left w:type="dxa" w:w="100"/>
@@ -765,7 +765,7 @@
         </w:tc>
         <w:tc>
           <w:tcPr>
-            <w:tcW w:type="dxa" w:w="5138"/>
+            <w:tcW w:type="dxa" w:w="5120"/>
             <w:tcMar>
               <w:top w:type="dxa" w:w="60"/>
               <w:left w:type="dxa" w:w="100"/>
@@ -788,7 +788,7 @@
         </w:tc>
         <w:tc>
           <w:tcPr>
-            <w:tcW w:type="dxa" w:w="1800"/>
+            <w:tcW w:type="dxa" w:w="1807"/>
             <w:tcMar>
               <w:top w:type="dxa" w:w="60"/>
               <w:left w:type="dxa" w:w="100"/>
@@ -813,7 +813,7 @@
       <w:tr>
         <w:tc>
           <w:tcPr>
-            <w:tcW w:type="dxa" w:w="900"/>
+            <w:tcW w:type="dxa" w:w="904"/>
             <w:tcMar>
               <w:top w:type="dxa" w:w="60"/>
               <w:left w:type="dxa" w:w="100"/>
@@ -838,7 +838,7 @@
         </w:tc>
         <w:tc>
           <w:tcPr>
-            <w:tcW w:type="dxa" w:w="1800"/>
+            <w:tcW w:type="dxa" w:w="1807"/>
             <w:tcMar>
               <w:top w:type="dxa" w:w="60"/>
               <w:left w:type="dxa" w:w="100"/>
@@ -861,7 +861,7 @@
         </w:tc>
         <w:tc>
           <w:tcPr>
-            <w:tcW w:type="dxa" w:w="5138"/>
+            <w:tcW w:type="dxa" w:w="5120"/>
             <w:tcMar>
               <w:top w:type="dxa" w:w="60"/>
               <w:left w:type="dxa" w:w="100"/>
@@ -884,7 +884,7 @@
         </w:tc>
         <w:tc>
           <w:tcPr>
-            <w:tcW w:type="dxa" w:w="1800"/>
+            <w:tcW w:type="dxa" w:w="1807"/>
             <w:tcMar>
               <w:top w:type="dxa" w:w="60"/>
               <w:left w:type="dxa" w:w="100"/>
@@ -909,7 +909,7 @@
       <w:tr>
         <w:tc>
           <w:tcPr>
-            <w:tcW w:type="dxa" w:w="900"/>
+            <w:tcW w:type="dxa" w:w="904"/>
             <w:tcMar>
               <w:top w:type="dxa" w:w="60"/>
               <w:left w:type="dxa" w:w="100"/>
@@ -934,7 +934,7 @@
         </w:tc>
         <w:tc>
           <w:tcPr>
-            <w:tcW w:type="dxa" w:w="1800"/>
+            <w:tcW w:type="dxa" w:w="1807"/>
             <w:tcMar>
               <w:top w:type="dxa" w:w="60"/>
               <w:left w:type="dxa" w:w="100"/>
@@ -957,7 +957,7 @@
         </w:tc>
         <w:tc>
           <w:tcPr>
-            <w:tcW w:type="dxa" w:w="5138"/>
+            <w:tcW w:type="dxa" w:w="5120"/>
             <w:tcMar>
               <w:top w:type="dxa" w:w="60"/>
               <w:left w:type="dxa" w:w="100"/>
@@ -980,7 +980,7 @@
         </w:tc>
         <w:tc>
           <w:tcPr>
-            <w:tcW w:type="dxa" w:w="1800"/>
+            <w:tcW w:type="dxa" w:w="1807"/>
             <w:tcMar>
               <w:top w:type="dxa" w:w="60"/>
               <w:left w:type="dxa" w:w="100"/>
@@ -1005,7 +1005,7 @@
       <w:tr>
         <w:tc>
           <w:tcPr>
-            <w:tcW w:type="dxa" w:w="900"/>
+            <w:tcW w:type="dxa" w:w="904"/>
             <w:tcMar>
               <w:top w:type="dxa" w:w="60"/>
               <w:left w:type="dxa" w:w="100"/>
@@ -1028,7 +1028,7 @@
         </w:tc>
         <w:tc>
           <w:tcPr>
-            <w:tcW w:type="dxa" w:w="1800"/>
+            <w:tcW w:type="dxa" w:w="1807"/>
             <w:tcMar>
               <w:top w:type="dxa" w:w="60"/>
               <w:left w:type="dxa" w:w="100"/>
@@ -1051,47 +1051,47 @@
         </w:tc>
         <w:tc>
           <w:tcPr>
-            <w:tcW w:type="dxa" w:w="5138"/>
-            <w:tcMar>
-              <w:top w:type="dxa" w:w="60"/>
-              <w:left w:type="dxa" w:w="100"/>
-              <w:bottom w:type="dxa" w:w="60"/>
-              <w:right w:type="dxa" w:w="100"/>
-            </w:tcMar>
-          </w:tcPr>
-          <w:p>
-            <w:pPr>
-              <w:spacing w:after="0"/>
-            </w:pPr>
-            <w:r>
-              <w:rPr>
-                <w:sz w:val="19"/>
-                <w:szCs w:val="19"/>
-              </w:rPr>
-              <w:t xml:space="preserve">Syysloma — ei projektityötä</w:t>
-            </w:r>
-          </w:p>
-        </w:tc>
-        <w:tc>
-          <w:tcPr>
-            <w:tcW w:type="dxa" w:w="1800"/>
-            <w:tcMar>
-              <w:top w:type="dxa" w:w="60"/>
-              <w:left w:type="dxa" w:w="100"/>
-              <w:bottom w:type="dxa" w:w="60"/>
-              <w:right w:type="dxa" w:w="100"/>
-            </w:tcMar>
-          </w:tcPr>
-          <w:p>
-            <w:pPr>
-              <w:spacing w:after="0"/>
-            </w:pPr>
-            <w:r>
-              <w:rPr>
-                <w:sz w:val="19"/>
-                <w:szCs w:val="19"/>
-              </w:rPr>
-              <w:t xml:space="preserve">—</w:t>
+            <w:tcW w:type="dxa" w:w="5120"/>
+            <w:tcMar>
+              <w:top w:type="dxa" w:w="60"/>
+              <w:left w:type="dxa" w:w="100"/>
+              <w:bottom w:type="dxa" w:w="60"/>
+              <w:right w:type="dxa" w:w="100"/>
+            </w:tcMar>
+          </w:tcPr>
+          <w:p>
+            <w:pPr>
+              <w:spacing w:after="0"/>
+            </w:pPr>
+            <w:r>
+              <w:rPr>
+                <w:sz w:val="19"/>
+                <w:szCs w:val="19"/>
+              </w:rPr>
+              <w:t xml:space="preserve">Syysloma – ei projektityötä</w:t>
+            </w:r>
+          </w:p>
+        </w:tc>
+        <w:tc>
+          <w:tcPr>
+            <w:tcW w:type="dxa" w:w="1807"/>
+            <w:tcMar>
+              <w:top w:type="dxa" w:w="60"/>
+              <w:left w:type="dxa" w:w="100"/>
+              <w:bottom w:type="dxa" w:w="60"/>
+              <w:right w:type="dxa" w:w="100"/>
+            </w:tcMar>
+          </w:tcPr>
+          <w:p>
+            <w:pPr>
+              <w:spacing w:after="0"/>
+            </w:pPr>
+            <w:r>
+              <w:rPr>
+                <w:sz w:val="19"/>
+                <w:szCs w:val="19"/>
+              </w:rPr>
+              <w:t xml:space="preserve">–</w:t>
             </w:r>
           </w:p>
         </w:tc>
@@ -1099,7 +1099,7 @@
       <w:tr>
         <w:tc>
           <w:tcPr>
-            <w:tcW w:type="dxa" w:w="900"/>
+            <w:tcW w:type="dxa" w:w="904"/>
             <w:tcMar>
               <w:top w:type="dxa" w:w="60"/>
               <w:left w:type="dxa" w:w="100"/>
@@ -1124,7 +1124,7 @@
         </w:tc>
         <w:tc>
           <w:tcPr>
-            <w:tcW w:type="dxa" w:w="1800"/>
+            <w:tcW w:type="dxa" w:w="1807"/>
             <w:tcMar>
               <w:top w:type="dxa" w:w="60"/>
               <w:left w:type="dxa" w:w="100"/>
@@ -1147,7 +1147,7 @@
         </w:tc>
         <w:tc>
           <w:tcPr>
-            <w:tcW w:type="dxa" w:w="5138"/>
+            <w:tcW w:type="dxa" w:w="5120"/>
             <w:tcMar>
               <w:top w:type="dxa" w:w="60"/>
               <w:left w:type="dxa" w:w="100"/>
@@ -1170,7 +1170,7 @@
         </w:tc>
         <w:tc>
           <w:tcPr>
-            <w:tcW w:type="dxa" w:w="1800"/>
+            <w:tcW w:type="dxa" w:w="1807"/>
             <w:tcMar>
               <w:top w:type="dxa" w:w="60"/>
               <w:left w:type="dxa" w:w="100"/>
@@ -1195,7 +1195,7 @@
       <w:tr>
         <w:tc>
           <w:tcPr>
-            <w:tcW w:type="dxa" w:w="900"/>
+            <w:tcW w:type="dxa" w:w="904"/>
             <w:tcMar>
               <w:top w:type="dxa" w:w="60"/>
               <w:left w:type="dxa" w:w="100"/>
@@ -1220,7 +1220,7 @@
         </w:tc>
         <w:tc>
           <w:tcPr>
-            <w:tcW w:type="dxa" w:w="1800"/>
+            <w:tcW w:type="dxa" w:w="1807"/>
             <w:tcMar>
               <w:top w:type="dxa" w:w="60"/>
               <w:left w:type="dxa" w:w="100"/>
@@ -1243,7 +1243,7 @@
         </w:tc>
         <w:tc>
           <w:tcPr>
-            <w:tcW w:type="dxa" w:w="5138"/>
+            <w:tcW w:type="dxa" w:w="5120"/>
             <w:tcMar>
               <w:top w:type="dxa" w:w="60"/>
               <w:left w:type="dxa" w:w="100"/>
@@ -1266,7 +1266,7 @@
         </w:tc>
         <w:tc>
           <w:tcPr>
-            <w:tcW w:type="dxa" w:w="1800"/>
+            <w:tcW w:type="dxa" w:w="1807"/>
             <w:tcMar>
               <w:top w:type="dxa" w:w="60"/>
               <w:left w:type="dxa" w:w="100"/>
@@ -1291,7 +1291,7 @@
       <w:tr>
         <w:tc>
           <w:tcPr>
-            <w:tcW w:type="dxa" w:w="900"/>
+            <w:tcW w:type="dxa" w:w="904"/>
             <w:tcMar>
               <w:top w:type="dxa" w:w="60"/>
               <w:left w:type="dxa" w:w="100"/>
@@ -1316,7 +1316,7 @@
         </w:tc>
         <w:tc>
           <w:tcPr>
-            <w:tcW w:type="dxa" w:w="1800"/>
+            <w:tcW w:type="dxa" w:w="1807"/>
             <w:tcMar>
               <w:top w:type="dxa" w:w="60"/>
               <w:left w:type="dxa" w:w="100"/>
@@ -1339,7 +1339,7 @@
         </w:tc>
         <w:tc>
           <w:tcPr>
-            <w:tcW w:type="dxa" w:w="5138"/>
+            <w:tcW w:type="dxa" w:w="5120"/>
             <w:tcMar>
               <w:top w:type="dxa" w:w="60"/>
               <w:left w:type="dxa" w:w="100"/>
@@ -1362,7 +1362,7 @@
         </w:tc>
         <w:tc>
           <w:tcPr>
-            <w:tcW w:type="dxa" w:w="1800"/>
+            <w:tcW w:type="dxa" w:w="1807"/>
             <w:tcMar>
               <w:top w:type="dxa" w:w="60"/>
               <w:left w:type="dxa" w:w="100"/>
@@ -1387,7 +1387,7 @@
       <w:tr>
         <w:tc>
           <w:tcPr>
-            <w:tcW w:type="dxa" w:w="900"/>
+            <w:tcW w:type="dxa" w:w="904"/>
             <w:tcMar>
               <w:top w:type="dxa" w:w="60"/>
               <w:left w:type="dxa" w:w="100"/>
@@ -1412,7 +1412,7 @@
         </w:tc>
         <w:tc>
           <w:tcPr>
-            <w:tcW w:type="dxa" w:w="1800"/>
+            <w:tcW w:type="dxa" w:w="1807"/>
             <w:tcMar>
               <w:top w:type="dxa" w:w="60"/>
               <w:left w:type="dxa" w:w="100"/>
@@ -1435,7 +1435,7 @@
         </w:tc>
         <w:tc>
           <w:tcPr>
-            <w:tcW w:type="dxa" w:w="5138"/>
+            <w:tcW w:type="dxa" w:w="5120"/>
             <w:tcMar>
               <w:top w:type="dxa" w:w="60"/>
               <w:left w:type="dxa" w:w="100"/>
@@ -1458,7 +1458,7 @@
         </w:tc>
         <w:tc>
           <w:tcPr>
-            <w:tcW w:type="dxa" w:w="1800"/>
+            <w:tcW w:type="dxa" w:w="1807"/>
             <w:tcMar>
               <w:top w:type="dxa" w:w="60"/>
               <w:left w:type="dxa" w:w="100"/>
@@ -1483,7 +1483,7 @@
       <w:tr>
         <w:tc>
           <w:tcPr>
-            <w:tcW w:type="dxa" w:w="900"/>
+            <w:tcW w:type="dxa" w:w="904"/>
             <w:tcMar>
               <w:top w:type="dxa" w:w="60"/>
               <w:left w:type="dxa" w:w="100"/>
@@ -1508,7 +1508,7 @@
         </w:tc>
         <w:tc>
           <w:tcPr>
-            <w:tcW w:type="dxa" w:w="1800"/>
+            <w:tcW w:type="dxa" w:w="1807"/>
             <w:tcMar>
               <w:top w:type="dxa" w:w="60"/>
               <w:left w:type="dxa" w:w="100"/>
@@ -1531,7 +1531,7 @@
         </w:tc>
         <w:tc>
           <w:tcPr>
-            <w:tcW w:type="dxa" w:w="5138"/>
+            <w:tcW w:type="dxa" w:w="5120"/>
             <w:tcMar>
               <w:top w:type="dxa" w:w="60"/>
               <w:left w:type="dxa" w:w="100"/>
@@ -1554,7 +1554,7 @@
         </w:tc>
         <w:tc>
           <w:tcPr>
-            <w:tcW w:type="dxa" w:w="1800"/>
+            <w:tcW w:type="dxa" w:w="1807"/>
             <w:tcMar>
               <w:top w:type="dxa" w:w="60"/>
               <w:left w:type="dxa" w:w="100"/>
@@ -1579,7 +1579,7 @@
       <w:tr>
         <w:tc>
           <w:tcPr>
-            <w:tcW w:type="dxa" w:w="900"/>
+            <w:tcW w:type="dxa" w:w="904"/>
             <w:tcMar>
               <w:top w:type="dxa" w:w="60"/>
               <w:left w:type="dxa" w:w="100"/>
@@ -1604,7 +1604,7 @@
         </w:tc>
         <w:tc>
           <w:tcPr>
-            <w:tcW w:type="dxa" w:w="1800"/>
+            <w:tcW w:type="dxa" w:w="1807"/>
             <w:tcMar>
               <w:top w:type="dxa" w:w="60"/>
               <w:left w:type="dxa" w:w="100"/>
@@ -1627,7 +1627,7 @@
         </w:tc>
         <w:tc>
           <w:tcPr>
-            <w:tcW w:type="dxa" w:w="5138"/>
+            <w:tcW w:type="dxa" w:w="5120"/>
             <w:tcMar>
               <w:top w:type="dxa" w:w="60"/>
               <w:left w:type="dxa" w:w="100"/>
@@ -1650,7 +1650,7 @@
         </w:tc>
         <w:tc>
           <w:tcPr>
-            <w:tcW w:type="dxa" w:w="1800"/>
+            <w:tcW w:type="dxa" w:w="1807"/>
             <w:tcMar>
               <w:top w:type="dxa" w:w="60"/>
               <w:left w:type="dxa" w:w="100"/>
@@ -1675,7 +1675,7 @@
       <w:tr>
         <w:tc>
           <w:tcPr>
-            <w:tcW w:type="dxa" w:w="900"/>
+            <w:tcW w:type="dxa" w:w="904"/>
             <w:tcMar>
               <w:top w:type="dxa" w:w="60"/>
               <w:left w:type="dxa" w:w="100"/>
@@ -1700,7 +1700,7 @@
         </w:tc>
         <w:tc>
           <w:tcPr>
-            <w:tcW w:type="dxa" w:w="1800"/>
+            <w:tcW w:type="dxa" w:w="1807"/>
             <w:tcMar>
               <w:top w:type="dxa" w:w="60"/>
               <w:left w:type="dxa" w:w="100"/>
@@ -1723,7 +1723,7 @@
         </w:tc>
         <w:tc>
           <w:tcPr>
-            <w:tcW w:type="dxa" w:w="5138"/>
+            <w:tcW w:type="dxa" w:w="5120"/>
             <w:tcMar>
               <w:top w:type="dxa" w:w="60"/>
               <w:left w:type="dxa" w:w="100"/>
@@ -1746,7 +1746,7 @@
         </w:tc>
         <w:tc>
           <w:tcPr>
-            <w:tcW w:type="dxa" w:w="1800"/>
+            <w:tcW w:type="dxa" w:w="1807"/>
             <w:tcMar>
               <w:top w:type="dxa" w:w="60"/>
               <w:left w:type="dxa" w:w="100"/>
@@ -1798,9 +1798,9 @@
         <w:rPr>
           <w:b/>
           <w:bCs/>
-          <w:color w:val="1B5E20"/>
-        </w:rPr>
-        <w:t xml:space="preserve">Vaihe A — Paketin ydin: teema, työkalut ja ensimmäiset omat tekstuurit</w:t>
+          <w:color w:val="1b5e20"/>
+        </w:rPr>
+        <w:t xml:space="preserve">Vaihe A – Paketin ydin: teema, työkalut ja ensimmäiset omat tekstuurit</w:t>
       </w:r>
     </w:p>
     <w:p>
@@ -1812,9 +1812,9 @@
         <w:rPr>
           <w:b/>
           <w:bCs/>
-          <w:color w:val="1B5E20"/>
-        </w:rPr>
-        <w:t xml:space="preserve">Vko 34 · 17.–21.8. — Aloitus: teema ja työkalut</w:t>
+          <w:color w:val="1b5e20"/>
+        </w:rPr>
+        <w:t xml:space="preserve">Vko 34 · 17.–21.8. – Aloitus: teema ja työkalut</w:t>
       </w:r>
     </w:p>
     <w:p>
@@ -1874,7 +1874,7 @@
       </w:pPr>
       <w:r>
         <w:rPr>
-          <w:color w:val="1B5E20"/>
+          <w:color w:val="1b5e20"/>
           <w:sz w:val="19"/>
           <w:szCs w:val="19"/>
         </w:rPr>
@@ -1903,9 +1903,9 @@
         <w:rPr>
           <w:b/>
           <w:bCs/>
-          <w:color w:val="1B5E20"/>
-        </w:rPr>
-        <w:t xml:space="preserve">Vko 35 · 24.–28.8. — Asset-pack-suunnitelma: teema ja sisältölista</w:t>
+          <w:color w:val="1b5e20"/>
+        </w:rPr>
+        <w:t xml:space="preserve">Vko 35 · 24.–28.8. – Asset-pack-suunnitelma: teema ja sisältölista</w:t>
       </w:r>
     </w:p>
     <w:p>
@@ -1965,7 +1965,7 @@
       </w:pPr>
       <w:r>
         <w:rPr>
-          <w:color w:val="1B5E20"/>
+          <w:color w:val="1b5e20"/>
           <w:sz w:val="19"/>
           <w:szCs w:val="19"/>
         </w:rPr>
@@ -1994,9 +1994,9 @@
         <w:rPr>
           <w:b/>
           <w:bCs/>
-          <w:color w:val="1B5E20"/>
-        </w:rPr>
-        <w:t xml:space="preserve">Vko 36 · 31.8.–4.9. — Asset 1 · Ensimmäiset blokkitekstuurit peliin</w:t>
+          <w:color w:val="1b5e20"/>
+        </w:rPr>
+        <w:t xml:space="preserve">Vko 36 · 31.8.–4.9. – Asset 1 · Ensimmäiset blokkitekstuurit peliin</w:t>
       </w:r>
     </w:p>
     <w:p>
@@ -2056,7 +2056,7 @@
       </w:pPr>
       <w:r>
         <w:rPr>
-          <w:color w:val="1B5E20"/>
+          <w:color w:val="1b5e20"/>
           <w:sz w:val="19"/>
           <w:szCs w:val="19"/>
         </w:rPr>
@@ -2085,9 +2085,9 @@
         <w:rPr>
           <w:b/>
           <w:bCs/>
-          <w:color w:val="1B5E20"/>
-        </w:rPr>
-        <w:t xml:space="preserve">Vko 37 · 7.–11.9. — Asset 2 · Esinetekstuurit ja omat nimet</w:t>
+          <w:color w:val="1b5e20"/>
+        </w:rPr>
+        <w:t xml:space="preserve">Vko 37 · 7.–11.9. – Asset 2 · Esinetekstuurit ja omat nimet</w:t>
       </w:r>
     </w:p>
     <w:p>
@@ -2147,7 +2147,7 @@
       </w:pPr>
       <w:r>
         <w:rPr>
-          <w:color w:val="1B5E20"/>
+          <w:color w:val="1b5e20"/>
           <w:sz w:val="19"/>
           <w:szCs w:val="19"/>
         </w:rPr>
@@ -2176,9 +2176,9 @@
         <w:rPr>
           <w:b/>
           <w:bCs/>
-          <w:color w:val="1B5E20"/>
-        </w:rPr>
-        <w:t xml:space="preserve">Vaihe B — Paketin featuret: 3D-mallit, äänet ja katselmointi</w:t>
+          <w:color w:val="1b5e20"/>
+        </w:rPr>
+        <w:t xml:space="preserve">Vaihe B – Paketin featuret: 3D-mallit, äänet ja katselmointi</w:t>
       </w:r>
     </w:p>
     <w:p>
@@ -2190,9 +2190,9 @@
         <w:rPr>
           <w:b/>
           <w:bCs/>
-          <w:color w:val="1B5E20"/>
-        </w:rPr>
-        <w:t xml:space="preserve">Vko 38 · 14.–18.9. — Asset 3 · Ensimmäinen Blockbench-malli</w:t>
+          <w:color w:val="1b5e20"/>
+        </w:rPr>
+        <w:t xml:space="preserve">Vko 38 · 14.–18.9. – Asset 3 · Ensimmäinen Blockbench-malli</w:t>
       </w:r>
     </w:p>
     <w:p>
@@ -2252,7 +2252,7 @@
       </w:pPr>
       <w:r>
         <w:rPr>
-          <w:color w:val="1B5E20"/>
+          <w:color w:val="1b5e20"/>
           <w:sz w:val="19"/>
           <w:szCs w:val="19"/>
         </w:rPr>
@@ -2281,9 +2281,9 @@
         <w:rPr>
           <w:b/>
           <w:bCs/>
-          <w:color w:val="1B5E20"/>
-        </w:rPr>
-        <w:t xml:space="preserve">Vko 39 · 21.–25.9. — Asset 4 · Isompi malli tai hahmon uusi ilme</w:t>
+          <w:color w:val="1b5e20"/>
+        </w:rPr>
+        <w:t xml:space="preserve">Vko 39 · 21.–25.9. – Asset 4 · Isompi malli tai hahmon uusi ilme</w:t>
       </w:r>
     </w:p>
     <w:p>
@@ -2343,7 +2343,7 @@
       </w:pPr>
       <w:r>
         <w:rPr>
-          <w:color w:val="1B5E20"/>
+          <w:color w:val="1b5e20"/>
           <w:sz w:val="19"/>
           <w:szCs w:val="19"/>
         </w:rPr>
@@ -2372,9 +2372,9 @@
         <w:rPr>
           <w:b/>
           <w:bCs/>
-          <w:color w:val="1B5E20"/>
-        </w:rPr>
-        <w:t xml:space="preserve">Vko 40 · 28.9.–2.10. — Asset 5 · Äänet ja tunnelma</w:t>
+          <w:color w:val="1b5e20"/>
+        </w:rPr>
+        <w:t xml:space="preserve">Vko 40 · 28.9.–2.10. – Asset 5 · Äänet ja tunnelma</w:t>
       </w:r>
     </w:p>
     <w:p>
@@ -2434,7 +2434,7 @@
       </w:pPr>
       <w:r>
         <w:rPr>
-          <w:color w:val="1B5E20"/>
+          <w:color w:val="1b5e20"/>
           <w:sz w:val="19"/>
           <w:szCs w:val="19"/>
         </w:rPr>
@@ -2463,9 +2463,9 @@
         <w:rPr>
           <w:b/>
           <w:bCs/>
-          <w:color w:val="1B5E20"/>
-        </w:rPr>
-        <w:t xml:space="preserve">Vko 41 · 5.–9.10. — Katselmointi · Ensimmäiset testaajat</w:t>
+          <w:color w:val="1b5e20"/>
+        </w:rPr>
+        <w:t xml:space="preserve">Vko 41 · 5.–9.10. – Katselmointi · Ensimmäiset testaajat</w:t>
       </w:r>
     </w:p>
     <w:p>
@@ -2525,7 +2525,7 @@
       </w:pPr>
       <w:r>
         <w:rPr>
-          <w:color w:val="1B5E20"/>
+          <w:color w:val="1b5e20"/>
           <w:sz w:val="19"/>
           <w:szCs w:val="19"/>
         </w:rPr>
@@ -2543,20 +2543,6 @@
           <w:szCs w:val="19"/>
         </w:rPr>
         <w:t xml:space="preserve">Työnäyte Git-repositoryyn ennen rastia: katselmointiloki, esittelyn runko, palaute, päätetty muutos ja toimiva väliversio-zip.</w:t>
-      </w:r>
-    </w:p>
-    <w:p>
-      <w:pPr>
-        <w:pStyle w:val="Heading1"/>
-        <w:spacing w:after="160" w:before="320"/>
-      </w:pPr>
-      <w:r>
-        <w:rPr>
-          <w:b/>
-          <w:bCs/>
-          <w:color w:val="1B5E20"/>
-        </w:rPr>
-        <w:t xml:space="preserve">Vaihe C — Paketti valmiiksi: skriptit, palautemuutos ja laatu</w:t>
       </w:r>
     </w:p>
     <w:p>
@@ -2570,7 +2556,7 @@
           <w:bCs/>
           <w:color w:val="8A6D00"/>
         </w:rPr>
-        <w:t xml:space="preserve">Vko 42 · 12.–16.10. — Syysloma</w:t>
+        <w:t xml:space="preserve">Vko 42 · 12.–16.10. – Syysloma</w:t>
       </w:r>
     </w:p>
     <w:p>
@@ -2583,6 +2569,20 @@
           <w:szCs w:val="21"/>
         </w:rPr>
         <w:t xml:space="preserve">Ei projektityötä eikä korvaavia tehtäviä. Jatka viikolla 43 viimeisimmästä toimivasta main-versiosta.</w:t>
+      </w:r>
+    </w:p>
+    <w:p>
+      <w:pPr>
+        <w:pStyle w:val="Heading1"/>
+        <w:spacing w:after="160" w:before="320"/>
+      </w:pPr>
+      <w:r>
+        <w:rPr>
+          <w:b/>
+          <w:bCs/>
+          <w:color w:val="1b5e20"/>
+        </w:rPr>
+        <w:t xml:space="preserve">Vaihe C – Paketti valmiiksi: skriptit, palautemuutos ja laatu</w:t>
       </w:r>
     </w:p>
     <w:p>
@@ -2594,9 +2594,9 @@
         <w:rPr>
           <w:b/>
           <w:bCs/>
-          <w:color w:val="1B5E20"/>
-        </w:rPr>
-        <w:t xml:space="preserve">Vko 43 · 19.–23.10. — Asset 6 · Palautemuutos ja datapaketin runko</w:t>
+          <w:color w:val="1b5e20"/>
+        </w:rPr>
+        <w:t xml:space="preserve">Vko 43 · 19.–23.10. – Asset 6 · Palautemuutos ja datapaketin runko</w:t>
       </w:r>
     </w:p>
     <w:p>
@@ -2656,7 +2656,7 @@
       </w:pPr>
       <w:r>
         <w:rPr>
-          <w:color w:val="1B5E20"/>
+          <w:color w:val="1b5e20"/>
           <w:sz w:val="19"/>
           <w:szCs w:val="19"/>
         </w:rPr>
@@ -2685,9 +2685,9 @@
         <w:rPr>
           <w:b/>
           <w:bCs/>
-          <w:color w:val="1B5E20"/>
-        </w:rPr>
-        <w:t xml:space="preserve">Vko 44 · 26.–30.10. — Asset 7 · Skriptattu ominaisuus</w:t>
+          <w:color w:val="1b5e20"/>
+        </w:rPr>
+        <w:t xml:space="preserve">Vko 44 · 26.–30.10. – Asset 7 · Skriptattu ominaisuus</w:t>
       </w:r>
     </w:p>
     <w:p>
@@ -2747,7 +2747,7 @@
       </w:pPr>
       <w:r>
         <w:rPr>
-          <w:color w:val="1B5E20"/>
+          <w:color w:val="1b5e20"/>
           <w:sz w:val="19"/>
           <w:szCs w:val="19"/>
         </w:rPr>
@@ -2776,9 +2776,9 @@
         <w:rPr>
           <w:b/>
           <w:bCs/>
-          <w:color w:val="1B5E20"/>
-        </w:rPr>
-        <w:t xml:space="preserve">Vko 45 · 2.–6.11. — Paketin laatu · Paketti kestää käyttöä</w:t>
+          <w:color w:val="1b5e20"/>
+        </w:rPr>
+        <w:t xml:space="preserve">Vko 45 · 2.–6.11. – Paketin laatu · Paketti kestää käyttöä</w:t>
       </w:r>
     </w:p>
     <w:p>
@@ -2838,7 +2838,7 @@
       </w:pPr>
       <w:r>
         <w:rPr>
-          <w:color w:val="1B5E20"/>
+          <w:color w:val="1b5e20"/>
           <w:sz w:val="19"/>
           <w:szCs w:val="19"/>
         </w:rPr>
@@ -2867,9 +2867,9 @@
         <w:rPr>
           <w:b/>
           <w:bCs/>
-          <w:color w:val="1B5E20"/>
-        </w:rPr>
-        <w:t xml:space="preserve">Vko 46 · 9.–13.11. — Paketin laatu · Rakenne, jonka toinen ymmärtää</w:t>
+          <w:color w:val="1b5e20"/>
+        </w:rPr>
+        <w:t xml:space="preserve">Vko 46 · 9.–13.11. – Paketin laatu · Rakenne, jonka toinen ymmärtää</w:t>
       </w:r>
     </w:p>
     <w:p>
@@ -2929,7 +2929,7 @@
       </w:pPr>
       <w:r>
         <w:rPr>
-          <w:color w:val="1B5E20"/>
+          <w:color w:val="1b5e20"/>
           <w:sz w:val="19"/>
           <w:szCs w:val="19"/>
         </w:rPr>
@@ -2958,9 +2958,9 @@
         <w:rPr>
           <w:b/>
           <w:bCs/>
-          <w:color w:val="1B5E20"/>
-        </w:rPr>
-        <w:t xml:space="preserve">Vaihe D — Julkaisu ja näyttö</w:t>
+          <w:color w:val="1b5e20"/>
+        </w:rPr>
+        <w:t xml:space="preserve">Vaihe D – Julkaisu ja näyttö</w:t>
       </w:r>
     </w:p>
     <w:p>
@@ -2972,9 +2972,9 @@
         <w:rPr>
           <w:b/>
           <w:bCs/>
-          <w:color w:val="1B5E20"/>
-        </w:rPr>
-        <w:t xml:space="preserve">Vko 47 · 16.–20.11. — Julkaisu · RC1 testikäytössä</w:t>
+          <w:color w:val="1b5e20"/>
+        </w:rPr>
+        <w:t xml:space="preserve">Vko 47 · 16.–20.11. – Julkaisu · RC1 testikäytössä</w:t>
       </w:r>
     </w:p>
     <w:p>
@@ -3034,7 +3034,7 @@
       </w:pPr>
       <w:r>
         <w:rPr>
-          <w:color w:val="1B5E20"/>
+          <w:color w:val="1b5e20"/>
           <w:sz w:val="19"/>
           <w:szCs w:val="19"/>
         </w:rPr>
@@ -3063,9 +3063,9 @@
         <w:rPr>
           <w:b/>
           <w:bCs/>
-          <w:color w:val="1B5E20"/>
-        </w:rPr>
-        <w:t xml:space="preserve">Vko 48 · 23.–27.11. — Julkaisu · v1.0 julki</w:t>
+          <w:color w:val="1b5e20"/>
+        </w:rPr>
+        <w:t xml:space="preserve">Vko 48 · 23.–27.11. – Julkaisu · v1.0 julki</w:t>
       </w:r>
     </w:p>
     <w:p>
@@ -3137,7 +3137,7 @@
       </w:pPr>
       <w:r>
         <w:rPr>
-          <w:color w:val="1B5E20"/>
+          <w:color w:val="1b5e20"/>
           <w:sz w:val="19"/>
           <w:szCs w:val="19"/>
         </w:rPr>
@@ -3166,9 +3166,9 @@
         <w:rPr>
           <w:b/>
           <w:bCs/>
-          <w:color w:val="1B5E20"/>
-        </w:rPr>
-        <w:t xml:space="preserve">Vko 49 · 30.11.–4.12. — Näyttö · Aineisto ja luovutus</w:t>
+          <w:color w:val="1b5e20"/>
+        </w:rPr>
+        <w:t xml:space="preserve">Vko 49 · 30.11.–4.12. – Näyttö · Aineisto ja luovutus</w:t>
       </w:r>
     </w:p>
     <w:p>
@@ -3240,7 +3240,7 @@
       </w:pPr>
       <w:r>
         <w:rPr>
-          <w:color w:val="1B5E20"/>
+          <w:color w:val="1b5e20"/>
           <w:sz w:val="19"/>
           <w:szCs w:val="19"/>
         </w:rPr>
@@ -3274,7 +3274,7 @@
         <w:rPr>
           <w:b/>
           <w:bCs/>
-          <w:color w:val="1B5E20"/>
+          <w:color w:val="1b5e20"/>
         </w:rPr>
         <w:t xml:space="preserve">Viimeiset viisi päivää</w:t>
       </w:r>
@@ -3363,9 +3363,9 @@
         <w:rPr>
           <w:b/>
           <w:bCs/>
-          <w:color w:val="1B5E20"/>
-        </w:rPr>
-        <w:t xml:space="preserve">Näyttömatriisi — 32 osaamisvaatimusta</w:t>
+          <w:color w:val="1b5e20"/>
+        </w:rPr>
+        <w:t xml:space="preserve">Näyttömatriisi – 32 osaamisvaatimusta</w:t>
       </w:r>
     </w:p>
     <w:p>
@@ -3390,141 +3390,141 @@
         <w:rPr>
           <w:b/>
           <w:bCs/>
-          <w:color w:val="1B5E20"/>
-        </w:rPr>
-        <w:t xml:space="preserve">Ohjelmointi · 11 vaatimusta</w:t>
-      </w:r>
-    </w:p>
-    <w:p>
-      <w:pPr>
-        <w:spacing w:after="60" w:before="0"/>
-      </w:pPr>
-      <w:r>
-        <w:rPr>
-          <w:sz w:val="19"/>
-          <w:szCs w:val="19"/>
-        </w:rPr>
-        <w:t xml:space="preserve">☐  Kehitysympäristö — Blockbench- ja editorikuva, peliin ladattu paketti ja repository.</w:t>
-      </w:r>
-    </w:p>
-    <w:p>
-      <w:pPr>
-        <w:spacing w:after="60" w:before="0"/>
-      </w:pPr>
-      <w:r>
-        <w:rPr>
-          <w:sz w:val="19"/>
-          <w:szCs w:val="19"/>
-        </w:rPr>
-        <w:t xml:space="preserve">☐  Virheenkorjaus — Kolme täydellistä ketjua aidoista havainnoista tai opettajan merkitsemistä vikatehtävistä.</w:t>
-      </w:r>
-    </w:p>
-    <w:p>
-      <w:pPr>
-        <w:spacing w:after="60" w:before="0"/>
-      </w:pPr>
-      <w:r>
-        <w:rPr>
-          <w:sz w:val="19"/>
-          <w:szCs w:val="19"/>
-        </w:rPr>
-        <w:t xml:space="preserve">☐  Toimintojen testaus — 12 testiä odotettuine ja toteutuneine tuloksineen.</w:t>
-      </w:r>
-    </w:p>
-    <w:p>
-      <w:pPr>
-        <w:spacing w:after="60" w:before="0"/>
-      </w:pPr>
-      <w:r>
-        <w:rPr>
-          <w:sz w:val="19"/>
-          <w:szCs w:val="19"/>
-        </w:rPr>
-        <w:t xml:space="preserve">☐  Rakenteinen ohjelmointi — Datapaketin funktiot ja reseptit jaettu selkeisiin vastuisiin omassa nimiavaruudessa.</w:t>
-      </w:r>
-    </w:p>
-    <w:p>
-      <w:pPr>
-        <w:spacing w:after="60" w:before="0"/>
-      </w:pPr>
-      <w:r>
-        <w:rPr>
-          <w:sz w:val="19"/>
-          <w:szCs w:val="19"/>
-        </w:rPr>
-        <w:t xml:space="preserve">☐  Ylläpidettävä koodi — Selkeät tiedostonimet, siisti JSON ja siivouscommit.</w:t>
-      </w:r>
-    </w:p>
-    <w:p>
-      <w:pPr>
-        <w:spacing w:after="60" w:before="0"/>
-      </w:pPr>
-      <w:r>
-        <w:rPr>
-          <w:sz w:val="19"/>
-          <w:szCs w:val="19"/>
-        </w:rPr>
-        <w:t xml:space="preserve">☐  Käyttöliittymä — Pelinäkymän luettavuus: tekstuurien ja nimien ennen/jälkeen-kuvat.</w:t>
-      </w:r>
-    </w:p>
-    <w:p>
-      <w:pPr>
-        <w:spacing w:after="60" w:before="0"/>
-      </w:pPr>
-      <w:r>
-        <w:rPr>
-          <w:sz w:val="19"/>
-          <w:szCs w:val="19"/>
-        </w:rPr>
-        <w:t xml:space="preserve">☐  Toimintojen toteutus — Asset-tehtävät, valmis kun -ehdot, issuet ja commitit.</w:t>
-      </w:r>
-    </w:p>
-    <w:p>
-      <w:pPr>
-        <w:spacing w:after="60" w:before="0"/>
-      </w:pPr>
-      <w:r>
-        <w:rPr>
-          <w:sz w:val="19"/>
-          <w:szCs w:val="19"/>
-        </w:rPr>
-        <w:t xml:space="preserve">☐  Tehtävistä sopiminen — Tehtävälista ja kokousmuistio.</w:t>
-      </w:r>
-    </w:p>
-    <w:p>
-      <w:pPr>
-        <w:spacing w:after="60" w:before="0"/>
-      </w:pPr>
-      <w:r>
-        <w:rPr>
-          <w:sz w:val="19"/>
-          <w:szCs w:val="19"/>
-        </w:rPr>
-        <w:t xml:space="preserve">☐  Ratkaisuvaihtoehdot — Kahden toteutustavan vertailu (vko 39) ja päätös.</w:t>
-      </w:r>
-    </w:p>
-    <w:p>
-      <w:pPr>
-        <w:spacing w:after="60" w:before="0"/>
-      </w:pPr>
-      <w:r>
-        <w:rPr>
-          <w:sz w:val="19"/>
-          <w:szCs w:val="19"/>
-        </w:rPr>
-        <w:t xml:space="preserve">☐  Ratkaisujen arviointi — Paketti- tai versiokatselmoinnin loki.</w:t>
-      </w:r>
-    </w:p>
-    <w:p>
-      <w:pPr>
-        <w:spacing w:after="60" w:before="0"/>
-      </w:pPr>
-      <w:r>
-        <w:rPr>
-          <w:sz w:val="19"/>
-          <w:szCs w:val="19"/>
-        </w:rPr>
-        <w:t xml:space="preserve">☐  Oma toiminta tiimissä — Itsearviointi ja seuraava kehitysaskel.</w:t>
+          <w:color w:val="1b5e20"/>
+        </w:rPr>
+        <w:t xml:space="preserve">Ohjelmointi</w:t>
+      </w:r>
+    </w:p>
+    <w:p>
+      <w:pPr>
+        <w:spacing w:after="60" w:before="0"/>
+      </w:pPr>
+      <w:r>
+        <w:rPr>
+          <w:sz w:val="19"/>
+          <w:szCs w:val="19"/>
+        </w:rPr>
+        <w:t xml:space="preserve">☐  Kehitysympäristö – Blockbench- ja editorikuva, peliin ladattu paketti ja repository.</w:t>
+      </w:r>
+    </w:p>
+    <w:p>
+      <w:pPr>
+        <w:spacing w:after="60" w:before="0"/>
+      </w:pPr>
+      <w:r>
+        <w:rPr>
+          <w:sz w:val="19"/>
+          <w:szCs w:val="19"/>
+        </w:rPr>
+        <w:t xml:space="preserve">☐  Virheenkorjaus – Kolme täydellistä ketjua aidoista havainnoista tai opettajan merkitsemistä vikatehtävistä.</w:t>
+      </w:r>
+    </w:p>
+    <w:p>
+      <w:pPr>
+        <w:spacing w:after="60" w:before="0"/>
+      </w:pPr>
+      <w:r>
+        <w:rPr>
+          <w:sz w:val="19"/>
+          <w:szCs w:val="19"/>
+        </w:rPr>
+        <w:t xml:space="preserve">☐  Toimintojen testaus – 12 testiä odotettuine ja toteutuneine tuloksineen.</w:t>
+      </w:r>
+    </w:p>
+    <w:p>
+      <w:pPr>
+        <w:spacing w:after="60" w:before="0"/>
+      </w:pPr>
+      <w:r>
+        <w:rPr>
+          <w:sz w:val="19"/>
+          <w:szCs w:val="19"/>
+        </w:rPr>
+        <w:t xml:space="preserve">☐  Rakenteinen ohjelmointi – Datapaketin funktiot ja reseptit jaettu selkeisiin vastuisiin omassa nimiavaruudessa.</w:t>
+      </w:r>
+    </w:p>
+    <w:p>
+      <w:pPr>
+        <w:spacing w:after="60" w:before="0"/>
+      </w:pPr>
+      <w:r>
+        <w:rPr>
+          <w:sz w:val="19"/>
+          <w:szCs w:val="19"/>
+        </w:rPr>
+        <w:t xml:space="preserve">☐  Ylläpidettävä koodi – Selkeät tiedostonimet, siisti JSON ja siivouscommit.</w:t>
+      </w:r>
+    </w:p>
+    <w:p>
+      <w:pPr>
+        <w:spacing w:after="60" w:before="0"/>
+      </w:pPr>
+      <w:r>
+        <w:rPr>
+          <w:sz w:val="19"/>
+          <w:szCs w:val="19"/>
+        </w:rPr>
+        <w:t xml:space="preserve">☐  Käyttöliittymä – Pelinäkymän luettavuus: tekstuurien ja nimien ennen/jälkeen-kuvat.</w:t>
+      </w:r>
+    </w:p>
+    <w:p>
+      <w:pPr>
+        <w:spacing w:after="60" w:before="0"/>
+      </w:pPr>
+      <w:r>
+        <w:rPr>
+          <w:sz w:val="19"/>
+          <w:szCs w:val="19"/>
+        </w:rPr>
+        <w:t xml:space="preserve">☐  Toimintojen toteutus – Asset-tehtävät, valmis kun -ehdot, issuet ja commitit.</w:t>
+      </w:r>
+    </w:p>
+    <w:p>
+      <w:pPr>
+        <w:spacing w:after="60" w:before="0"/>
+      </w:pPr>
+      <w:r>
+        <w:rPr>
+          <w:sz w:val="19"/>
+          <w:szCs w:val="19"/>
+        </w:rPr>
+        <w:t xml:space="preserve">☐  Tehtävistä sopiminen – Tehtävälista ja kokousmuistio.</w:t>
+      </w:r>
+    </w:p>
+    <w:p>
+      <w:pPr>
+        <w:spacing w:after="60" w:before="0"/>
+      </w:pPr>
+      <w:r>
+        <w:rPr>
+          <w:sz w:val="19"/>
+          <w:szCs w:val="19"/>
+        </w:rPr>
+        <w:t xml:space="preserve">☐  Ratkaisuvaihtoehdot – Kahden toteutustavan vertailu (vko 39) ja päätös.</w:t>
+      </w:r>
+    </w:p>
+    <w:p>
+      <w:pPr>
+        <w:spacing w:after="60" w:before="0"/>
+      </w:pPr>
+      <w:r>
+        <w:rPr>
+          <w:sz w:val="19"/>
+          <w:szCs w:val="19"/>
+        </w:rPr>
+        <w:t xml:space="preserve">☐  Ratkaisujen arviointi – Paketti- tai versiokatselmoinnin loki.</w:t>
+      </w:r>
+    </w:p>
+    <w:p>
+      <w:pPr>
+        <w:spacing w:after="60" w:before="0"/>
+      </w:pPr>
+      <w:r>
+        <w:rPr>
+          <w:sz w:val="19"/>
+          <w:szCs w:val="19"/>
+        </w:rPr>
+        <w:t xml:space="preserve">☐  Oma toiminta tiimissä – Itsearviointi ja seuraava kehitysaskel.</w:t>
       </w:r>
     </w:p>
     <w:p>
@@ -3536,177 +3536,177 @@
         <w:rPr>
           <w:b/>
           <w:bCs/>
-          <w:color w:val="1B5E20"/>
-        </w:rPr>
-        <w:t xml:space="preserve">Ohjelmistokehittäjänä toimiminen · 14 vaatimusta</w:t>
-      </w:r>
-    </w:p>
-    <w:p>
-      <w:pPr>
-        <w:spacing w:after="60" w:before="0"/>
-      </w:pPr>
-      <w:r>
-        <w:rPr>
-          <w:sz w:val="19"/>
-          <w:szCs w:val="19"/>
-        </w:rPr>
-        <w:t xml:space="preserve">☐  Asiakkaan tarpeet — Kysymyslista ohjaajalle, aloitusmuistio ja kuvaus paketin kohdeyleisöstä.</w:t>
-      </w:r>
-    </w:p>
-    <w:p>
-      <w:pPr>
-        <w:spacing w:after="60" w:before="0"/>
-      </w:pPr>
-      <w:r>
-        <w:rPr>
-          <w:sz w:val="19"/>
-          <w:szCs w:val="19"/>
-        </w:rPr>
-        <w:t xml:space="preserve">☐  Asiakaslähtöinen viestintä — Ymmärrettävä yhteenveto vaihtoehdoista ja rajoista sekä lataajalle kirjoitettu README ja asennusohje.</w:t>
-      </w:r>
-    </w:p>
-    <w:p>
-      <w:pPr>
-        <w:spacing w:after="60" w:before="0"/>
-      </w:pPr>
-      <w:r>
-        <w:rPr>
-          <w:sz w:val="19"/>
-          <w:szCs w:val="19"/>
-        </w:rPr>
-        <w:t xml:space="preserve">☐  Version katselmointi — Lokit viikoilta 41 ja 47.</w:t>
-      </w:r>
-    </w:p>
-    <w:p>
-      <w:pPr>
-        <w:spacing w:after="60" w:before="0"/>
-      </w:pPr>
-      <w:r>
-        <w:rPr>
-          <w:sz w:val="19"/>
-          <w:szCs w:val="19"/>
-        </w:rPr>
-        <w:t xml:space="preserve">☐  Priorisointi — P0/P1/P2-backlog ennen ja jälkeen palautteen.</w:t>
-      </w:r>
-    </w:p>
-    <w:p>
-      <w:pPr>
-        <w:spacing w:after="60" w:before="0"/>
-      </w:pPr>
-      <w:r>
-        <w:rPr>
-          <w:sz w:val="19"/>
-          <w:szCs w:val="19"/>
-        </w:rPr>
-        <w:t xml:space="preserve">☐  Tehtäviksi jakaminen — 0,5–1 päivän issuet ja nimetyt tekijät.</w:t>
-      </w:r>
-    </w:p>
-    <w:p>
-      <w:pPr>
-        <w:spacing w:after="60" w:before="0"/>
-      </w:pPr>
-      <w:r>
-        <w:rPr>
-          <w:sz w:val="19"/>
-          <w:szCs w:val="19"/>
-        </w:rPr>
-        <w:t xml:space="preserve">☐  Suunnittelu ja arviointi — Työmääräarvio verrattuna toteumaan.</w:t>
-      </w:r>
-    </w:p>
-    <w:p>
-      <w:pPr>
-        <w:spacing w:after="60" w:before="0"/>
-      </w:pPr>
-      <w:r>
-        <w:rPr>
-          <w:sz w:val="19"/>
-          <w:szCs w:val="19"/>
-        </w:rPr>
-        <w:t xml:space="preserve">☐  Toimintalogiikka — Reseptit, funktiot, saavutus ja niiden ehdot.</w:t>
-      </w:r>
-    </w:p>
-    <w:p>
-      <w:pPr>
-        <w:spacing w:after="60" w:before="0"/>
-      </w:pPr>
-      <w:r>
-        <w:rPr>
-          <w:sz w:val="19"/>
-          <w:szCs w:val="19"/>
-        </w:rPr>
-        <w:t xml:space="preserve">☐  Tietovaraston valinta — JSON-tiedostojen rakenne ja perustelu.</w:t>
-      </w:r>
-    </w:p>
-    <w:p>
-      <w:pPr>
-        <w:spacing w:after="60" w:before="0"/>
-      </w:pPr>
-      <w:r>
-        <w:rPr>
-          <w:sz w:val="19"/>
-          <w:szCs w:val="19"/>
-        </w:rPr>
-        <w:t xml:space="preserve">☐  Yhteys tietovarastoon — Tekstuurien, mallien ja datan kytkeytyminen pelin resursseihin nimiavaruuksien kautta.</w:t>
-      </w:r>
-    </w:p>
-    <w:p>
-      <w:pPr>
-        <w:spacing w:after="60" w:before="0"/>
-      </w:pPr>
-      <w:r>
-        <w:rPr>
-          <w:sz w:val="19"/>
-          <w:szCs w:val="19"/>
-        </w:rPr>
-        <w:t xml:space="preserve">☐  Rajapinnat ja tieto — Pakettirajapinta: pack.mcmeta, tiedostopolut ja niitä vastaavat tiedostot.</w:t>
-      </w:r>
-    </w:p>
-    <w:p>
-      <w:pPr>
-        <w:spacing w:after="60" w:before="0"/>
-      </w:pPr>
-      <w:r>
-        <w:rPr>
-          <w:sz w:val="19"/>
-          <w:szCs w:val="19"/>
-        </w:rPr>
-        <w:t xml:space="preserve">☐  Tietoturva — Oma lisenssi ja kolmansien osapuolten lisenssit, luotettavat lataukset ja se, ettei julkisessa repositoryssa ole henkilötietoja tai salaisuuksia.</w:t>
-      </w:r>
-    </w:p>
-    <w:p>
-      <w:pPr>
-        <w:spacing w:after="60" w:before="0"/>
-      </w:pPr>
-      <w:r>
-        <w:rPr>
-          <w:sz w:val="19"/>
-          <w:szCs w:val="19"/>
-        </w:rPr>
-        <w:t xml:space="preserve">☐  Versionhallinta — Jatkuva Git-historia ja toimiva main.</w:t>
-      </w:r>
-    </w:p>
-    <w:p>
-      <w:pPr>
-        <w:spacing w:after="60" w:before="0"/>
-      </w:pPr>
-      <w:r>
-        <w:rPr>
-          <w:sz w:val="19"/>
-          <w:szCs w:val="19"/>
-        </w:rPr>
-        <w:t xml:space="preserve">☐  Osan liittäminen — Testattu merge tai pull request.</w:t>
-      </w:r>
-    </w:p>
-    <w:p>
-      <w:pPr>
-        <w:spacing w:after="60" w:before="0"/>
-      </w:pPr>
-      <w:r>
-        <w:rPr>
-          <w:sz w:val="19"/>
-          <w:szCs w:val="19"/>
-        </w:rPr>
-        <w:t xml:space="preserve">☐  Tuotantojulkaisu — Toimiva v1.0-release-linkki.</w:t>
+          <w:color w:val="1b5e20"/>
+        </w:rPr>
+        <w:t xml:space="preserve">Ohjelmistokehittäjänä toimiminen</w:t>
+      </w:r>
+    </w:p>
+    <w:p>
+      <w:pPr>
+        <w:spacing w:after="60" w:before="0"/>
+      </w:pPr>
+      <w:r>
+        <w:rPr>
+          <w:sz w:val="19"/>
+          <w:szCs w:val="19"/>
+        </w:rPr>
+        <w:t xml:space="preserve">☐  Asiakkaan tarpeet – Kysymyslista ohjaajalle, aloitusmuistio ja kuvaus paketin kohdeyleisöstä.</w:t>
+      </w:r>
+    </w:p>
+    <w:p>
+      <w:pPr>
+        <w:spacing w:after="60" w:before="0"/>
+      </w:pPr>
+      <w:r>
+        <w:rPr>
+          <w:sz w:val="19"/>
+          <w:szCs w:val="19"/>
+        </w:rPr>
+        <w:t xml:space="preserve">☐  Asiakaslähtöinen viestintä – Ymmärrettävä yhteenveto vaihtoehdoista ja rajoista sekä lataajalle kirjoitettu README ja asennusohje.</w:t>
+      </w:r>
+    </w:p>
+    <w:p>
+      <w:pPr>
+        <w:spacing w:after="60" w:before="0"/>
+      </w:pPr>
+      <w:r>
+        <w:rPr>
+          <w:sz w:val="19"/>
+          <w:szCs w:val="19"/>
+        </w:rPr>
+        <w:t xml:space="preserve">☐  Version katselmointi – Lokit viikoilta 41 ja 47.</w:t>
+      </w:r>
+    </w:p>
+    <w:p>
+      <w:pPr>
+        <w:spacing w:after="60" w:before="0"/>
+      </w:pPr>
+      <w:r>
+        <w:rPr>
+          <w:sz w:val="19"/>
+          <w:szCs w:val="19"/>
+        </w:rPr>
+        <w:t xml:space="preserve">☐  Priorisointi – P0/P1/P2-backlog ennen ja jälkeen palautteen.</w:t>
+      </w:r>
+    </w:p>
+    <w:p>
+      <w:pPr>
+        <w:spacing w:after="60" w:before="0"/>
+      </w:pPr>
+      <w:r>
+        <w:rPr>
+          <w:sz w:val="19"/>
+          <w:szCs w:val="19"/>
+        </w:rPr>
+        <w:t xml:space="preserve">☐  Tehtäviksi jakaminen – 0,5–1 päivän issuet ja nimetyt tekijät.</w:t>
+      </w:r>
+    </w:p>
+    <w:p>
+      <w:pPr>
+        <w:spacing w:after="60" w:before="0"/>
+      </w:pPr>
+      <w:r>
+        <w:rPr>
+          <w:sz w:val="19"/>
+          <w:szCs w:val="19"/>
+        </w:rPr>
+        <w:t xml:space="preserve">☐  Suunnittelu ja arviointi – Työmääräarvio verrattuna toteumaan.</w:t>
+      </w:r>
+    </w:p>
+    <w:p>
+      <w:pPr>
+        <w:spacing w:after="60" w:before="0"/>
+      </w:pPr>
+      <w:r>
+        <w:rPr>
+          <w:sz w:val="19"/>
+          <w:szCs w:val="19"/>
+        </w:rPr>
+        <w:t xml:space="preserve">☐  Toimintalogiikka – Reseptit, funktiot, saavutus ja niiden ehdot.</w:t>
+      </w:r>
+    </w:p>
+    <w:p>
+      <w:pPr>
+        <w:spacing w:after="60" w:before="0"/>
+      </w:pPr>
+      <w:r>
+        <w:rPr>
+          <w:sz w:val="19"/>
+          <w:szCs w:val="19"/>
+        </w:rPr>
+        <w:t xml:space="preserve">☐  Tietovaraston valinta – JSON-tiedostojen rakenne ja perustelu.</w:t>
+      </w:r>
+    </w:p>
+    <w:p>
+      <w:pPr>
+        <w:spacing w:after="60" w:before="0"/>
+      </w:pPr>
+      <w:r>
+        <w:rPr>
+          <w:sz w:val="19"/>
+          <w:szCs w:val="19"/>
+        </w:rPr>
+        <w:t xml:space="preserve">☐  Yhteys tietovarastoon – Tekstuurien, mallien ja datan kytkeytyminen pelin resursseihin nimiavaruuksien kautta.</w:t>
+      </w:r>
+    </w:p>
+    <w:p>
+      <w:pPr>
+        <w:spacing w:after="60" w:before="0"/>
+      </w:pPr>
+      <w:r>
+        <w:rPr>
+          <w:sz w:val="19"/>
+          <w:szCs w:val="19"/>
+        </w:rPr>
+        <w:t xml:space="preserve">☐  Rajapinnat ja tieto – Pakettirajapinta: pack.mcmeta, tiedostopolut ja niitä vastaavat tiedostot.</w:t>
+      </w:r>
+    </w:p>
+    <w:p>
+      <w:pPr>
+        <w:spacing w:after="60" w:before="0"/>
+      </w:pPr>
+      <w:r>
+        <w:rPr>
+          <w:sz w:val="19"/>
+          <w:szCs w:val="19"/>
+        </w:rPr>
+        <w:t xml:space="preserve">☐  Tietoturva – Oma lisenssi ja kolmansien osapuolten lisenssit, luotettavat lataukset ja se, ettei julkisessa repositoryssa ole henkilötietoja tai salaisuuksia.</w:t>
+      </w:r>
+    </w:p>
+    <w:p>
+      <w:pPr>
+        <w:spacing w:after="60" w:before="0"/>
+      </w:pPr>
+      <w:r>
+        <w:rPr>
+          <w:sz w:val="19"/>
+          <w:szCs w:val="19"/>
+        </w:rPr>
+        <w:t xml:space="preserve">☐  Versionhallinta – Jatkuva Git-historia ja toimiva main.</w:t>
+      </w:r>
+    </w:p>
+    <w:p>
+      <w:pPr>
+        <w:spacing w:after="60" w:before="0"/>
+      </w:pPr>
+      <w:r>
+        <w:rPr>
+          <w:sz w:val="19"/>
+          <w:szCs w:val="19"/>
+        </w:rPr>
+        <w:t xml:space="preserve">☐  Osan liittäminen – Testattu merge tai pull request.</w:t>
+      </w:r>
+    </w:p>
+    <w:p>
+      <w:pPr>
+        <w:spacing w:after="60" w:before="0"/>
+      </w:pPr>
+      <w:r>
+        <w:rPr>
+          <w:sz w:val="19"/>
+          <w:szCs w:val="19"/>
+        </w:rPr>
+        <w:t xml:space="preserve">☐  Tuotantojulkaisu – Toimiva v1.0-release-linkki.</w:t>
       </w:r>
     </w:p>
     <w:p>
@@ -3718,93 +3718,93 @@
         <w:rPr>
           <w:b/>
           <w:bCs/>
-          <w:color w:val="1B5E20"/>
-        </w:rPr>
-        <w:t xml:space="preserve">Ohjelmiston toteuttaminen ohjelmistokomponenttikirjastolla · 7 vaatimusta</w:t>
-      </w:r>
-    </w:p>
-    <w:p>
-      <w:pPr>
-        <w:spacing w:after="60" w:before="0"/>
-      </w:pPr>
-      <w:r>
-        <w:rPr>
-          <w:sz w:val="19"/>
-          <w:szCs w:val="19"/>
-        </w:rPr>
-        <w:t xml:space="preserve">☐  Kehittämisympäristön käyttöönotto — Blockbench, VS Code, sovittu Minecraft-versio ja paketin lataus peliin.</w:t>
-      </w:r>
-    </w:p>
-    <w:p>
-      <w:pPr>
-        <w:spacing w:after="60" w:before="0"/>
-      </w:pPr>
-      <w:r>
-        <w:rPr>
-          <w:sz w:val="19"/>
-          <w:szCs w:val="19"/>
-        </w:rPr>
-        <w:t xml:space="preserve">☐  Kirjaston mahdollisuudet ja rajoitteet — Viikon 45 kirjaus pakettijärjestelmän rajoituksista ja viikon 48 julkaisupäätökset tunnettuine puutteineen.</w:t>
-      </w:r>
-    </w:p>
-    <w:p>
-      <w:pPr>
-        <w:spacing w:after="60" w:before="0"/>
-      </w:pPr>
-      <w:r>
-        <w:rPr>
-          <w:sz w:val="19"/>
-          <w:szCs w:val="19"/>
-        </w:rPr>
-        <w:t xml:space="preserve">☐  Kirjaston toiminnot ja työkalut — Blockbenchin mallinnus, UV-editointi ja esikatselu committeina ja kuvina.</w:t>
-      </w:r>
-    </w:p>
-    <w:p>
-      <w:pPr>
-        <w:spacing w:after="60" w:before="0"/>
-      </w:pPr>
-      <w:r>
-        <w:rPr>
-          <w:sz w:val="19"/>
-          <w:szCs w:val="19"/>
-        </w:rPr>
-        <w:t xml:space="preserve">☐  Ulkoiset komponentit — Paletit, äänet ja referenssit tuotuina; lähteet ja lisenssit kirjattu CREDITS-tiedostoon.</w:t>
-      </w:r>
-    </w:p>
-    <w:p>
-      <w:pPr>
-        <w:spacing w:after="60" w:before="0"/>
-      </w:pPr>
-      <w:r>
-        <w:rPr>
-          <w:sz w:val="19"/>
-          <w:szCs w:val="19"/>
-        </w:rPr>
-        <w:t xml:space="preserve">☐  Suunnittelu, toteutus ja testaus kirjastolla — Asset-pack-suunnitelman päätökset ja backlog, Assetit 1–7 committeina, testiloki T01–T12.</w:t>
-      </w:r>
-    </w:p>
-    <w:p>
-      <w:pPr>
-        <w:spacing w:after="60" w:before="0"/>
-      </w:pPr>
-      <w:r>
-        <w:rPr>
-          <w:sz w:val="19"/>
-          <w:szCs w:val="19"/>
-        </w:rPr>
-        <w:t xml:space="preserve">☐  Julkaisu asiakkaan ympäristöön — Julkinen GitHub-release, jonka toinen henkilö on asentanut peliinsä pelkän ohjeen avulla.</w:t>
-      </w:r>
-    </w:p>
-    <w:p>
-      <w:pPr>
-        <w:spacing w:after="60" w:before="0"/>
-      </w:pPr>
-      <w:r>
-        <w:rPr>
-          <w:sz w:val="19"/>
-          <w:szCs w:val="19"/>
-        </w:rPr>
-        <w:t xml:space="preserve">☐  Ohjelmiston dokumentointi — Lataajalle: README, asennusohje, LICENSE, CREDITS ja CHANGELOG. Arviointiin: asset-pack-suunnitelma.md ja projektipäiväkirja.</w:t>
+          <w:color w:val="1b5e20"/>
+        </w:rPr>
+        <w:t xml:space="preserve">Ohjelmiston toteuttaminen ohjelmistokomponenttikirjastolla</w:t>
+      </w:r>
+    </w:p>
+    <w:p>
+      <w:pPr>
+        <w:spacing w:after="60" w:before="0"/>
+      </w:pPr>
+      <w:r>
+        <w:rPr>
+          <w:sz w:val="19"/>
+          <w:szCs w:val="19"/>
+        </w:rPr>
+        <w:t xml:space="preserve">☐  Kehittämisympäristön käyttöönotto – Blockbench, VS Code, sovittu Minecraft-versio ja paketin lataus peliin.</w:t>
+      </w:r>
+    </w:p>
+    <w:p>
+      <w:pPr>
+        <w:spacing w:after="60" w:before="0"/>
+      </w:pPr>
+      <w:r>
+        <w:rPr>
+          <w:sz w:val="19"/>
+          <w:szCs w:val="19"/>
+        </w:rPr>
+        <w:t xml:space="preserve">☐  Kirjaston mahdollisuudet ja rajoitteet – Viikon 45 kirjaus pakettijärjestelmän rajoituksista ja viikon 48 julkaisupäätökset tunnettuine puutteineen.</w:t>
+      </w:r>
+    </w:p>
+    <w:p>
+      <w:pPr>
+        <w:spacing w:after="60" w:before="0"/>
+      </w:pPr>
+      <w:r>
+        <w:rPr>
+          <w:sz w:val="19"/>
+          <w:szCs w:val="19"/>
+        </w:rPr>
+        <w:t xml:space="preserve">☐  Kirjaston toiminnot ja työkalut – Blockbenchin mallinnus, UV-editointi ja esikatselu committeina ja kuvina.</w:t>
+      </w:r>
+    </w:p>
+    <w:p>
+      <w:pPr>
+        <w:spacing w:after="60" w:before="0"/>
+      </w:pPr>
+      <w:r>
+        <w:rPr>
+          <w:sz w:val="19"/>
+          <w:szCs w:val="19"/>
+        </w:rPr>
+        <w:t xml:space="preserve">☐  Ulkoiset komponentit – Paletit, äänet ja referenssit tuotuina; lähteet ja lisenssit kirjattu CREDITS-tiedostoon.</w:t>
+      </w:r>
+    </w:p>
+    <w:p>
+      <w:pPr>
+        <w:spacing w:after="60" w:before="0"/>
+      </w:pPr>
+      <w:r>
+        <w:rPr>
+          <w:sz w:val="19"/>
+          <w:szCs w:val="19"/>
+        </w:rPr>
+        <w:t xml:space="preserve">☐  Suunnittelu, toteutus ja testaus kirjastolla – Asset-pack-suunnitelman päätökset ja backlog, Assetit 1–7 committeina, testiloki T01–T12.</w:t>
+      </w:r>
+    </w:p>
+    <w:p>
+      <w:pPr>
+        <w:spacing w:after="60" w:before="0"/>
+      </w:pPr>
+      <w:r>
+        <w:rPr>
+          <w:sz w:val="19"/>
+          <w:szCs w:val="19"/>
+        </w:rPr>
+        <w:t xml:space="preserve">☐  Julkaisu asiakkaan ympäristöön – Julkinen GitHub-release, jonka toinen henkilö on asentanut peliinsä pelkän ohjeen avulla.</w:t>
+      </w:r>
+    </w:p>
+    <w:p>
+      <w:pPr>
+        <w:spacing w:after="60" w:before="0"/>
+      </w:pPr>
+      <w:r>
+        <w:rPr>
+          <w:sz w:val="19"/>
+          <w:szCs w:val="19"/>
+        </w:rPr>
+        <w:t xml:space="preserve">☐  Ohjelmiston dokumentointi – Lataajalle: README, asennusohje, LICENSE, CREDITS ja CHANGELOG. Arviointiin: asset-pack-suunnitelma.md ja projektipäiväkirja.</w:t>
       </w:r>
     </w:p>
     <w:p>
@@ -3819,7 +3819,7 @@
           <w:sz w:val="21"/>
           <w:szCs w:val="21"/>
         </w:rPr>
-        <w:t xml:space="preserve">Muista: sivuston rastit ja kentät tallentuvat vain selaimeen. Ne eivät siirry opettajalle eivätkä korvaa Gitissä olevaa työnäytettä.</w:t>
+        <w:t xml:space="preserve">Muista: sivuston rastit ja kentät tallentuvat vain selaimeen. Ne eivät siirry opettajalle eivätkä korvaa Gitissä olevaa työtä.</w:t>
       </w:r>
     </w:p>
     <w:sectPr>

</xml_diff>

<commit_message>
Pedagoginen termistökorjaus: termit opetetaan ensikäytössä, projektikohtainen sanasto
Opiskelijalle näkyvä teksti käyttää tunnuksia ja lyhenteitä vasta kun niiden
merkitys on annettu: testitapaukset (T01…), prioriteetit P0/P1/P2, julkaisu-
ehdokas (RC), pull request, Git/GitHub-termit ja projektikohtainen tekninen
sanasto. Sanasto sisalto.js:n termisto-kenttään, Termit-näkymä ja viikkojen
termit-listat. Kuvitukset ja lataukset generoitu uudelleen samasta sisällöstä.

Co-Authored-By: Claude Fable 5.1 <noreply@anthropic.com>
</commit_message>
<xml_diff>
--- a/downloads/bittibiomi-tyopaketti.docx
+++ b/downloads/bittibiomi-tyopaketti.docx
@@ -4,7 +4,7 @@
   <w:body>
     <w:p>
       <w:pPr>
-        <w:spacing w:after="200" w:before="2400"/>
+        <w:spacing w:before="2400" w:after="200"/>
         <w:jc w:val="center"/>
       </w:pPr>
       <w:r>
@@ -96,7 +96,7 @@
     <w:p>
       <w:pPr>
         <w:pStyle w:val="Heading1"/>
-        <w:spacing w:after="160" w:before="320"/>
+        <w:spacing w:before="320" w:after="160"/>
       </w:pPr>
       <w:r>
         <w:rPr>
@@ -709,7 +709,7 @@
                 <w:sz w:val="19"/>
                 <w:szCs w:val="19"/>
               </w:rPr>
-              <w:t xml:space="preserve">B · Paketin featuret</w:t>
+              <w:t xml:space="preserve">B · Paketin ominaisuudet</w:t>
             </w:r>
           </w:p>
         </w:tc>
@@ -805,7 +805,7 @@
                 <w:sz w:val="19"/>
                 <w:szCs w:val="19"/>
               </w:rPr>
-              <w:t xml:space="preserve">B · Paketin featuret</w:t>
+              <w:t xml:space="preserve">B · Paketin ominaisuudet</w:t>
             </w:r>
           </w:p>
         </w:tc>
@@ -901,7 +901,7 @@
                 <w:sz w:val="19"/>
                 <w:szCs w:val="19"/>
               </w:rPr>
-              <w:t xml:space="preserve">B · Paketin featuret</w:t>
+              <w:t xml:space="preserve">B · Paketin ominaisuudet</w:t>
             </w:r>
           </w:p>
         </w:tc>
@@ -997,7 +997,7 @@
                 <w:sz w:val="19"/>
                 <w:szCs w:val="19"/>
               </w:rPr>
-              <w:t xml:space="preserve">B · Paketin featuret</w:t>
+              <w:t xml:space="preserve">B · Paketin ominaisuudet</w:t>
             </w:r>
           </w:p>
         </w:tc>
@@ -1548,7 +1548,7 @@
                 <w:sz w:val="19"/>
                 <w:szCs w:val="19"/>
               </w:rPr>
-              <w:t xml:space="preserve">Julkaisu · RC1 testikäytössä</w:t>
+              <w:t xml:space="preserve">Julkaisu · Julkaisuehdokas RC1 testissä</w:t>
             </w:r>
           </w:p>
         </w:tc>
@@ -1792,7 +1792,7 @@
     <w:p>
       <w:pPr>
         <w:pStyle w:val="Heading1"/>
-        <w:spacing w:after="160" w:before="320"/>
+        <w:spacing w:before="320" w:after="160"/>
       </w:pPr>
       <w:r>
         <w:rPr>
@@ -1806,7 +1806,7 @@
     <w:p>
       <w:pPr>
         <w:pStyle w:val="Heading2"/>
-        <w:spacing w:after="120" w:before="260"/>
+        <w:spacing w:before="260" w:after="120"/>
       </w:pPr>
       <w:r>
         <w:rPr>
@@ -1897,7 +1897,7 @@
     <w:p>
       <w:pPr>
         <w:pStyle w:val="Heading2"/>
-        <w:spacing w:after="120" w:before="260"/>
+        <w:spacing w:before="260" w:after="120"/>
       </w:pPr>
       <w:r>
         <w:rPr>
@@ -1969,7 +1969,7 @@
           <w:sz w:val="19"/>
           <w:szCs w:val="19"/>
         </w:rPr>
-        <w:t xml:space="preserve">Valmis kun: Pakollinen perusversio on hyväksytty. Jokaisella P0-tehtävällä on 0,5–1 päivän arvio ja havaittava valmis kun -ehto. Moodboardissa näkyvät paletti ja referenssit, ja sovittu LICENSE-tiedosto on repositoryn juuressa.</w:t>
+        <w:t xml:space="preserve">Valmis kun: Pakollinen ydin P0 on hyväksytty. Jokaisella P0-tehtävällä on 0,5–1 päivän arvio ja havaittava valmis kun -ehto. Moodboardissa näkyvät paletti ja referenssit, ja sovittu LICENSE-tiedosto on repositoryn juuressa.</w:t>
       </w:r>
     </w:p>
     <w:p>
@@ -1988,7 +1988,7 @@
     <w:p>
       <w:pPr>
         <w:pStyle w:val="Heading2"/>
-        <w:spacing w:after="120" w:before="260"/>
+        <w:spacing w:before="260" w:after="120"/>
       </w:pPr>
       <w:r>
         <w:rPr>
@@ -2079,7 +2079,7 @@
     <w:p>
       <w:pPr>
         <w:pStyle w:val="Heading2"/>
-        <w:spacing w:after="120" w:before="260"/>
+        <w:spacing w:before="260" w:after="120"/>
       </w:pPr>
       <w:r>
         <w:rPr>
@@ -2170,7 +2170,7 @@
     <w:p>
       <w:pPr>
         <w:pStyle w:val="Heading1"/>
-        <w:spacing w:after="160" w:before="320"/>
+        <w:spacing w:before="320" w:after="160"/>
       </w:pPr>
       <w:r>
         <w:rPr>
@@ -2178,13 +2178,13 @@
           <w:bCs/>
           <w:color w:val="1b5e20"/>
         </w:rPr>
-        <w:t xml:space="preserve">Vaihe B – Paketin featuret: 3D-mallit, äänet ja katselmointi</w:t>
+        <w:t xml:space="preserve">Vaihe B – Paketin ominaisuudet: 3D-mallit, äänet ja katselmointi</w:t>
       </w:r>
     </w:p>
     <w:p>
       <w:pPr>
         <w:pStyle w:val="Heading2"/>
-        <w:spacing w:after="120" w:before="260"/>
+        <w:spacing w:before="260" w:after="120"/>
       </w:pPr>
       <w:r>
         <w:rPr>
@@ -2275,7 +2275,7 @@
     <w:p>
       <w:pPr>
         <w:pStyle w:val="Heading2"/>
-        <w:spacing w:after="120" w:before="260"/>
+        <w:spacing w:before="260" w:after="120"/>
       </w:pPr>
       <w:r>
         <w:rPr>
@@ -2366,7 +2366,7 @@
     <w:p>
       <w:pPr>
         <w:pStyle w:val="Heading2"/>
-        <w:spacing w:after="120" w:before="260"/>
+        <w:spacing w:before="260" w:after="120"/>
       </w:pPr>
       <w:r>
         <w:rPr>
@@ -2457,7 +2457,7 @@
     <w:p>
       <w:pPr>
         <w:pStyle w:val="Heading2"/>
-        <w:spacing w:after="120" w:before="260"/>
+        <w:spacing w:before="260" w:after="120"/>
       </w:pPr>
       <w:r>
         <w:rPr>
@@ -2548,7 +2548,7 @@
     <w:p>
       <w:pPr>
         <w:pStyle w:val="Heading2"/>
-        <w:spacing w:after="120" w:before="260"/>
+        <w:spacing w:before="260" w:after="120"/>
       </w:pPr>
       <w:r>
         <w:rPr>
@@ -2574,7 +2574,7 @@
     <w:p>
       <w:pPr>
         <w:pStyle w:val="Heading1"/>
-        <w:spacing w:after="160" w:before="320"/>
+        <w:spacing w:before="320" w:after="160"/>
       </w:pPr>
       <w:r>
         <w:rPr>
@@ -2588,7 +2588,7 @@
     <w:p>
       <w:pPr>
         <w:pStyle w:val="Heading2"/>
-        <w:spacing w:after="120" w:before="260"/>
+        <w:spacing w:before="260" w:after="120"/>
       </w:pPr>
       <w:r>
         <w:rPr>
@@ -2623,7 +2623,7 @@
           <w:sz w:val="21"/>
           <w:szCs w:val="21"/>
         </w:rPr>
-        <w:t xml:space="preserve">☐  Muuta saatu palaute pieniksi tehtäviksi ja toteuta sovittu muutos omassa feature-branchissa eli muutokselle rajatussa Git-haarassa.</w:t>
+        <w:t xml:space="preserve">☐  Muuta saatu palaute pieniksi tehtäviksi ja toteuta sovittu muutos omassa haarassa eli muutokselle rajatussa kopiossa projektista.</w:t>
       </w:r>
     </w:p>
     <w:p>
@@ -2647,7 +2647,7 @@
           <w:sz w:val="21"/>
           <w:szCs w:val="21"/>
         </w:rPr>
-        <w:t xml:space="preserve">☐  Katselmoi, testaa ja yhdistä muutokset toimivaan main-versioon.</w:t>
+        <w:t xml:space="preserve">☐  Katselmoi, testaa ja yhdistä muutokset toimivaan main-haaraan.</w:t>
       </w:r>
     </w:p>
     <w:p>
@@ -2673,13 +2673,13 @@
           <w:sz w:val="19"/>
           <w:szCs w:val="19"/>
         </w:rPr>
-        <w:t xml:space="preserve">Työnäyte Git-repositoryyn ennen rastia: issue, branch/merge tai pull request, funktion commit ja katselmointiloki.</w:t>
+        <w:t xml:space="preserve">Työnäyte Git-repositoryyn ennen rastia: GitHub-issue, haara ja merge tai pull request, funktion commit ja katselmointiloki.</w:t>
       </w:r>
     </w:p>
     <w:p>
       <w:pPr>
         <w:pStyle w:val="Heading2"/>
-        <w:spacing w:after="120" w:before="260"/>
+        <w:spacing w:before="260" w:after="120"/>
       </w:pPr>
       <w:r>
         <w:rPr>
@@ -2770,7 +2770,7 @@
     <w:p>
       <w:pPr>
         <w:pStyle w:val="Heading2"/>
-        <w:spacing w:after="120" w:before="260"/>
+        <w:spacing w:before="260" w:after="120"/>
       </w:pPr>
       <w:r>
         <w:rPr>
@@ -2861,7 +2861,7 @@
     <w:p>
       <w:pPr>
         <w:pStyle w:val="Heading2"/>
-        <w:spacing w:after="120" w:before="260"/>
+        <w:spacing w:before="260" w:after="120"/>
       </w:pPr>
       <w:r>
         <w:rPr>
@@ -2952,7 +2952,7 @@
     <w:p>
       <w:pPr>
         <w:pStyle w:val="Heading1"/>
-        <w:spacing w:after="160" w:before="320"/>
+        <w:spacing w:before="320" w:after="160"/>
       </w:pPr>
       <w:r>
         <w:rPr>
@@ -2966,7 +2966,7 @@
     <w:p>
       <w:pPr>
         <w:pStyle w:val="Heading2"/>
-        <w:spacing w:after="120" w:before="260"/>
+        <w:spacing w:before="260" w:after="120"/>
       </w:pPr>
       <w:r>
         <w:rPr>
@@ -2974,7 +2974,7 @@
           <w:bCs/>
           <w:color w:val="1b5e20"/>
         </w:rPr>
-        <w:t xml:space="preserve">Vko 47 · 16.–20.11. – Julkaisu · RC1 testikäytössä</w:t>
+        <w:t xml:space="preserve">Vko 47 · 16.–20.11. – Julkaisu · Julkaisuehdokas RC1 testissä</w:t>
       </w:r>
     </w:p>
     <w:p>
@@ -3001,7 +3001,7 @@
           <w:sz w:val="21"/>
           <w:szCs w:val="21"/>
         </w:rPr>
-        <w:t xml:space="preserve">☐  Kokoa release candidate (RC1): zip-paketit ja lataajalle kirjoitettu asennusohje. Jäädytä uuden sisällön lisääminen.</w:t>
+        <w:t xml:space="preserve">☐  Kokoa ensimmäinen julkaisuehdokas eli release candidate (RC1): zip-paketit ja lataajalle kirjoitettu asennusohje. Jäädytä uuden sisällön lisääminen.</w:t>
       </w:r>
     </w:p>
     <w:p>
@@ -3057,7 +3057,7 @@
     <w:p>
       <w:pPr>
         <w:pStyle w:val="Heading2"/>
-        <w:spacing w:after="120" w:before="260"/>
+        <w:spacing w:before="260" w:after="120"/>
       </w:pPr>
       <w:r>
         <w:rPr>
@@ -3104,7 +3104,7 @@
           <w:sz w:val="21"/>
           <w:szCs w:val="21"/>
         </w:rPr>
-        <w:t xml:space="preserve">☐  Tee v1.0-tagi ja julkaise GitHub-release: zip-paketit, README, LICENSE, CHANGELOG, kuvakaappaukset ja asennusohje. Valinnainen bonus: julkaise lisäksi Modrinthissa tai Planet Minecraftissa opettajan kanssa sovitusti.</w:t>
+        <w:t xml:space="preserve">☐  Tee v1.0-tagi ja julkaise GitHub-release: zip-paketit, README, LICENSE, CHANGELOG eli muutosloki, kuvakaappaukset ja asennusohje. Valinnainen bonus: julkaise lisäksi Modrinthissa tai Planet Minecraftissa opettajan kanssa sovitusti.</w:t>
       </w:r>
     </w:p>
     <w:p>
@@ -3160,7 +3160,7 @@
     <w:p>
       <w:pPr>
         <w:pStyle w:val="Heading2"/>
-        <w:spacing w:after="120" w:before="260"/>
+        <w:spacing w:before="260" w:after="120"/>
       </w:pPr>
       <w:r>
         <w:rPr>
@@ -3268,7 +3268,7 @@
     <w:p>
       <w:pPr>
         <w:pStyle w:val="Heading1"/>
-        <w:spacing w:after="160" w:before="320"/>
+        <w:spacing w:before="320" w:after="160"/>
       </w:pPr>
       <w:r>
         <w:rPr>
@@ -3357,7 +3357,7 @@
     <w:p>
       <w:pPr>
         <w:pStyle w:val="Heading1"/>
-        <w:spacing w:after="160" w:before="320"/>
+        <w:spacing w:before="320" w:after="160"/>
       </w:pPr>
       <w:r>
         <w:rPr>
@@ -3365,7 +3365,7 @@
           <w:bCs/>
           <w:color w:val="1b5e20"/>
         </w:rPr>
-        <w:t xml:space="preserve">Näyttömatriisi – 32 osaamisvaatimusta</w:t>
+        <w:t xml:space="preserve">Sanasto</w:t>
       </w:r>
     </w:p>
     <w:p>
@@ -3378,13 +3378,1421 @@
           <w:sz w:val="21"/>
           <w:szCs w:val="21"/>
         </w:rPr>
-        <w:t xml:space="preserve">Rasti vasta, kun vaatimukselle on täsmällinen työnäyte: linkki, commit, kuva, testirivi tai muistio. Sama työnäyte voi kelvata useaan kohtaan.</w:t>
-      </w:r>
-    </w:p>
-    <w:p>
-      <w:pPr>
-        <w:pStyle w:val="Heading2"/>
-        <w:spacing w:after="120" w:before="260"/>
+        <w:t xml:space="preserve">Projektin tunnukset ja ammattitermit siinä järjestyksessä, jossa ne tulevat vastaan. Jokainen on selitetty myös sivustolla ensimmäisen käytön kohdalla.</w:t>
+      </w:r>
+    </w:p>
+    <w:tbl>
+      <w:tblPr>
+        <w:tblW w:type="dxa" w:w="9638"/>
+        <w:tblBorders>
+          <w:top w:val="single" w:color="auto" w:sz="4"/>
+          <w:left w:val="single" w:color="auto" w:sz="4"/>
+          <w:bottom w:val="single" w:color="auto" w:sz="4"/>
+          <w:right w:val="single" w:color="auto" w:sz="4"/>
+          <w:insideH w:val="single" w:color="auto" w:sz="4"/>
+          <w:insideV w:val="single" w:color="auto" w:sz="4"/>
+        </w:tblBorders>
+      </w:tblPr>
+      <w:tblGrid>
+        <w:gridCol w:w="2120"/>
+        <w:gridCol w:w="7518"/>
+      </w:tblGrid>
+      <w:tr>
+        <w:tc>
+          <w:tcPr>
+            <w:tcW w:type="dxa" w:w="2120"/>
+            <w:shd w:fill="f1f8e9" w:val="clear"/>
+            <w:tcMar>
+              <w:top w:type="dxa" w:w="60"/>
+              <w:left w:type="dxa" w:w="100"/>
+              <w:bottom w:type="dxa" w:w="60"/>
+              <w:right w:type="dxa" w:w="100"/>
+            </w:tcMar>
+          </w:tcPr>
+          <w:p>
+            <w:pPr>
+              <w:spacing w:after="0"/>
+            </w:pPr>
+            <w:r>
+              <w:rPr>
+                <w:b/>
+                <w:bCs/>
+                <w:sz w:val="19"/>
+                <w:szCs w:val="19"/>
+              </w:rPr>
+              <w:t xml:space="preserve">asset</w:t>
+            </w:r>
+          </w:p>
+        </w:tc>
+        <w:tc>
+          <w:tcPr>
+            <w:tcW w:type="dxa" w:w="7518"/>
+            <w:tcMar>
+              <w:top w:type="dxa" w:w="60"/>
+              <w:left w:type="dxa" w:w="100"/>
+              <w:bottom w:type="dxa" w:w="60"/>
+              <w:right w:type="dxa" w:w="100"/>
+            </w:tcMar>
+          </w:tcPr>
+          <w:p>
+            <w:pPr>
+              <w:spacing w:after="0"/>
+            </w:pPr>
+            <w:r>
+              <w:rPr>
+                <w:sz w:val="19"/>
+                <w:szCs w:val="19"/>
+              </w:rPr>
+              <w:t xml:space="preserve">Paketin osa. Pelissä näkyvä tai kuuluva paketin osa: tekstuuri, 3D-malli, ääni tai skriptattu lisä. Tämä projekti etenee yksi asset kerrallaan.</w:t>
+            </w:r>
+          </w:p>
+        </w:tc>
+      </w:tr>
+      <w:tr>
+        <w:tc>
+          <w:tcPr>
+            <w:tcW w:type="dxa" w:w="2120"/>
+            <w:shd w:fill="f1f8e9" w:val="clear"/>
+            <w:tcMar>
+              <w:top w:type="dxa" w:w="60"/>
+              <w:left w:type="dxa" w:w="100"/>
+              <w:bottom w:type="dxa" w:w="60"/>
+              <w:right w:type="dxa" w:w="100"/>
+            </w:tcMar>
+          </w:tcPr>
+          <w:p>
+            <w:pPr>
+              <w:spacing w:after="0"/>
+            </w:pPr>
+            <w:r>
+              <w:rPr>
+                <w:b/>
+                <w:bCs/>
+                <w:sz w:val="19"/>
+                <w:szCs w:val="19"/>
+              </w:rPr>
+              <w:t xml:space="preserve">asset pack</w:t>
+            </w:r>
+          </w:p>
+        </w:tc>
+        <w:tc>
+          <w:tcPr>
+            <w:tcW w:type="dxa" w:w="7518"/>
+            <w:tcMar>
+              <w:top w:type="dxa" w:w="60"/>
+              <w:left w:type="dxa" w:w="100"/>
+              <w:bottom w:type="dxa" w:w="60"/>
+              <w:right w:type="dxa" w:w="100"/>
+            </w:tcMar>
+          </w:tcPr>
+          <w:p>
+            <w:pPr>
+              <w:spacing w:after="0"/>
+            </w:pPr>
+            <w:r>
+              <w:rPr>
+                <w:sz w:val="19"/>
+                <w:szCs w:val="19"/>
+              </w:rPr>
+              <w:t xml:space="preserve">Assettien kokoelma. Assettien kokoelma, joka asennetaan peliin yhtenä pakettina. Tässä projektissa asset pack tarkoittaa resurssipakettia ja datapakettia yhdessä.</w:t>
+            </w:r>
+          </w:p>
+        </w:tc>
+      </w:tr>
+      <w:tr>
+        <w:tc>
+          <w:tcPr>
+            <w:tcW w:type="dxa" w:w="2120"/>
+            <w:shd w:fill="f1f8e9" w:val="clear"/>
+            <w:tcMar>
+              <w:top w:type="dxa" w:w="60"/>
+              <w:left w:type="dxa" w:w="100"/>
+              <w:bottom w:type="dxa" w:w="60"/>
+              <w:right w:type="dxa" w:w="100"/>
+            </w:tcMar>
+          </w:tcPr>
+          <w:p>
+            <w:pPr>
+              <w:spacing w:after="0"/>
+            </w:pPr>
+            <w:r>
+              <w:rPr>
+                <w:b/>
+                <w:bCs/>
+                <w:sz w:val="19"/>
+                <w:szCs w:val="19"/>
+              </w:rPr>
+              <w:t xml:space="preserve">resurssipaketti</w:t>
+            </w:r>
+          </w:p>
+        </w:tc>
+        <w:tc>
+          <w:tcPr>
+            <w:tcW w:type="dxa" w:w="7518"/>
+            <w:tcMar>
+              <w:top w:type="dxa" w:w="60"/>
+              <w:left w:type="dxa" w:w="100"/>
+              <w:bottom w:type="dxa" w:w="60"/>
+              <w:right w:type="dxa" w:w="100"/>
+            </w:tcMar>
+          </w:tcPr>
+          <w:p>
+            <w:pPr>
+              <w:spacing w:after="0"/>
+            </w:pPr>
+            <w:r>
+              <w:rPr>
+                <w:sz w:val="19"/>
+                <w:szCs w:val="19"/>
+              </w:rPr>
+              <w:t xml:space="preserve">Resource pack. Paketin osa, joka muuttaa sitä, miltä peli näyttää ja kuulostaa: tekstuurit, mallit, äänet ja nimet. Kansion nimi levyllä on resourcepack.</w:t>
+            </w:r>
+          </w:p>
+        </w:tc>
+      </w:tr>
+      <w:tr>
+        <w:tc>
+          <w:tcPr>
+            <w:tcW w:type="dxa" w:w="2120"/>
+            <w:shd w:fill="f1f8e9" w:val="clear"/>
+            <w:tcMar>
+              <w:top w:type="dxa" w:w="60"/>
+              <w:left w:type="dxa" w:w="100"/>
+              <w:bottom w:type="dxa" w:w="60"/>
+              <w:right w:type="dxa" w:w="100"/>
+            </w:tcMar>
+          </w:tcPr>
+          <w:p>
+            <w:pPr>
+              <w:spacing w:after="0"/>
+            </w:pPr>
+            <w:r>
+              <w:rPr>
+                <w:b/>
+                <w:bCs/>
+                <w:sz w:val="19"/>
+                <w:szCs w:val="19"/>
+              </w:rPr>
+              <w:t xml:space="preserve">datapaketti</w:t>
+            </w:r>
+          </w:p>
+        </w:tc>
+        <w:tc>
+          <w:tcPr>
+            <w:tcW w:type="dxa" w:w="7518"/>
+            <w:tcMar>
+              <w:top w:type="dxa" w:w="60"/>
+              <w:left w:type="dxa" w:w="100"/>
+              <w:bottom w:type="dxa" w:w="60"/>
+              <w:right w:type="dxa" w:w="100"/>
+            </w:tcMar>
+          </w:tcPr>
+          <w:p>
+            <w:pPr>
+              <w:spacing w:after="0"/>
+            </w:pPr>
+            <w:r>
+              <w:rPr>
+                <w:sz w:val="19"/>
+                <w:szCs w:val="19"/>
+              </w:rPr>
+              <w:t xml:space="preserve">Data pack. Paketin osa, joka lisää peliin sääntöjä: reseptit, saavutukset ja funktiot. Kansion nimi levyllä on datapack.</w:t>
+            </w:r>
+          </w:p>
+        </w:tc>
+      </w:tr>
+      <w:tr>
+        <w:tc>
+          <w:tcPr>
+            <w:tcW w:type="dxa" w:w="2120"/>
+            <w:shd w:fill="f1f8e9" w:val="clear"/>
+            <w:tcMar>
+              <w:top w:type="dxa" w:w="60"/>
+              <w:left w:type="dxa" w:w="100"/>
+              <w:bottom w:type="dxa" w:w="60"/>
+              <w:right w:type="dxa" w:w="100"/>
+            </w:tcMar>
+          </w:tcPr>
+          <w:p>
+            <w:pPr>
+              <w:spacing w:after="0"/>
+            </w:pPr>
+            <w:r>
+              <w:rPr>
+                <w:b/>
+                <w:bCs/>
+                <w:sz w:val="19"/>
+                <w:szCs w:val="19"/>
+              </w:rPr>
+              <w:t xml:space="preserve">pack.mcmeta</w:t>
+            </w:r>
+          </w:p>
+        </w:tc>
+        <w:tc>
+          <w:tcPr>
+            <w:tcW w:type="dxa" w:w="7518"/>
+            <w:tcMar>
+              <w:top w:type="dxa" w:w="60"/>
+              <w:left w:type="dxa" w:w="100"/>
+              <w:bottom w:type="dxa" w:w="60"/>
+              <w:right w:type="dxa" w:w="100"/>
+            </w:tcMar>
+          </w:tcPr>
+          <w:p>
+            <w:pPr>
+              <w:spacing w:after="0"/>
+            </w:pPr>
+            <w:r>
+              <w:rPr>
+                <w:sz w:val="19"/>
+                <w:szCs w:val="19"/>
+              </w:rPr>
+              <w:t xml:space="preserve">Paketin käyntikortti. Pieni JSON-tiedosto paketin juuressa. Se kertoo pelille paketin kuvauksen ja pack_format-arvon. Ilman sitä peli ei tunnista pakettia.</w:t>
+            </w:r>
+          </w:p>
+        </w:tc>
+      </w:tr>
+      <w:tr>
+        <w:tc>
+          <w:tcPr>
+            <w:tcW w:type="dxa" w:w="2120"/>
+            <w:shd w:fill="f1f8e9" w:val="clear"/>
+            <w:tcMar>
+              <w:top w:type="dxa" w:w="60"/>
+              <w:left w:type="dxa" w:w="100"/>
+              <w:bottom w:type="dxa" w:w="60"/>
+              <w:right w:type="dxa" w:w="100"/>
+            </w:tcMar>
+          </w:tcPr>
+          <w:p>
+            <w:pPr>
+              <w:spacing w:after="0"/>
+            </w:pPr>
+            <w:r>
+              <w:rPr>
+                <w:b/>
+                <w:bCs/>
+                <w:sz w:val="19"/>
+                <w:szCs w:val="19"/>
+              </w:rPr>
+              <w:t xml:space="preserve">pack_format</w:t>
+            </w:r>
+          </w:p>
+        </w:tc>
+        <w:tc>
+          <w:tcPr>
+            <w:tcW w:type="dxa" w:w="7518"/>
+            <w:tcMar>
+              <w:top w:type="dxa" w:w="60"/>
+              <w:left w:type="dxa" w:w="100"/>
+              <w:bottom w:type="dxa" w:w="60"/>
+              <w:right w:type="dxa" w:w="100"/>
+            </w:tcMar>
+          </w:tcPr>
+          <w:p>
+            <w:pPr>
+              <w:spacing w:after="0"/>
+            </w:pPr>
+            <w:r>
+              <w:rPr>
+                <w:sz w:val="19"/>
+                <w:szCs w:val="19"/>
+              </w:rPr>
+              <w:t xml:space="preserve">Paketin versionumero. Numero pack.mcmeta-tiedostossa. Se kertoo pelille, mille Minecraft-versiolle paketti on tehty. Resurssipaketilla ja datapaketilla on eri arvo samalle peliversiolle.</w:t>
+            </w:r>
+          </w:p>
+        </w:tc>
+      </w:tr>
+      <w:tr>
+        <w:tc>
+          <w:tcPr>
+            <w:tcW w:type="dxa" w:w="2120"/>
+            <w:shd w:fill="f1f8e9" w:val="clear"/>
+            <w:tcMar>
+              <w:top w:type="dxa" w:w="60"/>
+              <w:left w:type="dxa" w:w="100"/>
+              <w:bottom w:type="dxa" w:w="60"/>
+              <w:right w:type="dxa" w:w="100"/>
+            </w:tcMar>
+          </w:tcPr>
+          <w:p>
+            <w:pPr>
+              <w:spacing w:after="0"/>
+            </w:pPr>
+            <w:r>
+              <w:rPr>
+                <w:b/>
+                <w:bCs/>
+                <w:sz w:val="19"/>
+                <w:szCs w:val="19"/>
+              </w:rPr>
+              <w:t xml:space="preserve">mcfunction</w:t>
+            </w:r>
+          </w:p>
+        </w:tc>
+        <w:tc>
+          <w:tcPr>
+            <w:tcW w:type="dxa" w:w="7518"/>
+            <w:tcMar>
+              <w:top w:type="dxa" w:w="60"/>
+              <w:left w:type="dxa" w:w="100"/>
+              <w:bottom w:type="dxa" w:w="60"/>
+              <w:right w:type="dxa" w:w="100"/>
+            </w:tcMar>
+          </w:tcPr>
+          <w:p>
+            <w:pPr>
+              <w:spacing w:after="0"/>
+            </w:pPr>
+            <w:r>
+              <w:rPr>
+                <w:sz w:val="19"/>
+                <w:szCs w:val="19"/>
+              </w:rPr>
+              <w:t xml:space="preserve">Komentotiedosto. Tekstitiedosto, jossa on pelin omia komentoja rivi riviltä. Peli ajaa rivit järjestyksessä /function-komennolla. Tämän projektin skriptaus tehdään näin, ei ohjelmointikielellä.</w:t>
+            </w:r>
+          </w:p>
+        </w:tc>
+      </w:tr>
+      <w:tr>
+        <w:tc>
+          <w:tcPr>
+            <w:tcW w:type="dxa" w:w="2120"/>
+            <w:shd w:fill="f1f8e9" w:val="clear"/>
+            <w:tcMar>
+              <w:top w:type="dxa" w:w="60"/>
+              <w:left w:type="dxa" w:w="100"/>
+              <w:bottom w:type="dxa" w:w="60"/>
+              <w:right w:type="dxa" w:w="100"/>
+            </w:tcMar>
+          </w:tcPr>
+          <w:p>
+            <w:pPr>
+              <w:spacing w:after="0"/>
+            </w:pPr>
+            <w:r>
+              <w:rPr>
+                <w:b/>
+                <w:bCs/>
+                <w:sz w:val="19"/>
+                <w:szCs w:val="19"/>
+              </w:rPr>
+              <w:t xml:space="preserve">JSON</w:t>
+            </w:r>
+          </w:p>
+        </w:tc>
+        <w:tc>
+          <w:tcPr>
+            <w:tcW w:type="dxa" w:w="7518"/>
+            <w:tcMar>
+              <w:top w:type="dxa" w:w="60"/>
+              <w:left w:type="dxa" w:w="100"/>
+              <w:bottom w:type="dxa" w:w="60"/>
+              <w:right w:type="dxa" w:w="100"/>
+            </w:tcMar>
+          </w:tcPr>
+          <w:p>
+            <w:pPr>
+              <w:spacing w:after="0"/>
+            </w:pPr>
+            <w:r>
+              <w:rPr>
+                <w:sz w:val="19"/>
+                <w:szCs w:val="19"/>
+              </w:rPr>
+              <w:t xml:space="preserve">Tekstimuotoinen määrittely. Yksinkertainen tekstimuoto, jolla paketin määrittelyt kirjoitetaan: kielitiedosto, mallit, reseptit ja saavutukset. Pilkku tai lainausmerkki väärässä paikassa rikkoo koko tiedoston.</w:t>
+            </w:r>
+          </w:p>
+        </w:tc>
+      </w:tr>
+      <w:tr>
+        <w:tc>
+          <w:tcPr>
+            <w:tcW w:type="dxa" w:w="2120"/>
+            <w:shd w:fill="f1f8e9" w:val="clear"/>
+            <w:tcMar>
+              <w:top w:type="dxa" w:w="60"/>
+              <w:left w:type="dxa" w:w="100"/>
+              <w:bottom w:type="dxa" w:w="60"/>
+              <w:right w:type="dxa" w:w="100"/>
+            </w:tcMar>
+          </w:tcPr>
+          <w:p>
+            <w:pPr>
+              <w:spacing w:after="0"/>
+            </w:pPr>
+            <w:r>
+              <w:rPr>
+                <w:b/>
+                <w:bCs/>
+                <w:sz w:val="19"/>
+                <w:szCs w:val="19"/>
+              </w:rPr>
+              <w:t xml:space="preserve">nimiavaruus
+vko 40</w:t>
+            </w:r>
+          </w:p>
+        </w:tc>
+        <w:tc>
+          <w:tcPr>
+            <w:tcW w:type="dxa" w:w="7518"/>
+            <w:tcMar>
+              <w:top w:type="dxa" w:w="60"/>
+              <w:left w:type="dxa" w:w="100"/>
+              <w:bottom w:type="dxa" w:w="60"/>
+              <w:right w:type="dxa" w:w="100"/>
+            </w:tcMar>
+          </w:tcPr>
+          <w:p>
+            <w:pPr>
+              <w:spacing w:after="0"/>
+            </w:pPr>
+            <w:r>
+              <w:rPr>
+                <w:sz w:val="19"/>
+                <w:szCs w:val="19"/>
+              </w:rPr>
+              <w:t xml:space="preserve">Paketin oma lokero. Paketin omalla nimellä varustettu kansio, jonka sisällä sinun tiedostosi ovat. Se erottaa oman sisällön pelin omasta sisällöstä, esimerkiksi teema:kyla.kello.</w:t>
+            </w:r>
+          </w:p>
+        </w:tc>
+      </w:tr>
+      <w:tr>
+        <w:tc>
+          <w:tcPr>
+            <w:tcW w:type="dxa" w:w="2120"/>
+            <w:shd w:fill="f1f8e9" w:val="clear"/>
+            <w:tcMar>
+              <w:top w:type="dxa" w:w="60"/>
+              <w:left w:type="dxa" w:w="100"/>
+              <w:bottom w:type="dxa" w:w="60"/>
+              <w:right w:type="dxa" w:w="100"/>
+            </w:tcMar>
+          </w:tcPr>
+          <w:p>
+            <w:pPr>
+              <w:spacing w:after="0"/>
+            </w:pPr>
+            <w:r>
+              <w:rPr>
+                <w:b/>
+                <w:bCs/>
+                <w:sz w:val="19"/>
+                <w:szCs w:val="19"/>
+              </w:rPr>
+              <w:t xml:space="preserve">repository</w:t>
+            </w:r>
+          </w:p>
+        </w:tc>
+        <w:tc>
+          <w:tcPr>
+            <w:tcW w:type="dxa" w:w="7518"/>
+            <w:tcMar>
+              <w:top w:type="dxa" w:w="60"/>
+              <w:left w:type="dxa" w:w="100"/>
+              <w:bottom w:type="dxa" w:w="60"/>
+              <w:right w:type="dxa" w:w="100"/>
+            </w:tcMar>
+          </w:tcPr>
+          <w:p>
+            <w:pPr>
+              <w:spacing w:after="0"/>
+            </w:pPr>
+            <w:r>
+              <w:rPr>
+                <w:sz w:val="19"/>
+                <w:szCs w:val="19"/>
+              </w:rPr>
+              <w:t xml:space="preserve">Projektin varasto GitHubissa. Projektin koko tiedosto- ja versiohistoria GitHubissa. Tämän projektin repository on julkinen ensimmäisestä commitista asti.</w:t>
+            </w:r>
+          </w:p>
+        </w:tc>
+      </w:tr>
+      <w:tr>
+        <w:tc>
+          <w:tcPr>
+            <w:tcW w:type="dxa" w:w="2120"/>
+            <w:shd w:fill="f1f8e9" w:val="clear"/>
+            <w:tcMar>
+              <w:top w:type="dxa" w:w="60"/>
+              <w:left w:type="dxa" w:w="100"/>
+              <w:bottom w:type="dxa" w:w="60"/>
+              <w:right w:type="dxa" w:w="100"/>
+            </w:tcMar>
+          </w:tcPr>
+          <w:p>
+            <w:pPr>
+              <w:spacing w:after="0"/>
+            </w:pPr>
+            <w:r>
+              <w:rPr>
+                <w:b/>
+                <w:bCs/>
+                <w:sz w:val="19"/>
+                <w:szCs w:val="19"/>
+              </w:rPr>
+              <w:t xml:space="preserve">commit</w:t>
+            </w:r>
+          </w:p>
+        </w:tc>
+        <w:tc>
+          <w:tcPr>
+            <w:tcW w:type="dxa" w:w="7518"/>
+            <w:tcMar>
+              <w:top w:type="dxa" w:w="60"/>
+              <w:left w:type="dxa" w:w="100"/>
+              <w:bottom w:type="dxa" w:w="60"/>
+              <w:right w:type="dxa" w:w="100"/>
+            </w:tcMar>
+          </w:tcPr>
+          <w:p>
+            <w:pPr>
+              <w:spacing w:after="0"/>
+            </w:pPr>
+            <w:r>
+              <w:rPr>
+                <w:sz w:val="19"/>
+                <w:szCs w:val="19"/>
+              </w:rPr>
+              <w:t xml:space="preserve">Tallennettu muutos. Yksi Gitiin tallennettu muutos, jolla on oma viesti ja tunniste. Commit-linkki on tämän projektin tavallisin työnäyte.</w:t>
+            </w:r>
+          </w:p>
+        </w:tc>
+      </w:tr>
+      <w:tr>
+        <w:tc>
+          <w:tcPr>
+            <w:tcW w:type="dxa" w:w="2120"/>
+            <w:shd w:fill="f1f8e9" w:val="clear"/>
+            <w:tcMar>
+              <w:top w:type="dxa" w:w="60"/>
+              <w:left w:type="dxa" w:w="100"/>
+              <w:bottom w:type="dxa" w:w="60"/>
+              <w:right w:type="dxa" w:w="100"/>
+            </w:tcMar>
+          </w:tcPr>
+          <w:p>
+            <w:pPr>
+              <w:spacing w:after="0"/>
+            </w:pPr>
+            <w:r>
+              <w:rPr>
+                <w:b/>
+                <w:bCs/>
+                <w:sz w:val="19"/>
+                <w:szCs w:val="19"/>
+              </w:rPr>
+              <w:t xml:space="preserve">push
+vko 34</w:t>
+            </w:r>
+          </w:p>
+        </w:tc>
+        <w:tc>
+          <w:tcPr>
+            <w:tcW w:type="dxa" w:w="7518"/>
+            <w:tcMar>
+              <w:top w:type="dxa" w:w="60"/>
+              <w:left w:type="dxa" w:w="100"/>
+              <w:bottom w:type="dxa" w:w="60"/>
+              <w:right w:type="dxa" w:w="100"/>
+            </w:tcMar>
+          </w:tcPr>
+          <w:p>
+            <w:pPr>
+              <w:spacing w:after="0"/>
+            </w:pPr>
+            <w:r>
+              <w:rPr>
+                <w:sz w:val="19"/>
+                <w:szCs w:val="19"/>
+              </w:rPr>
+              <w:t xml:space="preserve">Lähetys GitHubiin. Omalla koneella tehtyjen committien lähettäminen GitHubiin. Ennen ensimmäistä pushia tarkistetaan, ettei mukana ole henkilötietoja – Git-historia on pysyvä.</w:t>
+            </w:r>
+          </w:p>
+        </w:tc>
+      </w:tr>
+      <w:tr>
+        <w:tc>
+          <w:tcPr>
+            <w:tcW w:type="dxa" w:w="2120"/>
+            <w:shd w:fill="f1f8e9" w:val="clear"/>
+            <w:tcMar>
+              <w:top w:type="dxa" w:w="60"/>
+              <w:left w:type="dxa" w:w="100"/>
+              <w:bottom w:type="dxa" w:w="60"/>
+              <w:right w:type="dxa" w:w="100"/>
+            </w:tcMar>
+          </w:tcPr>
+          <w:p>
+            <w:pPr>
+              <w:spacing w:after="0"/>
+            </w:pPr>
+            <w:r>
+              <w:rPr>
+                <w:b/>
+                <w:bCs/>
+                <w:sz w:val="19"/>
+                <w:szCs w:val="19"/>
+              </w:rPr>
+              <w:t xml:space="preserve">GitHub-issue</w:t>
+            </w:r>
+          </w:p>
+        </w:tc>
+        <w:tc>
+          <w:tcPr>
+            <w:tcW w:type="dxa" w:w="7518"/>
+            <w:tcMar>
+              <w:top w:type="dxa" w:w="60"/>
+              <w:left w:type="dxa" w:w="100"/>
+              <w:bottom w:type="dxa" w:w="60"/>
+              <w:right w:type="dxa" w:w="100"/>
+            </w:tcMar>
+          </w:tcPr>
+          <w:p>
+            <w:pPr>
+              <w:spacing w:after="0"/>
+            </w:pPr>
+            <w:r>
+              <w:rPr>
+                <w:sz w:val="19"/>
+                <w:szCs w:val="19"/>
+              </w:rPr>
+              <w:t xml:space="preserve">Kirjattu tehtävä. Repositoryyn kirjattu tehtävä: otsikko, kuvaus ja valmis kun -ehto. Yksi issue on tässä projektissa noin puolen tai yhden päivän työ.</w:t>
+            </w:r>
+          </w:p>
+        </w:tc>
+      </w:tr>
+      <w:tr>
+        <w:tc>
+          <w:tcPr>
+            <w:tcW w:type="dxa" w:w="2120"/>
+            <w:shd w:fill="f1f8e9" w:val="clear"/>
+            <w:tcMar>
+              <w:top w:type="dxa" w:w="60"/>
+              <w:left w:type="dxa" w:w="100"/>
+              <w:bottom w:type="dxa" w:w="60"/>
+              <w:right w:type="dxa" w:w="100"/>
+            </w:tcMar>
+          </w:tcPr>
+          <w:p>
+            <w:pPr>
+              <w:spacing w:after="0"/>
+            </w:pPr>
+            <w:r>
+              <w:rPr>
+                <w:b/>
+                <w:bCs/>
+                <w:sz w:val="19"/>
+                <w:szCs w:val="19"/>
+              </w:rPr>
+              <w:t xml:space="preserve">haara
+vko 43</w:t>
+            </w:r>
+          </w:p>
+        </w:tc>
+        <w:tc>
+          <w:tcPr>
+            <w:tcW w:type="dxa" w:w="7518"/>
+            <w:tcMar>
+              <w:top w:type="dxa" w:w="60"/>
+              <w:left w:type="dxa" w:w="100"/>
+              <w:bottom w:type="dxa" w:w="60"/>
+              <w:right w:type="dxa" w:w="100"/>
+            </w:tcMar>
+          </w:tcPr>
+          <w:p>
+            <w:pPr>
+              <w:spacing w:after="0"/>
+            </w:pPr>
+            <w:r>
+              <w:rPr>
+                <w:sz w:val="19"/>
+                <w:szCs w:val="19"/>
+              </w:rPr>
+              <w:t xml:space="preserve">Branch. Rinnakkainen kopio projektista, jossa yksi muutos tehdään rauhassa valmiiksi. Päähaara main pysyy koko ajan toimivana.</w:t>
+            </w:r>
+          </w:p>
+        </w:tc>
+      </w:tr>
+      <w:tr>
+        <w:tc>
+          <w:tcPr>
+            <w:tcW w:type="dxa" w:w="2120"/>
+            <w:shd w:fill="f1f8e9" w:val="clear"/>
+            <w:tcMar>
+              <w:top w:type="dxa" w:w="60"/>
+              <w:left w:type="dxa" w:w="100"/>
+              <w:bottom w:type="dxa" w:w="60"/>
+              <w:right w:type="dxa" w:w="100"/>
+            </w:tcMar>
+          </w:tcPr>
+          <w:p>
+            <w:pPr>
+              <w:spacing w:after="0"/>
+            </w:pPr>
+            <w:r>
+              <w:rPr>
+                <w:b/>
+                <w:bCs/>
+                <w:sz w:val="19"/>
+                <w:szCs w:val="19"/>
+              </w:rPr>
+              <w:t xml:space="preserve">merge
+vko 43</w:t>
+            </w:r>
+          </w:p>
+        </w:tc>
+        <w:tc>
+          <w:tcPr>
+            <w:tcW w:type="dxa" w:w="7518"/>
+            <w:tcMar>
+              <w:top w:type="dxa" w:w="60"/>
+              <w:left w:type="dxa" w:w="100"/>
+              <w:bottom w:type="dxa" w:w="60"/>
+              <w:right w:type="dxa" w:w="100"/>
+            </w:tcMar>
+          </w:tcPr>
+          <w:p>
+            <w:pPr>
+              <w:spacing w:after="0"/>
+            </w:pPr>
+            <w:r>
+              <w:rPr>
+                <w:sz w:val="19"/>
+                <w:szCs w:val="19"/>
+              </w:rPr>
+              <w:t xml:space="preserve">Haarojen yhdistäminen. Haaran muutosten yhdistäminen takaisin main-haaraan. Merge tehdään vasta kun muutos on testattu.</w:t>
+            </w:r>
+          </w:p>
+        </w:tc>
+      </w:tr>
+      <w:tr>
+        <w:tc>
+          <w:tcPr>
+            <w:tcW w:type="dxa" w:w="2120"/>
+            <w:shd w:fill="f1f8e9" w:val="clear"/>
+            <w:tcMar>
+              <w:top w:type="dxa" w:w="60"/>
+              <w:left w:type="dxa" w:w="100"/>
+              <w:bottom w:type="dxa" w:w="60"/>
+              <w:right w:type="dxa" w:w="100"/>
+            </w:tcMar>
+          </w:tcPr>
+          <w:p>
+            <w:pPr>
+              <w:spacing w:after="0"/>
+            </w:pPr>
+            <w:r>
+              <w:rPr>
+                <w:b/>
+                <w:bCs/>
+                <w:sz w:val="19"/>
+                <w:szCs w:val="19"/>
+              </w:rPr>
+              <w:t xml:space="preserve">pull request
+vko 43</w:t>
+            </w:r>
+          </w:p>
+        </w:tc>
+        <w:tc>
+          <w:tcPr>
+            <w:tcW w:type="dxa" w:w="7518"/>
+            <w:tcMar>
+              <w:top w:type="dxa" w:w="60"/>
+              <w:left w:type="dxa" w:w="100"/>
+              <w:bottom w:type="dxa" w:w="60"/>
+              <w:right w:type="dxa" w:w="100"/>
+            </w:tcMar>
+          </w:tcPr>
+          <w:p>
+            <w:pPr>
+              <w:spacing w:after="0"/>
+            </w:pPr>
+            <w:r>
+              <w:rPr>
+                <w:sz w:val="19"/>
+                <w:szCs w:val="19"/>
+              </w:rPr>
+              <w:t xml:space="preserve">Pyyntö yhdistää haara. GitHubin tapa tehdä merge: pyyntö yhdistää haara mainiin. Pyynnössä muutokset voi lukea läpi ja kommentoida ennen hyväksymistä.</w:t>
+            </w:r>
+          </w:p>
+        </w:tc>
+      </w:tr>
+      <w:tr>
+        <w:tc>
+          <w:tcPr>
+            <w:tcW w:type="dxa" w:w="2120"/>
+            <w:shd w:fill="f1f8e9" w:val="clear"/>
+            <w:tcMar>
+              <w:top w:type="dxa" w:w="60"/>
+              <w:left w:type="dxa" w:w="100"/>
+              <w:bottom w:type="dxa" w:w="60"/>
+              <w:right w:type="dxa" w:w="100"/>
+            </w:tcMar>
+          </w:tcPr>
+          <w:p>
+            <w:pPr>
+              <w:spacing w:after="0"/>
+            </w:pPr>
+            <w:r>
+              <w:rPr>
+                <w:b/>
+                <w:bCs/>
+                <w:sz w:val="19"/>
+                <w:szCs w:val="19"/>
+              </w:rPr>
+              <w:t xml:space="preserve">tagi
+vko 48</w:t>
+            </w:r>
+          </w:p>
+        </w:tc>
+        <w:tc>
+          <w:tcPr>
+            <w:tcW w:type="dxa" w:w="7518"/>
+            <w:tcMar>
+              <w:top w:type="dxa" w:w="60"/>
+              <w:left w:type="dxa" w:w="100"/>
+              <w:bottom w:type="dxa" w:w="60"/>
+              <w:right w:type="dxa" w:w="100"/>
+            </w:tcMar>
+          </w:tcPr>
+          <w:p>
+            <w:pPr>
+              <w:spacing w:after="0"/>
+            </w:pPr>
+            <w:r>
+              <w:rPr>
+                <w:sz w:val="19"/>
+                <w:szCs w:val="19"/>
+              </w:rPr>
+              <w:t xml:space="preserve">Version nimilappu. Gitin nimilappu, joka kiinnitetään yhteen committiin, esimerkiksi v1.0. Tagi kertoo, mikä versio julkaistiin.</w:t>
+            </w:r>
+          </w:p>
+        </w:tc>
+      </w:tr>
+      <w:tr>
+        <w:tc>
+          <w:tcPr>
+            <w:tcW w:type="dxa" w:w="2120"/>
+            <w:shd w:fill="f1f8e9" w:val="clear"/>
+            <w:tcMar>
+              <w:top w:type="dxa" w:w="60"/>
+              <w:left w:type="dxa" w:w="100"/>
+              <w:bottom w:type="dxa" w:w="60"/>
+              <w:right w:type="dxa" w:w="100"/>
+            </w:tcMar>
+          </w:tcPr>
+          <w:p>
+            <w:pPr>
+              <w:spacing w:after="0"/>
+            </w:pPr>
+            <w:r>
+              <w:rPr>
+                <w:b/>
+                <w:bCs/>
+                <w:sz w:val="19"/>
+                <w:szCs w:val="19"/>
+              </w:rPr>
+              <w:t xml:space="preserve">GitHub-release</w:t>
+            </w:r>
+          </w:p>
+        </w:tc>
+        <w:tc>
+          <w:tcPr>
+            <w:tcW w:type="dxa" w:w="7518"/>
+            <w:tcMar>
+              <w:top w:type="dxa" w:w="60"/>
+              <w:left w:type="dxa" w:w="100"/>
+              <w:bottom w:type="dxa" w:w="60"/>
+              <w:right w:type="dxa" w:w="100"/>
+            </w:tcMar>
+          </w:tcPr>
+          <w:p>
+            <w:pPr>
+              <w:spacing w:after="0"/>
+            </w:pPr>
+            <w:r>
+              <w:rPr>
+                <w:sz w:val="19"/>
+                <w:szCs w:val="19"/>
+              </w:rPr>
+              <w:t xml:space="preserve">Julkaistu versio. GitHubissa julkaistu versio, jonka kuka tahansa voi ladata. Tässä projektissa releaseen liitetään zip-paketit, asennusohje ja kuvat.</w:t>
+            </w:r>
+          </w:p>
+        </w:tc>
+      </w:tr>
+      <w:tr>
+        <w:tc>
+          <w:tcPr>
+            <w:tcW w:type="dxa" w:w="2120"/>
+            <w:shd w:fill="f1f8e9" w:val="clear"/>
+            <w:tcMar>
+              <w:top w:type="dxa" w:w="60"/>
+              <w:left w:type="dxa" w:w="100"/>
+              <w:bottom w:type="dxa" w:w="60"/>
+              <w:right w:type="dxa" w:w="100"/>
+            </w:tcMar>
+          </w:tcPr>
+          <w:p>
+            <w:pPr>
+              <w:spacing w:after="0"/>
+            </w:pPr>
+            <w:r>
+              <w:rPr>
+                <w:b/>
+                <w:bCs/>
+                <w:sz w:val="19"/>
+                <w:szCs w:val="19"/>
+              </w:rPr>
+              <w:t xml:space="preserve">P0</w:t>
+            </w:r>
+          </w:p>
+        </w:tc>
+        <w:tc>
+          <w:tcPr>
+            <w:tcW w:type="dxa" w:w="7518"/>
+            <w:tcMar>
+              <w:top w:type="dxa" w:w="60"/>
+              <w:left w:type="dxa" w:w="100"/>
+              <w:bottom w:type="dxa" w:w="60"/>
+              <w:right w:type="dxa" w:w="100"/>
+            </w:tcMar>
+          </w:tcPr>
+          <w:p>
+            <w:pPr>
+              <w:spacing w:after="0"/>
+            </w:pPr>
+            <w:r>
+              <w:rPr>
+                <w:sz w:val="19"/>
+                <w:szCs w:val="19"/>
+              </w:rPr>
+              <w:t xml:space="preserve">Pakollinen ydin. Sisältö, jonka on valmistuttava ennen mitään lisäsisältöä. Tämän projektin P0 on 8 tekstuuria, 2 mallia, omat nimet, 2 reseptiä, 1 funktio ja 1 saavutus.</w:t>
+            </w:r>
+          </w:p>
+        </w:tc>
+      </w:tr>
+      <w:tr>
+        <w:tc>
+          <w:tcPr>
+            <w:tcW w:type="dxa" w:w="2120"/>
+            <w:shd w:fill="f1f8e9" w:val="clear"/>
+            <w:tcMar>
+              <w:top w:type="dxa" w:w="60"/>
+              <w:left w:type="dxa" w:w="100"/>
+              <w:bottom w:type="dxa" w:w="60"/>
+              <w:right w:type="dxa" w:w="100"/>
+            </w:tcMar>
+          </w:tcPr>
+          <w:p>
+            <w:pPr>
+              <w:spacing w:after="0"/>
+            </w:pPr>
+            <w:r>
+              <w:rPr>
+                <w:b/>
+                <w:bCs/>
+                <w:sz w:val="19"/>
+                <w:szCs w:val="19"/>
+              </w:rPr>
+              <w:t xml:space="preserve">P1</w:t>
+            </w:r>
+          </w:p>
+        </w:tc>
+        <w:tc>
+          <w:tcPr>
+            <w:tcW w:type="dxa" w:w="7518"/>
+            <w:tcMar>
+              <w:top w:type="dxa" w:w="60"/>
+              <w:left w:type="dxa" w:w="100"/>
+              <w:bottom w:type="dxa" w:w="60"/>
+              <w:right w:type="dxa" w:w="100"/>
+            </w:tcMar>
+          </w:tcPr>
+          <w:p>
+            <w:pPr>
+              <w:spacing w:after="0"/>
+            </w:pPr>
+            <w:r>
+              <w:rPr>
+                <w:sz w:val="19"/>
+                <w:szCs w:val="19"/>
+              </w:rPr>
+              <w:t xml:space="preserve">Tärkeä jatkosisältö. Sisältö, joka tehdään vasta kun P0 toimii. P1 on tärkeää mutta ei estä julkaisua.</w:t>
+            </w:r>
+          </w:p>
+        </w:tc>
+      </w:tr>
+      <w:tr>
+        <w:tc>
+          <w:tcPr>
+            <w:tcW w:type="dxa" w:w="2120"/>
+            <w:shd w:fill="f1f8e9" w:val="clear"/>
+            <w:tcMar>
+              <w:top w:type="dxa" w:w="60"/>
+              <w:left w:type="dxa" w:w="100"/>
+              <w:bottom w:type="dxa" w:w="60"/>
+              <w:right w:type="dxa" w:w="100"/>
+            </w:tcMar>
+          </w:tcPr>
+          <w:p>
+            <w:pPr>
+              <w:spacing w:after="0"/>
+            </w:pPr>
+            <w:r>
+              <w:rPr>
+                <w:b/>
+                <w:bCs/>
+                <w:sz w:val="19"/>
+                <w:szCs w:val="19"/>
+              </w:rPr>
+              <w:t xml:space="preserve">P2</w:t>
+            </w:r>
+          </w:p>
+        </w:tc>
+        <w:tc>
+          <w:tcPr>
+            <w:tcW w:type="dxa" w:w="7518"/>
+            <w:tcMar>
+              <w:top w:type="dxa" w:w="60"/>
+              <w:left w:type="dxa" w:w="100"/>
+              <w:bottom w:type="dxa" w:w="60"/>
+              <w:right w:type="dxa" w:w="100"/>
+            </w:tcMar>
+          </w:tcPr>
+          <w:p>
+            <w:pPr>
+              <w:spacing w:after="0"/>
+            </w:pPr>
+            <w:r>
+              <w:rPr>
+                <w:sz w:val="19"/>
+                <w:szCs w:val="19"/>
+              </w:rPr>
+              <w:t xml:space="preserve">Valinnainen lisä. Sisältö, joka voidaan jättää kokonaan pois, jos aika loppuu. P2 ei vaikuta näytön läpimenoon.</w:t>
+            </w:r>
+          </w:p>
+        </w:tc>
+      </w:tr>
+      <w:tr>
+        <w:tc>
+          <w:tcPr>
+            <w:tcW w:type="dxa" w:w="2120"/>
+            <w:shd w:fill="f1f8e9" w:val="clear"/>
+            <w:tcMar>
+              <w:top w:type="dxa" w:w="60"/>
+              <w:left w:type="dxa" w:w="100"/>
+              <w:bottom w:type="dxa" w:w="60"/>
+              <w:right w:type="dxa" w:w="100"/>
+            </w:tcMar>
+          </w:tcPr>
+          <w:p>
+            <w:pPr>
+              <w:spacing w:after="0"/>
+            </w:pPr>
+            <w:r>
+              <w:rPr>
+                <w:b/>
+                <w:bCs/>
+                <w:sz w:val="19"/>
+                <w:szCs w:val="19"/>
+              </w:rPr>
+              <w:t xml:space="preserve">T01</w:t>
+            </w:r>
+          </w:p>
+        </w:tc>
+        <w:tc>
+          <w:tcPr>
+            <w:tcW w:type="dxa" w:w="7518"/>
+            <w:tcMar>
+              <w:top w:type="dxa" w:w="60"/>
+              <w:left w:type="dxa" w:w="100"/>
+              <w:bottom w:type="dxa" w:w="60"/>
+              <w:right w:type="dxa" w:w="100"/>
+            </w:tcMar>
+          </w:tcPr>
+          <w:p>
+            <w:pPr>
+              <w:spacing w:after="0"/>
+            </w:pPr>
+            <w:r>
+              <w:rPr>
+                <w:sz w:val="19"/>
+                <w:szCs w:val="19"/>
+              </w:rPr>
+              <w:t xml:space="preserve">Testitapauksen tunnus. T tarkoittaa testitapausta ja numero yksilöi sen: T01 on ensimmäinen testitapaus, T02 toinen. Viikon omat testit saavat viikon numeron eteensä, esimerkiksi T36-01. Odotettu tulos kirjataan ennen ajoa.</w:t>
+            </w:r>
+          </w:p>
+        </w:tc>
+      </w:tr>
+      <w:tr>
+        <w:tc>
+          <w:tcPr>
+            <w:tcW w:type="dxa" w:w="2120"/>
+            <w:shd w:fill="f1f8e9" w:val="clear"/>
+            <w:tcMar>
+              <w:top w:type="dxa" w:w="60"/>
+              <w:left w:type="dxa" w:w="100"/>
+              <w:bottom w:type="dxa" w:w="60"/>
+              <w:right w:type="dxa" w:w="100"/>
+            </w:tcMar>
+          </w:tcPr>
+          <w:p>
+            <w:pPr>
+              <w:spacing w:after="0"/>
+            </w:pPr>
+            <w:r>
+              <w:rPr>
+                <w:b/>
+                <w:bCs/>
+                <w:sz w:val="19"/>
+                <w:szCs w:val="19"/>
+              </w:rPr>
+              <w:t xml:space="preserve">RC
+vko 47</w:t>
+            </w:r>
+          </w:p>
+        </w:tc>
+        <w:tc>
+          <w:tcPr>
+            <w:tcW w:type="dxa" w:w="7518"/>
+            <w:tcMar>
+              <w:top w:type="dxa" w:w="60"/>
+              <w:left w:type="dxa" w:w="100"/>
+              <w:bottom w:type="dxa" w:w="60"/>
+              <w:right w:type="dxa" w:w="100"/>
+            </w:tcMar>
+          </w:tcPr>
+          <w:p>
+            <w:pPr>
+              <w:spacing w:after="0"/>
+            </w:pPr>
+            <w:r>
+              <w:rPr>
+                <w:sz w:val="19"/>
+                <w:szCs w:val="19"/>
+              </w:rPr>
+              <w:t xml:space="preserve">Release candidate, julkaisuehdokas. Lähes valmis versio, jota testataan sellaisena kuin se aiotaan julkaista. RC1 on ensimmäinen julkaisuehdokas; uutta sisältöä ei enää lisätä.</w:t>
+            </w:r>
+          </w:p>
+        </w:tc>
+      </w:tr>
+      <w:tr>
+        <w:tc>
+          <w:tcPr>
+            <w:tcW w:type="dxa" w:w="2120"/>
+            <w:shd w:fill="f1f8e9" w:val="clear"/>
+            <w:tcMar>
+              <w:top w:type="dxa" w:w="60"/>
+              <w:left w:type="dxa" w:w="100"/>
+              <w:bottom w:type="dxa" w:w="60"/>
+              <w:right w:type="dxa" w:w="100"/>
+            </w:tcMar>
+          </w:tcPr>
+          <w:p>
+            <w:pPr>
+              <w:spacing w:after="0"/>
+            </w:pPr>
+            <w:r>
+              <w:rPr>
+                <w:b/>
+                <w:bCs/>
+                <w:sz w:val="19"/>
+                <w:szCs w:val="19"/>
+              </w:rPr>
+              <w:t xml:space="preserve">backlog
+vko 35</w:t>
+            </w:r>
+          </w:p>
+        </w:tc>
+        <w:tc>
+          <w:tcPr>
+            <w:tcW w:type="dxa" w:w="7518"/>
+            <w:tcMar>
+              <w:top w:type="dxa" w:w="60"/>
+              <w:left w:type="dxa" w:w="100"/>
+              <w:bottom w:type="dxa" w:w="60"/>
+              <w:right w:type="dxa" w:w="100"/>
+            </w:tcMar>
+          </w:tcPr>
+          <w:p>
+            <w:pPr>
+              <w:spacing w:after="0"/>
+            </w:pPr>
+            <w:r>
+              <w:rPr>
+                <w:sz w:val="19"/>
+                <w:szCs w:val="19"/>
+              </w:rPr>
+              <w:t xml:space="preserve">Priorisoitu tehtävälista. Lista kaikista tekemättömistä tehtävistä tärkeysjärjestyksessä. Jokaisella rivillä on prioriteetti (P0, P1 tai P2), työmääräarvio ja valmis kun -ehto.</w:t>
+            </w:r>
+          </w:p>
+        </w:tc>
+      </w:tr>
+      <w:tr>
+        <w:tc>
+          <w:tcPr>
+            <w:tcW w:type="dxa" w:w="2120"/>
+            <w:shd w:fill="f1f8e9" w:val="clear"/>
+            <w:tcMar>
+              <w:top w:type="dxa" w:w="60"/>
+              <w:left w:type="dxa" w:w="100"/>
+              <w:bottom w:type="dxa" w:w="60"/>
+              <w:right w:type="dxa" w:w="100"/>
+            </w:tcMar>
+          </w:tcPr>
+          <w:p>
+            <w:pPr>
+              <w:spacing w:after="0"/>
+            </w:pPr>
+            <w:r>
+              <w:rPr>
+                <w:b/>
+                <w:bCs/>
+                <w:sz w:val="19"/>
+                <w:szCs w:val="19"/>
+              </w:rPr>
+              <w:t xml:space="preserve">moodboard
+vko 35</w:t>
+            </w:r>
+          </w:p>
+        </w:tc>
+        <w:tc>
+          <w:tcPr>
+            <w:tcW w:type="dxa" w:w="7518"/>
+            <w:tcMar>
+              <w:top w:type="dxa" w:w="60"/>
+              <w:left w:type="dxa" w:w="100"/>
+              <w:bottom w:type="dxa" w:w="60"/>
+              <w:right w:type="dxa" w:w="100"/>
+            </w:tcMar>
+          </w:tcPr>
+          <w:p>
+            <w:pPr>
+              <w:spacing w:after="0"/>
+            </w:pPr>
+            <w:r>
+              <w:rPr>
+                <w:sz w:val="19"/>
+                <w:szCs w:val="19"/>
+              </w:rPr>
+              <w:t xml:space="preserve">Ilmeen kuvakollaasi. Kooste väripaletista ja referenssikuvista, joka lukitsee paketin ilmeen ennen pikselityötä. Moodboardiin palataan aina, kun mietit sopiiko uusi asset teemaan.</w:t>
+            </w:r>
+          </w:p>
+        </w:tc>
+      </w:tr>
+      <w:tr>
+        <w:tc>
+          <w:tcPr>
+            <w:tcW w:type="dxa" w:w="2120"/>
+            <w:shd w:fill="f1f8e9" w:val="clear"/>
+            <w:tcMar>
+              <w:top w:type="dxa" w:w="60"/>
+              <w:left w:type="dxa" w:w="100"/>
+              <w:bottom w:type="dxa" w:w="60"/>
+              <w:right w:type="dxa" w:w="100"/>
+            </w:tcMar>
+          </w:tcPr>
+          <w:p>
+            <w:pPr>
+              <w:spacing w:after="0"/>
+            </w:pPr>
+            <w:r>
+              <w:rPr>
+                <w:b/>
+                <w:bCs/>
+                <w:sz w:val="19"/>
+                <w:szCs w:val="19"/>
+              </w:rPr>
+              <w:t xml:space="preserve">CC</w:t>
+            </w:r>
+          </w:p>
+        </w:tc>
+        <w:tc>
+          <w:tcPr>
+            <w:tcW w:type="dxa" w:w="7518"/>
+            <w:tcMar>
+              <w:top w:type="dxa" w:w="60"/>
+              <w:left w:type="dxa" w:w="100"/>
+              <w:bottom w:type="dxa" w:w="60"/>
+              <w:right w:type="dxa" w:w="100"/>
+            </w:tcMar>
+          </w:tcPr>
+          <w:p>
+            <w:pPr>
+              <w:spacing w:after="0"/>
+            </w:pPr>
+            <w:r>
+              <w:rPr>
+                <w:sz w:val="19"/>
+                <w:szCs w:val="19"/>
+              </w:rPr>
+              <w:t xml:space="preserve">Creative Commons. Lisenssiperhe kuville, äänille ja muulle sisällölle. CC BY vaatii tekijän mainitsemisen, CC BY-SA lisäksi saman lisenssin muokkauksiin, CC0 luovuttaa työn vapaaseen käyttöön.</w:t>
+            </w:r>
+          </w:p>
+        </w:tc>
+      </w:tr>
+      <w:tr>
+        <w:tc>
+          <w:tcPr>
+            <w:tcW w:type="dxa" w:w="2120"/>
+            <w:shd w:fill="f1f8e9" w:val="clear"/>
+            <w:tcMar>
+              <w:top w:type="dxa" w:w="60"/>
+              <w:left w:type="dxa" w:w="100"/>
+              <w:bottom w:type="dxa" w:w="60"/>
+              <w:right w:type="dxa" w:w="100"/>
+            </w:tcMar>
+          </w:tcPr>
+          <w:p>
+            <w:pPr>
+              <w:spacing w:after="0"/>
+            </w:pPr>
+            <w:r>
+              <w:rPr>
+                <w:b/>
+                <w:bCs/>
+                <w:sz w:val="19"/>
+                <w:szCs w:val="19"/>
+              </w:rPr>
+              <w:t xml:space="preserve">MIT</w:t>
+            </w:r>
+          </w:p>
+        </w:tc>
+        <w:tc>
+          <w:tcPr>
+            <w:tcW w:type="dxa" w:w="7518"/>
+            <w:tcMar>
+              <w:top w:type="dxa" w:w="60"/>
+              <w:left w:type="dxa" w:w="100"/>
+              <w:bottom w:type="dxa" w:w="60"/>
+              <w:right w:type="dxa" w:w="100"/>
+            </w:tcMar>
+          </w:tcPr>
+          <w:p>
+            <w:pPr>
+              <w:spacing w:after="0"/>
+            </w:pPr>
+            <w:r>
+              <w:rPr>
+                <w:sz w:val="19"/>
+                <w:szCs w:val="19"/>
+              </w:rPr>
+              <w:t xml:space="preserve">MIT-lisenssi. Yleinen ja salliva ohjelmistolisenssi. Sopii datapaketin skripteille: muut saavat käyttää ja muokata koodia, kunhan lisenssiteksti pysyy mukana.</w:t>
+            </w:r>
+          </w:p>
+        </w:tc>
+      </w:tr>
+    </w:tbl>
+    <w:p>
+      <w:r>
+        <w:br w:type="page"/>
+      </w:r>
+    </w:p>
+    <w:p>
+      <w:pPr>
+        <w:pStyle w:val="Heading1"/>
+        <w:spacing w:before="320" w:after="160"/>
       </w:pPr>
       <w:r>
         <w:rPr>
@@ -3392,145 +4800,26 @@
           <w:bCs/>
           <w:color w:val="1b5e20"/>
         </w:rPr>
-        <w:t xml:space="preserve">Ohjelmointi</w:t>
-      </w:r>
-    </w:p>
-    <w:p>
-      <w:pPr>
-        <w:spacing w:after="60" w:before="0"/>
-      </w:pPr>
-      <w:r>
-        <w:rPr>
-          <w:sz w:val="19"/>
-          <w:szCs w:val="19"/>
-        </w:rPr>
-        <w:t xml:space="preserve">☐  Kehitysympäristö – Blockbench- ja editorikuva, peliin ladattu paketti ja repository.</w:t>
-      </w:r>
-    </w:p>
-    <w:p>
-      <w:pPr>
-        <w:spacing w:after="60" w:before="0"/>
-      </w:pPr>
-      <w:r>
-        <w:rPr>
-          <w:sz w:val="19"/>
-          <w:szCs w:val="19"/>
-        </w:rPr>
-        <w:t xml:space="preserve">☐  Virheenkorjaus – Kolme täydellistä ketjua aidoista havainnoista tai opettajan merkitsemistä vikatehtävistä.</w:t>
-      </w:r>
-    </w:p>
-    <w:p>
-      <w:pPr>
-        <w:spacing w:after="60" w:before="0"/>
-      </w:pPr>
-      <w:r>
-        <w:rPr>
-          <w:sz w:val="19"/>
-          <w:szCs w:val="19"/>
-        </w:rPr>
-        <w:t xml:space="preserve">☐  Toimintojen testaus – 12 testiä odotettuine ja toteutuneine tuloksineen.</w:t>
-      </w:r>
-    </w:p>
-    <w:p>
-      <w:pPr>
-        <w:spacing w:after="60" w:before="0"/>
-      </w:pPr>
-      <w:r>
-        <w:rPr>
-          <w:sz w:val="19"/>
-          <w:szCs w:val="19"/>
-        </w:rPr>
-        <w:t xml:space="preserve">☐  Rakenteinen ohjelmointi – Datapaketin funktiot ja reseptit jaettu selkeisiin vastuisiin omassa nimiavaruudessa.</w:t>
-      </w:r>
-    </w:p>
-    <w:p>
-      <w:pPr>
-        <w:spacing w:after="60" w:before="0"/>
-      </w:pPr>
-      <w:r>
-        <w:rPr>
-          <w:sz w:val="19"/>
-          <w:szCs w:val="19"/>
-        </w:rPr>
-        <w:t xml:space="preserve">☐  Ylläpidettävä koodi – Selkeät tiedostonimet, siisti JSON ja siivouscommit.</w:t>
-      </w:r>
-    </w:p>
-    <w:p>
-      <w:pPr>
-        <w:spacing w:after="60" w:before="0"/>
-      </w:pPr>
-      <w:r>
-        <w:rPr>
-          <w:sz w:val="19"/>
-          <w:szCs w:val="19"/>
-        </w:rPr>
-        <w:t xml:space="preserve">☐  Käyttöliittymä – Pelinäkymän luettavuus: tekstuurien ja nimien ennen/jälkeen-kuvat.</w:t>
-      </w:r>
-    </w:p>
-    <w:p>
-      <w:pPr>
-        <w:spacing w:after="60" w:before="0"/>
-      </w:pPr>
-      <w:r>
-        <w:rPr>
-          <w:sz w:val="19"/>
-          <w:szCs w:val="19"/>
-        </w:rPr>
-        <w:t xml:space="preserve">☐  Toimintojen toteutus – Asset-tehtävät, valmis kun -ehdot, issuet ja commitit.</w:t>
-      </w:r>
-    </w:p>
-    <w:p>
-      <w:pPr>
-        <w:spacing w:after="60" w:before="0"/>
-      </w:pPr>
-      <w:r>
-        <w:rPr>
-          <w:sz w:val="19"/>
-          <w:szCs w:val="19"/>
-        </w:rPr>
-        <w:t xml:space="preserve">☐  Tehtävistä sopiminen – Tehtävälista ja kokousmuistio.</w:t>
-      </w:r>
-    </w:p>
-    <w:p>
-      <w:pPr>
-        <w:spacing w:after="60" w:before="0"/>
-      </w:pPr>
-      <w:r>
-        <w:rPr>
-          <w:sz w:val="19"/>
-          <w:szCs w:val="19"/>
-        </w:rPr>
-        <w:t xml:space="preserve">☐  Ratkaisuvaihtoehdot – Kahden toteutustavan vertailu (vko 39) ja päätös.</w:t>
-      </w:r>
-    </w:p>
-    <w:p>
-      <w:pPr>
-        <w:spacing w:after="60" w:before="0"/>
-      </w:pPr>
-      <w:r>
-        <w:rPr>
-          <w:sz w:val="19"/>
-          <w:szCs w:val="19"/>
-        </w:rPr>
-        <w:t xml:space="preserve">☐  Ratkaisujen arviointi – Paketti- tai versiokatselmoinnin loki.</w:t>
-      </w:r>
-    </w:p>
-    <w:p>
-      <w:pPr>
-        <w:spacing w:after="60" w:before="0"/>
-      </w:pPr>
-      <w:r>
-        <w:rPr>
-          <w:sz w:val="19"/>
-          <w:szCs w:val="19"/>
-        </w:rPr>
-        <w:t xml:space="preserve">☐  Oma toiminta tiimissä – Itsearviointi ja seuraava kehitysaskel.</w:t>
+        <w:t xml:space="preserve">Näyttömatriisi – 32 osaamisvaatimusta</w:t>
+      </w:r>
+    </w:p>
+    <w:p>
+      <w:pPr>
+        <w:spacing w:after="120" w:before="0"/>
+      </w:pPr>
+      <w:r>
+        <w:rPr>
+          <w:color w:val="555555"/>
+          <w:sz w:val="21"/>
+          <w:szCs w:val="21"/>
+        </w:rPr>
+        <w:t xml:space="preserve">Rasti vasta, kun vaatimukselle on täsmällinen työnäyte: linkki, commit, kuva, testirivi tai muistio. Sama työnäyte voi kelvata useaan kohtaan.</w:t>
       </w:r>
     </w:p>
     <w:p>
       <w:pPr>
         <w:pStyle w:val="Heading2"/>
-        <w:spacing w:after="120" w:before="260"/>
+        <w:spacing w:before="260" w:after="120"/>
       </w:pPr>
       <w:r>
         <w:rPr>
@@ -3538,6 +4827,152 @@
           <w:bCs/>
           <w:color w:val="1b5e20"/>
         </w:rPr>
+        <w:t xml:space="preserve">Ohjelmointi</w:t>
+      </w:r>
+    </w:p>
+    <w:p>
+      <w:pPr>
+        <w:spacing w:after="60" w:before="0"/>
+      </w:pPr>
+      <w:r>
+        <w:rPr>
+          <w:sz w:val="19"/>
+          <w:szCs w:val="19"/>
+        </w:rPr>
+        <w:t xml:space="preserve">☐  Kehitysympäristö – Blockbench- ja editorikuva, peliin ladattu paketti ja repository.</w:t>
+      </w:r>
+    </w:p>
+    <w:p>
+      <w:pPr>
+        <w:spacing w:after="60" w:before="0"/>
+      </w:pPr>
+      <w:r>
+        <w:rPr>
+          <w:sz w:val="19"/>
+          <w:szCs w:val="19"/>
+        </w:rPr>
+        <w:t xml:space="preserve">☐  Virheenkorjaus – Kolme täydellistä ketjua aidoista havainnoista tai opettajan merkitsemistä vikatehtävistä.</w:t>
+      </w:r>
+    </w:p>
+    <w:p>
+      <w:pPr>
+        <w:spacing w:after="60" w:before="0"/>
+      </w:pPr>
+      <w:r>
+        <w:rPr>
+          <w:sz w:val="19"/>
+          <w:szCs w:val="19"/>
+        </w:rPr>
+        <w:t xml:space="preserve">☐  Toimintojen testaus – 12 testiä odotettuine ja toteutuneine tuloksineen.</w:t>
+      </w:r>
+    </w:p>
+    <w:p>
+      <w:pPr>
+        <w:spacing w:after="60" w:before="0"/>
+      </w:pPr>
+      <w:r>
+        <w:rPr>
+          <w:sz w:val="19"/>
+          <w:szCs w:val="19"/>
+        </w:rPr>
+        <w:t xml:space="preserve">☐  Rakenteinen ohjelmointi – Datapaketin funktiot ja reseptit jaettu selkeisiin vastuisiin omassa nimiavaruudessa.</w:t>
+      </w:r>
+    </w:p>
+    <w:p>
+      <w:pPr>
+        <w:spacing w:after="60" w:before="0"/>
+      </w:pPr>
+      <w:r>
+        <w:rPr>
+          <w:sz w:val="19"/>
+          <w:szCs w:val="19"/>
+        </w:rPr>
+        <w:t xml:space="preserve">☐  Ylläpidettävä koodi – Selkeät tiedostonimet, siisti JSON ja siivouscommit.</w:t>
+      </w:r>
+    </w:p>
+    <w:p>
+      <w:pPr>
+        <w:spacing w:after="60" w:before="0"/>
+      </w:pPr>
+      <w:r>
+        <w:rPr>
+          <w:sz w:val="19"/>
+          <w:szCs w:val="19"/>
+        </w:rPr>
+        <w:t xml:space="preserve">☐  Käyttöliittymä – Pelinäkymän luettavuus: tekstuurien ja nimien ennen/jälkeen-kuvat.</w:t>
+      </w:r>
+    </w:p>
+    <w:p>
+      <w:pPr>
+        <w:spacing w:after="60" w:before="0"/>
+      </w:pPr>
+      <w:r>
+        <w:rPr>
+          <w:sz w:val="19"/>
+          <w:szCs w:val="19"/>
+        </w:rPr>
+        <w:t xml:space="preserve">☐  Toimintojen toteutus – Asset-tehtävät, valmis kun -ehdot, issuet ja commitit.</w:t>
+      </w:r>
+    </w:p>
+    <w:p>
+      <w:pPr>
+        <w:spacing w:after="60" w:before="0"/>
+      </w:pPr>
+      <w:r>
+        <w:rPr>
+          <w:sz w:val="19"/>
+          <w:szCs w:val="19"/>
+        </w:rPr>
+        <w:t xml:space="preserve">☐  Tehtävistä sopiminen – Tehtävälista ja kokousmuistio.</w:t>
+      </w:r>
+    </w:p>
+    <w:p>
+      <w:pPr>
+        <w:spacing w:after="60" w:before="0"/>
+      </w:pPr>
+      <w:r>
+        <w:rPr>
+          <w:sz w:val="19"/>
+          <w:szCs w:val="19"/>
+        </w:rPr>
+        <w:t xml:space="preserve">☐  Ratkaisuvaihtoehdot – Kahden toteutustavan vertailu (vko 39) ja päätös.</w:t>
+      </w:r>
+    </w:p>
+    <w:p>
+      <w:pPr>
+        <w:spacing w:after="60" w:before="0"/>
+      </w:pPr>
+      <w:r>
+        <w:rPr>
+          <w:sz w:val="19"/>
+          <w:szCs w:val="19"/>
+        </w:rPr>
+        <w:t xml:space="preserve">☐  Ratkaisujen arviointi – Paketti- tai versiokatselmoinnin loki.</w:t>
+      </w:r>
+    </w:p>
+    <w:p>
+      <w:pPr>
+        <w:spacing w:after="60" w:before="0"/>
+      </w:pPr>
+      <w:r>
+        <w:rPr>
+          <w:sz w:val="19"/>
+          <w:szCs w:val="19"/>
+        </w:rPr>
+        <w:t xml:space="preserve">☐  Oma toiminta tiimissä – Itsearviointi ja seuraava kehitysaskel.</w:t>
+      </w:r>
+    </w:p>
+    <w:p>
+      <w:pPr>
+        <w:pStyle w:val="Heading2"/>
+        <w:spacing w:before="260" w:after="120"/>
+      </w:pPr>
+      <w:r>
+        <w:rPr>
+          <w:b/>
+          <w:bCs/>
+          <w:color w:val="1b5e20"/>
+        </w:rPr>
         <w:t xml:space="preserve">Ohjelmistokehittäjänä toimiminen</w:t>
       </w:r>
     </w:p>
@@ -3712,7 +5147,7 @@
     <w:p>
       <w:pPr>
         <w:pStyle w:val="Heading2"/>
-        <w:spacing w:after="120" w:before="260"/>
+        <w:spacing w:before="260" w:after="120"/>
       </w:pPr>
       <w:r>
         <w:rPr>
@@ -3834,43 +5269,6 @@
 
 <file path=word/comments.xml><?xml version="1.0" encoding="utf-8"?>
 <w:comments xmlns:cx="http://schemas.microsoft.com/office/drawing/2014/chartex" xmlns:cx1="http://schemas.microsoft.com/office/drawing/2015/9/8/chartex" xmlns:cx2="http://schemas.microsoft.com/office/drawing/2015/10/21/chartex" xmlns:cx3="http://schemas.microsoft.com/office/drawing/2016/5/9/chartex" xmlns:cx4="http://schemas.microsoft.com/office/drawing/2016/5/10/chartex" xmlns:cx5="http://schemas.microsoft.com/office/drawing/2016/5/11/chartex" xmlns:cx6="http://schemas.microsoft.com/office/drawing/2016/5/12/chartex" xmlns:cx7="http://schemas.microsoft.com/office/drawing/2016/5/13/chartex" xmlns:cx8="http://schemas.microsoft.com/office/drawing/2016/5/14/chartex" xmlns:mc="http://schemas.openxmlformats.org/markup-compatibility/2006" xmlns:aink="http://schemas.microsoft.com/office/drawing/2016/ink" xmlns:am3d="http://schemas.microsoft.com/office/drawing/2017/model3d" xmlns:o="urn:schemas-microsoft-com:office:office" xmlns:r="http://schemas.openxmlformats.org/officeDocument/2006/relationships" xmlns:m="http://schemas.openxmlformats.org/officeDocument/2006/math" xmlns:v="urn:schemas-microsoft-com:vml" xmlns:wp14="http://schemas.microsoft.com/office/word/2010/wordprocessingDrawing" xmlns:wp="http://schemas.openxmlformats.org/drawingml/2006/wordprocessingDrawing" xmlns:w10="urn:schemas-microsoft-com:office:word" xmlns:w="http://schemas.openxmlformats.org/wordprocessingml/2006/main" xmlns:w14="http://schemas.microsoft.com/office/word/2010/wordml" xmlns:w15="http://schemas.microsoft.com/office/word/2012/wordml" xmlns:w16cex="http://schemas.microsoft.com/office/word/2018/wordml/cex" xmlns:w16cid="http://schemas.microsoft.com/office/word/2016/wordml/cid" xmlns:w16="http://schemas.microsoft.com/office/word/2018/wordml" xmlns:w16sdtdh="http://schemas.microsoft.com/office/word/2020/wordml/sdtdatahash" xmlns:w16se="http://schemas.microsoft.com/office/word/2015/wordml/symex" xmlns:wpg="http://schemas.microsoft.com/office/word/2010/wordprocessingGroup" xmlns:wpi="http://schemas.microsoft.com/office/word/2010/wordprocessingInk" xmlns:wne="http://schemas.microsoft.com/office/word/2006/wordml" xmlns:wps="http://schemas.microsoft.com/office/word/2010/wordprocessingShape"/>
-</file>
-
-<file path=word/endnotes.xml><?xml version="1.0" encoding="utf-8"?>
-<w:endnotes xmlns:wpc="http://schemas.microsoft.com/office/word/2010/wordprocessingCanvas" xmlns:mc="http://schemas.openxmlformats.org/markup-compatibility/2006" xmlns:o="urn:schemas-microsoft-com:office:office" xmlns:r="http://schemas.openxmlformats.org/officeDocument/2006/relationships" xmlns:m="http://schemas.openxmlformats.org/officeDocument/2006/math" xmlns:v="urn:schemas-microsoft-com:vml" xmlns:wp14="http://schemas.microsoft.com/office/word/2010/wordprocessingDrawing" xmlns:wp="http://schemas.openxmlformats.org/drawingml/2006/wordprocessingDrawing" xmlns:w10="urn:schemas-microsoft-com:office:word" xmlns:w="http://schemas.openxmlformats.org/wordprocessingml/2006/main" xmlns:w14="http://schemas.microsoft.com/office/word/2010/wordml" xmlns:w15="http://schemas.microsoft.com/office/word/2012/wordml" xmlns:wpg="http://schemas.microsoft.com/office/word/2010/wordprocessingGroup" xmlns:wpi="http://schemas.microsoft.com/office/word/2010/wordprocessingInk" xmlns:wne="http://schemas.microsoft.com/office/word/2006/wordml" xmlns:wps="http://schemas.microsoft.com/office/word/2010/wordprocessingShape" mc:Ignorable="w14 w15 wp14">
-  <w:endnote w:type="separator" w:id="-1">
-    <w:p>
-      <w:pPr>
-        <w:spacing w:after="0" w:line="240" w:lineRule="auto"/>
-      </w:pPr>
-      <w:r>
-        <w:rPr>
-          <w:rStyle w:val="EndnoteReference"/>
-        </w:rPr>
-        <w:endnoteRef/>
-      </w:r>
-      <w:r>
-        <w:separator/>
-      </w:r>
-    </w:p>
-  </w:endnote>
-  <w:endnote w:type="continuationSeparator" w:id="0">
-    <w:p>
-      <w:pPr>
-        <w:spacing w:after="0" w:line="240" w:lineRule="auto"/>
-      </w:pPr>
-      <w:r>
-        <w:rPr>
-          <w:rStyle w:val="EndnoteReference"/>
-        </w:rPr>
-        <w:endnoteRef/>
-      </w:r>
-      <w:r>
-        <w:continuationSeparator/>
-      </w:r>
-    </w:p>
-  </w:endnote>
-</w:endnotes>
 </file>
 
 <file path=word/footnotes.xml><?xml version="1.0" encoding="utf-8"?>
@@ -4010,9 +5408,9 @@
   <w:docDefaults>
     <w:rPrDefault>
       <w:rPr>
-        <w:rFonts w:ascii="Calibri" w:cs="Calibri" w:eastAsia="Calibri" w:hAnsi="Calibri"/>
         <w:sz w:val="21"/>
         <w:szCs w:val="21"/>
+        <w:rFonts w:ascii="Calibri" w:cs="Calibri" w:eastAsia="Calibri" w:hAnsi="Calibri"/>
       </w:rPr>
     </w:rPrDefault>
     <w:pPrDefault/>
@@ -4110,8 +5508,8 @@
     <w:uiPriority w:val="99"/>
     <w:unhideWhenUsed/>
     <w:rPr>
+      <w:u w:val="single"/>
       <w:color w:val="0563C1"/>
-      <w:u w:val="single"/>
     </w:rPr>
   </w:style>
   <w:style w:type="character" w:styleId="FootnoteReference">
@@ -4151,42 +5549,5 @@
       <w:szCs w:val="20"/>
     </w:rPr>
   </w:style>
-  <w:style w:type="character" w:styleId="EndnoteReference">
-    <w:name w:val="endnote reference"/>
-    <w:basedOn w:val="DefaultParagraphFont"/>
-    <w:uiPriority w:val="99"/>
-    <w:semiHidden/>
-    <w:unhideWhenUsed/>
-    <w:rPr>
-      <w:vertAlign w:val="superscript"/>
-    </w:rPr>
-  </w:style>
-  <w:style w:type="paragraph" w:styleId="EndnoteText">
-    <w:name w:val="endnote text"/>
-    <w:basedOn w:val="Normal"/>
-    <w:link w:val="EndnoteTextChar"/>
-    <w:uiPriority w:val="99"/>
-    <w:semiHidden/>
-    <w:unhideWhenUsed/>
-    <w:pPr>
-      <w:spacing w:after="0" w:line="240" w:lineRule="auto"/>
-    </w:pPr>
-    <w:rPr>
-      <w:sz w:val="20"/>
-      <w:szCs w:val="20"/>
-    </w:rPr>
-  </w:style>
-  <w:style w:type="character" w:styleId="EndnoteTextChar">
-    <w:name w:val="Endnote Text Char"/>
-    <w:basedOn w:val="DefaultParagraphFont"/>
-    <w:link w:val="EndnoteText"/>
-    <w:uiPriority w:val="99"/>
-    <w:semiHidden/>
-    <w:unhideWhenUsed/>
-    <w:rPr>
-      <w:sz w:val="20"/>
-      <w:szCs w:val="20"/>
-    </w:rPr>
-  </w:style>
 </w:styles>
 </file>
</xml_diff>

<commit_message>
BittiBiomi: ratkaise tehtävänannon ristiriidat
Opettajan aineisto vastaa opiskelijan ohjetta: kuusi aloituskysymystä, s1 on
yhden julkaistun paketin tutkimus, katselmoinnit viikoilla 41 ja 46 (viikko 47
julkaisuehdokkaan testaus). Paketin JSON-muodot on merkitty sovituksi
toteutustavaksi. Linkitetty näyttömatriisi nayttomatriisi.md (48-3:n loppuun).
Julkiseen repoon vain roolit. Osatehtävien järjestys ennallaan.

Co-Authored-By: Claude Opus 5.5 <noreply@anthropic.com>
</commit_message>
<xml_diff>
--- a/downloads/bittibiomi-tyopaketti.docx
+++ b/downloads/bittibiomi-tyopaketti.docx
@@ -5371,7 +5371,7 @@
           <w:sz w:val="19"/>
           <w:szCs w:val="19"/>
         </w:rPr>
-        <w:t xml:space="preserve">☐  2. Kirjaa sanat sellaisinaan. Älä neuvo, ellei testaaja pyydä apua. Kirjoita ylös testaajan sanat sellaisinaan.</w:t>
+        <w:t xml:space="preserve">☐  2. Kirjaa havainnot roolin mukaan. Älä neuvo, ellei testaaja pyydä apua. Kirjoita ylös, mitä testaaja sanoo ja tekee, roolin mukaan: ohjaaja tai testaaja A. Älä kirjoita nimiä.</w:t>
       </w:r>
     </w:p>
     <w:p>
@@ -5424,7 +5424,7 @@
           <w:sz w:val="19"/>
           <w:szCs w:val="19"/>
         </w:rPr>
-        <w:t xml:space="preserve">Valmis kun: Muistiinpanoissa ovat testaajien sanat ja omat havaintosi erikseen sekä kolme selittämääsi valintaa.</w:t>
+        <w:t xml:space="preserve">Valmis kun: Muistiinpanoissa ovat testaajien havainnot roolin mukaan ja omat havaintosi erikseen sekä kolme selittämääsi valintaa.</w:t>
       </w:r>
     </w:p>
     <w:p>
@@ -5438,7 +5438,7 @@
           <w:sz w:val="19"/>
           <w:szCs w:val="19"/>
         </w:rPr>
-        <w:t xml:space="preserve">Tallenna työnäyte: Muistiinpanot viikon 41 päiväkirjaan.</w:t>
+        <w:t xml:space="preserve">Tallenna työnäyte: Muistiinpanot viikon 41 päiväkirjaan roolein, ilman nimiä. Jos ohjaaja tarvitsee nimen tai sanatarkan lausuman, lähetä se hänelle Teamsissa.</w:t>
       </w:r>
     </w:p>
     <w:p>
@@ -5478,7 +5478,7 @@
           <w:sz w:val="19"/>
           <w:szCs w:val="19"/>
         </w:rPr>
-        <w:t xml:space="preserve">☐  2. Tee muutosissue. Tee muutoksesta GitHub-issue: verbillä alkava otsikko, testaajan alkuperäinen palaute, arvio ja Valmis kun -ehto.</w:t>
+        <w:t xml:space="preserve">☐  2. Tee muutosissue. Tee muutoksesta GitHub-issue: verbillä alkava otsikko, testaajan havainto roolin kanssa (esimerkiksi testaaja A), arvio ja Valmis kun -ehto.</w:t>
       </w:r>
     </w:p>
     <w:p>
@@ -5517,7 +5517,7 @@
           <w:sz w:val="19"/>
           <w:szCs w:val="19"/>
         </w:rPr>
-        <w:t xml:space="preserve">☐  5. Kirjoita katselmointimuistio. Kirjaa päiväkirjaan päivä, osallistujien roolit, testaajien sanat, oma tulkinta, päätös ja hyväksyjä.</w:t>
+        <w:t xml:space="preserve">☐  5. Kirjoita katselmointimuistio. Kirjaa päiväkirjaan päivä, osallistujien roolit, testaajien havainnot roolin mukaan, oma tulkinta, päätös ja hyväksyjä.</w:t>
       </w:r>
     </w:p>
     <w:p>
@@ -5560,7 +5560,7 @@
           <w:sz w:val="19"/>
           <w:szCs w:val="19"/>
         </w:rPr>
-        <w:t xml:space="preserve">Viikon lopputarkistus: Ohjaaja ja vertaistestaaja ovat kokeilleet pakettia pelissä. Muistiossa näkyvät alkuperäinen palaute, oma tulkinta, päätös, hyväksyjä ja yksi rajattu issue.</w:t>
+        <w:t xml:space="preserve">Viikon lopputarkistus: Ohjaaja ja vertaistestaaja ovat kokeilleet pakettia pelissä. Muistiossa näkyvät testaajien havainnot roolin mukaan ilman nimiä, oma tulkinta, päätös, hyväksyjä ja yksi rajattu issue.</w:t>
       </w:r>
     </w:p>
     <w:p>
@@ -7139,7 +7139,7 @@
           <w:sz w:val="19"/>
           <w:szCs w:val="19"/>
         </w:rPr>
-        <w:t xml:space="preserve">☐  3. Vastaa kommenttiin. Kirjaa saamasi kommentti sellaisenaan ja vastaa siihen: korjaa tai perustele, miksi pidät ratkaisun.</w:t>
+        <w:t xml:space="preserve">☐  3. Vastaa kommenttiin. Kirjaa kommentin sisältö ja katselmoijan rooli ilman nimeä ja vastaa siihen: korjaa tai perustele, miksi pidät ratkaisun.</w:t>
       </w:r>
     </w:p>
     <w:p>
@@ -7448,7 +7448,7 @@
           <w:sz w:val="19"/>
           <w:szCs w:val="19"/>
         </w:rPr>
-        <w:t xml:space="preserve">☐  4. Kirjaa havainnot. Kirjaa jokainen havainto erikseen: kuka testasi (rooli), mitä tapahtui ja missä kohdassa. Kirjaa myös, onnistuiko asennus pelkällä ohjeella.</w:t>
+        <w:t xml:space="preserve">☐  4. Kirjaa havainnot. Kirjaa jokainen havainto erikseen: testaajan rooli (ohjaaja tai testaaja B, ei nimeä), mitä tapahtui ja missä kohdassa. Kirjaa myös, onnistuiko asennus pelkällä ohjeella.</w:t>
       </w:r>
     </w:p>
     <w:p>
@@ -7954,11 +7954,24 @@
       </w:pPr>
       <w:r>
         <w:rPr>
+          <w:sz w:val="19"/>
+          <w:szCs w:val="19"/>
+        </w:rPr>
+        <w:t xml:space="preserve">☐  7. Perusta näyttömatriisi. Luo avun pohjasta project-docs/nayttomatriisi.md: jokaista vaatimusta kohti rivi, jossa ovat tunnus, työnäytteen linkki ja viikko. Täytä julkaisun rivit, esimerkiksi s14 ja v1.0-release, ja tee commit.</w:t>
+      </w:r>
+    </w:p>
+    <w:p>
+      <w:pPr>
+        <w:spacing w:after="40" w:before="0"/>
+        <w:ind w:left="360"/>
+      </w:pPr>
+      <w:r>
+        <w:rPr>
           <w:color w:val="1b5e20"/>
           <w:sz w:val="19"/>
           <w:szCs w:val="19"/>
         </w:rPr>
-        <w:t xml:space="preserve">Valmis kun: Release v1.0 on julkaistu kahden zipin kanssa, ja olet itse asentanut sen ohjeen avulla puhtaaseen peliin.</w:t>
+        <w:t xml:space="preserve">Valmis kun: Release v1.0 on julkaistu kahden zipin kanssa, ja olet itse asentanut sen ohjeen avulla puhtaaseen peliin. project-docs/nayttomatriisi.md on perustettu, ja julkaisun rivit on täytetty.</w:t>
       </w:r>
     </w:p>
     <w:p>
@@ -7972,7 +7985,7 @@
           <w:sz w:val="19"/>
           <w:szCs w:val="19"/>
         </w:rPr>
-        <w:t xml:space="preserve">Tallenna työnäyte: Release-linkki viikon 48 päiväkirjaan.</w:t>
+        <w:t xml:space="preserve">Tallenna työnäyte: Release-linkki viikon 48 päiväkirjaan. project-docs/nayttomatriisi.md commitilla repositoryyn.</w:t>
       </w:r>
     </w:p>
     <w:p>
@@ -8094,7 +8107,7 @@
           <w:sz w:val="19"/>
           <w:szCs w:val="19"/>
         </w:rPr>
-        <w:t xml:space="preserve">Viikon lopputarkistus: v1.0-tagin commit vastaa julkaistua versiota. Toinen henkilö on ladannut releasen ja asentanut paketin puhtaaseen peliin pelkän ohjeen avulla.</w:t>
+        <w:t xml:space="preserve">Viikon lopputarkistus: v1.0-tagin commit vastaa julkaistua versiota. Toinen henkilö on ladannut releasen ja asentanut paketin puhtaaseen peliin pelkän ohjeen avulla. project-docs/nayttomatriisi.md on perustettu.</w:t>
       </w:r>
     </w:p>
     <w:p>
@@ -8107,7 +8120,7 @@
           <w:sz w:val="19"/>
           <w:szCs w:val="19"/>
         </w:rPr>
-        <w:t xml:space="preserve">Työnäyte Git-repositoryyn ennen rastia: release-linkki, v1.0-tagi, README asennusohjeineen, CHANGELOG ja ulkopuolisen asennustestin kirjaus.</w:t>
+        <w:t xml:space="preserve">Työnäyte Git-repositoryyn ennen rastia: release-linkki, v1.0-tagi, README asennusohjeineen, CHANGELOG, ulkopuolisen asennustestin kirjaus ja perustettu project-docs/nayttomatriisi.md.</w:t>
       </w:r>
     </w:p>
     <w:p>
@@ -8349,46 +8362,46 @@
           <w:sz w:val="19"/>
           <w:szCs w:val="19"/>
         </w:rPr>
-        <w:t xml:space="preserve">☐  1. Katso puuttuvat kohdat. Avaa Näyttömatriisi-näkymä eli luettelo osaamisvaatimuksista, joihin tarvitset työnäytteen. Katso, mitkä kohdat on vielä rastittamatta.</w:t>
-      </w:r>
-    </w:p>
-    <w:p>
-      <w:pPr>
-        <w:spacing w:after="40" w:before="0"/>
-        <w:ind w:left="360"/>
-      </w:pPr>
-      <w:r>
-        <w:rPr>
-          <w:sz w:val="19"/>
-          <w:szCs w:val="19"/>
-        </w:rPr>
-        <w:t xml:space="preserve">☐  2. Etsi työnäytteet. Etsi jokaiselle rastittamattomalle kohdalle työnäyte: issue, tiedosto, commit, testitapaus tai päiväkirjan viikko.</w:t>
-      </w:r>
-    </w:p>
-    <w:p>
-      <w:pPr>
-        <w:spacing w:after="40" w:before="0"/>
-        <w:ind w:left="360"/>
-      </w:pPr>
-      <w:r>
-        <w:rPr>
-          <w:sz w:val="19"/>
-          <w:szCs w:val="19"/>
-        </w:rPr>
-        <w:t xml:space="preserve">☐  3. Kirjaa tarkat linkit. Kirjoita viikon 49 päiväkirjaan jokaisen vaatimuksen nimi ja tarkka linkki. Linkin pitää avata juuri se kohta, ei repositoryn etusivua.</w:t>
-      </w:r>
-    </w:p>
-    <w:p>
-      <w:pPr>
-        <w:spacing w:after="40" w:before="0"/>
-        <w:ind w:left="360"/>
-      </w:pPr>
-      <w:r>
-        <w:rPr>
-          <w:sz w:val="19"/>
-          <w:szCs w:val="19"/>
-        </w:rPr>
-        <w:t xml:space="preserve">☐  4. Rastita vaatimus. Rastita vaatimus Näyttömatriisi-näkymässä, kun linkki on kirjattu.</w:t>
+        <w:t xml:space="preserve">☐  1. Katso puuttuvat kohdat. Avaa project-docs/nayttomatriisi.md ja sivun Näyttömatriisi-näkymä eli oma muistilistasi osaamisvaatimuksista. Katso, miltä vaatimuksilta rivi tai rasti vielä puuttuu.</w:t>
+      </w:r>
+    </w:p>
+    <w:p>
+      <w:pPr>
+        <w:spacing w:after="40" w:before="0"/>
+        <w:ind w:left="360"/>
+      </w:pPr>
+      <w:r>
+        <w:rPr>
+          <w:sz w:val="19"/>
+          <w:szCs w:val="19"/>
+        </w:rPr>
+        <w:t xml:space="preserve">☐  2. Etsi työnäytteet. Etsi jokaiselle puuttuvalle kohdalle työnäyte: issue, tiedosto, commit, tagi, kuva tai testitapaus.</w:t>
+      </w:r>
+    </w:p>
+    <w:p>
+      <w:pPr>
+        <w:spacing w:after="40" w:before="0"/>
+        <w:ind w:left="360"/>
+      </w:pPr>
+      <w:r>
+        <w:rPr>
+          <w:sz w:val="19"/>
+          <w:szCs w:val="19"/>
+        </w:rPr>
+        <w:t xml:space="preserve">☐  3. Kirjaa tarkat linkit. Kirjoita nayttomatriisi.md-tiedostoon jokaiselle vaatimukselle rivi: tunnus, tarkka linkki ja viikko. Linkin pitää avata juuri se kohta, ei repositoryn etusivua.</w:t>
+      </w:r>
+    </w:p>
+    <w:p>
+      <w:pPr>
+        <w:spacing w:after="40" w:before="0"/>
+        <w:ind w:left="360"/>
+      </w:pPr>
+      <w:r>
+        <w:rPr>
+          <w:sz w:val="19"/>
+          <w:szCs w:val="19"/>
+        </w:rPr>
+        <w:t xml:space="preserve">☐  4. Rastita vaatimus. Rastita vaatimus sivun Näyttömatriisi-näkymässä, kun sen rivi on tiedostossa.</w:t>
       </w:r>
     </w:p>
     <w:p>
@@ -8402,7 +8415,7 @@
           <w:sz w:val="19"/>
           <w:szCs w:val="19"/>
         </w:rPr>
-        <w:t xml:space="preserve">Valmis kun: Jokaisella näyttömatriisin vaatimuksella on tarkka linkki, joka aukeaa.</w:t>
+        <w:t xml:space="preserve">Valmis kun: project-docs/nayttomatriisi.md:ssä on rivi jokaiselle 32 vaatimukselle, ja jokainen linkki aukeaa oikeaan kohtaan.</w:t>
       </w:r>
     </w:p>
     <w:p>
@@ -8416,7 +8429,7 @@
           <w:sz w:val="19"/>
           <w:szCs w:val="19"/>
         </w:rPr>
-        <w:t xml:space="preserve">Tallenna työnäyte: Vaatimusten linkit viikon 49 päiväkirjaan, josta ne tulevat mukaan projektipaivakirja.md-tiedostoon.</w:t>
+        <w:t xml:space="preserve">Tallenna työnäyte: project-docs/nayttomatriisi.md commitilla repositoryyn. Linkki tiedostoon viikon 49 päiväkirjaan.</w:t>
       </w:r>
     </w:p>
     <w:p>
@@ -8619,7 +8632,7 @@
           <w:sz w:val="19"/>
           <w:szCs w:val="19"/>
         </w:rPr>
-        <w:t xml:space="preserve">Viikon lopputarkistus: Jokaisella arviointikohdalla on avautuva tarkka linkki tai tunniste. Projektipäiväkirja ja AI-loki ovat repositoryssa, ja demo käyttää samaa jäädytettyä v1.0-versiota.</w:t>
+        <w:t xml:space="preserve">Viikon lopputarkistus: project-docs/nayttomatriisi.md:ssä jokaisella arviointikohdalla on avautuva tarkka linkki. Projektipäiväkirja ja AI-loki ovat repositoryssa, ja demo käyttää samaa jäädytettyä v1.0-versiota.</w:t>
       </w:r>
     </w:p>
     <w:p>
@@ -8632,7 +8645,7 @@
           <w:sz w:val="19"/>
           <w:szCs w:val="19"/>
         </w:rPr>
-        <w:t xml:space="preserve">Työnäyte Git-repositoryyn ennen rastia: julkaistu paketti, repository, project-docs/projektipaivakirja.md, näyttömatriisi, AI-loki ja demo.</w:t>
+        <w:t xml:space="preserve">Työnäyte Git-repositoryyn ennen rastia: julkaistu paketti, repository, project-docs/projektipaivakirja.md, project-docs/nayttomatriisi.md, AI-loki ja demo.</w:t>
       </w:r>
     </w:p>
     <w:p>

</xml_diff>

<commit_message>
BittiBiomi: GitHub Desktop -kuvaohje viikolle 34
Linkitetään koontirepon GitHub Desktop -kuvaohje Minecraft-muodossa
(?projekti=bittibiomi):
- viikon 34 resurssilinkki "GitHub Desktop: kuvaohje ilman Git-komentoja"
- työvaihe 34-4: Desktopin asennus = kuvaohjeen kohta 1
- työvaihe 34-5: repo GitHubissa (Public + README), kirjautuminen ja
  noreply-tekijätiedot (kohta 2), kloonaus reitillä C ja .gitignore
  kuvaohjeen mallin mukaan; avussa linkit kohtiin
- Projektin kokonaiskuva: linkki GitHub ja GitHub Desktop -kohdassa
- työpaketti: viikon resurssilinkit mukaan (resurssienPerusosoite)

Co-Authored-By: Claude Opus 5.5 <noreply@anthropic.com>
</commit_message>
<xml_diff>
--- a/downloads/bittibiomi-tyopaketti.docx
+++ b/downloads/bittibiomi-tyopaketti.docx
@@ -4,7 +4,7 @@
   <w:body>
     <w:p>
       <w:pPr>
-        <w:spacing w:before="2400" w:after="200"/>
+        <w:spacing w:after="200" w:before="2400"/>
         <w:jc w:val="center"/>
       </w:pPr>
       <w:r>
@@ -96,7 +96,7 @@
     <w:p>
       <w:pPr>
         <w:pStyle w:val="Heading1"/>
-        <w:spacing w:before="320" w:after="160"/>
+        <w:spacing w:after="160" w:before="320"/>
       </w:pPr>
       <w:r>
         <w:rPr>
@@ -174,7 +174,7 @@
     <w:p>
       <w:pPr>
         <w:pStyle w:val="Heading2"/>
-        <w:spacing w:before="260" w:after="120"/>
+        <w:spacing w:after="120" w:before="260"/>
       </w:pPr>
       <w:r>
         <w:rPr>
@@ -343,7 +343,7 @@
     <w:p>
       <w:pPr>
         <w:pStyle w:val="Heading1"/>
-        <w:spacing w:before="320" w:after="160"/>
+        <w:spacing w:after="160" w:before="320"/>
       </w:pPr>
       <w:r>
         <w:rPr>
@@ -2039,7 +2039,7 @@
     <w:p>
       <w:pPr>
         <w:pStyle w:val="Heading1"/>
-        <w:spacing w:before="320" w:after="160"/>
+        <w:spacing w:after="160" w:before="320"/>
       </w:pPr>
       <w:r>
         <w:rPr>
@@ -2053,7 +2053,7 @@
     <w:p>
       <w:pPr>
         <w:pStyle w:val="Heading2"/>
-        <w:spacing w:before="260" w:after="120"/>
+        <w:spacing w:after="120" w:before="260"/>
       </w:pPr>
       <w:r>
         <w:rPr>
@@ -2089,6 +2089,28 @@
         </w:rPr>
         <w:t xml:space="preserve">Viikon tavoite: Oma tyhjä paketti näkyy pelin Resource Packs -valikossa omalla kuvallaan, ja julkinen repository on perustettu.</w:t>
       </w:r>
+    </w:p>
+    <w:p>
+      <w:pPr>
+        <w:spacing w:after="80"/>
+      </w:pPr>
+      <w:r>
+        <w:rPr>
+          <w:sz w:val="19"/>
+          <w:szCs w:val="19"/>
+        </w:rPr>
+        <w:t xml:space="preserve">Kuvaohje tai materiaali: </w:t>
+      </w:r>
+      <w:hyperlink w:history="1" r:id="rIdlxxp1t18oo_pyhb321xpn">
+        <w:r>
+          <w:rPr>
+            <w:rStyle w:val="Hyperlink"/>
+            <w:sz w:val="19"/>
+            <w:szCs w:val="19"/>
+          </w:rPr>
+          <w:t xml:space="preserve">GitHub Desktop: kuvaohje ilman Git-komentoja</w:t>
+        </w:r>
+      </w:hyperlink>
     </w:p>
     <w:p>
       <w:pPr>
@@ -2422,7 +2444,7 @@
           <w:sz w:val="19"/>
           <w:szCs w:val="19"/>
         </w:rPr>
-        <w:t xml:space="preserve">☐  1. Asenna Blockbench, VS Code ja GitHub Desktop. Tarkista Minecraft Launcherista, että sovittu Minecraft Java -versio käynnistyy.</w:t>
+        <w:t xml:space="preserve">☐  1. Asenna Blockbench, VS Code ja GitHub Desktop (kuvaohjeen kohta 1). Tarkista Minecraft Launcherista, että sovittu Minecraft Java -versio käynnistyy.</w:t>
       </w:r>
     </w:p>
     <w:p>
@@ -2542,7 +2564,7 @@
           <w:sz w:val="19"/>
           <w:szCs w:val="19"/>
         </w:rPr>
-        <w:t xml:space="preserve">☐  1. Lue avun lista siitä, mitä julkiseen repositoryyn ei laiteta. Git-historia on pysyvä. Piilota sähköpostisi: GitHubissa Settings → Emails → Keep my email addresses private ja GitHub Desktopissa Options (Macissa Settings) → Git → Email-kohtaan noreply-osoite.</w:t>
+        <w:t xml:space="preserve">☐  1. Lue avun lista siitä, mitä julkiseen repositoryyn ei laiteta. Git-historia on pysyvä. Piilota sähköpostisi GitHubissa: Settings → Emails → Keep my email addresses private.</w:t>
       </w:r>
     </w:p>
     <w:p>
@@ -2568,59 +2590,72 @@
           <w:sz w:val="19"/>
           <w:szCs w:val="19"/>
         </w:rPr>
-        <w:t xml:space="preserve">☐  3. Luo GitHubiin uusi repository, valitse näkyvyydeksi Public ja valitse luontisivulla README-tiedoston lisäys (Add a README file). Kirjaudu GitHub Desktopiin ja kloonaa eli kopioi repository koneellesi: File → Clone repository.</w:t>
-      </w:r>
-    </w:p>
-    <w:p>
-      <w:pPr>
-        <w:spacing w:after="40" w:before="0"/>
-        <w:ind w:left="360"/>
-      </w:pPr>
-      <w:r>
-        <w:rPr>
-          <w:sz w:val="19"/>
-          <w:szCs w:val="19"/>
-        </w:rPr>
-        <w:t xml:space="preserve">☐  4. Siirrä resourcepack-kansio repositoryn kansioon. Luo sinne myös kansiot datapack ja project-docs.</w:t>
-      </w:r>
-    </w:p>
-    <w:p>
-      <w:pPr>
-        <w:spacing w:after="40" w:before="0"/>
-        <w:ind w:left="360"/>
-      </w:pPr>
-      <w:r>
-        <w:rPr>
-          <w:sz w:val="19"/>
-          <w:szCs w:val="19"/>
-        </w:rPr>
-        <w:t xml:space="preserve">☐  5. Lisää datapack-kansioon tiedosto README.md, jossa lukee ”Datapaketti tehdään viikolla 43.” Tiedosto tarvitaan, koska Git ei tallenna tyhjää kansiota.</w:t>
-      </w:r>
-    </w:p>
-    <w:p>
-      <w:pPr>
-        <w:spacing w:after="40" w:before="0"/>
-        <w:ind w:left="360"/>
-      </w:pPr>
-      <w:r>
-        <w:rPr>
-          <w:sz w:val="19"/>
-          <w:szCs w:val="19"/>
-        </w:rPr>
-        <w:t xml:space="preserve">☐  6. Kirjoita repositoryn juuren README.md-tiedostoon paketin nimi ja yksi virke siitä, mitä se tekee. Lisää valikon kuva polkuun project-docs/evidence/week-34/valikko.png.</w:t>
-      </w:r>
-    </w:p>
-    <w:p>
-      <w:pPr>
-        <w:spacing w:after="40" w:before="0"/>
-        <w:ind w:left="360"/>
-      </w:pPr>
-      <w:r>
-        <w:rPr>
-          <w:sz w:val="19"/>
-          <w:szCs w:val="19"/>
-        </w:rPr>
-        <w:t xml:space="preserve">☐  7. Tee commit ja push: kirjoita GitHub Desktopin Summary-kenttään ”Pakettirunko”, paina Commit to main ja sitten Push origin.</w:t>
+        <w:t xml:space="preserve">☐  3. Luo GitHubiin uusi repository: valitse näkyvyydeksi Public ja rastita Add a README file.</w:t>
+      </w:r>
+    </w:p>
+    <w:p>
+      <w:pPr>
+        <w:spacing w:after="40" w:before="0"/>
+        <w:ind w:left="360"/>
+      </w:pPr>
+      <w:r>
+        <w:rPr>
+          <w:sz w:val="19"/>
+          <w:szCs w:val="19"/>
+        </w:rPr>
+        <w:t xml:space="preserve">☐  4. Kirjaudu GitHub Desktopiin ja aseta tekijätietoihin sovittu tekijänimi ja noreply-osoite (kuvaohjeen kohta 2). Kloonaa repository: File → Clone repository → URL, eli kuvaohjeen reitti C.</w:t>
+      </w:r>
+    </w:p>
+    <w:p>
+      <w:pPr>
+        <w:spacing w:after="40" w:before="0"/>
+        <w:ind w:left="360"/>
+      </w:pPr>
+      <w:r>
+        <w:rPr>
+          <w:sz w:val="19"/>
+          <w:szCs w:val="19"/>
+        </w:rPr>
+        <w:t xml:space="preserve">☐  5. Siirrä resourcepack-kansio repositoryn kansioon. Luo sinne myös kansiot datapack ja project-docs sekä kuvaohjeen mallin mukainen .gitignore.</w:t>
+      </w:r>
+    </w:p>
+    <w:p>
+      <w:pPr>
+        <w:spacing w:after="40" w:before="0"/>
+        <w:ind w:left="360"/>
+      </w:pPr>
+      <w:r>
+        <w:rPr>
+          <w:sz w:val="19"/>
+          <w:szCs w:val="19"/>
+        </w:rPr>
+        <w:t xml:space="preserve">☐  6. Lisää datapack-kansioon tiedosto README.md, jossa lukee ”Datapaketti tehdään viikolla 43.” Tiedosto tarvitaan, koska Git ei tallenna tyhjää kansiota.</w:t>
+      </w:r>
+    </w:p>
+    <w:p>
+      <w:pPr>
+        <w:spacing w:after="40" w:before="0"/>
+        <w:ind w:left="360"/>
+      </w:pPr>
+      <w:r>
+        <w:rPr>
+          <w:sz w:val="19"/>
+          <w:szCs w:val="19"/>
+        </w:rPr>
+        <w:t xml:space="preserve">☐  7. Kirjoita repositoryn juuren README.md-tiedostoon paketin nimi ja yksi virke siitä, mitä se tekee. Lisää valikon kuva polkuun project-docs/evidence/week-34/valikko.png.</w:t>
+      </w:r>
+    </w:p>
+    <w:p>
+      <w:pPr>
+        <w:spacing w:after="40" w:before="0"/>
+        <w:ind w:left="360"/>
+      </w:pPr>
+      <w:r>
+        <w:rPr>
+          <w:sz w:val="19"/>
+          <w:szCs w:val="19"/>
+        </w:rPr>
+        <w:t xml:space="preserve">☐  8. Tee commit ja push: kirjoita GitHub Desktopin Summary-kenttään ”Pakettirunko”, paina Commit to main ja sitten Push origin.</w:t>
       </w:r>
     </w:p>
     <w:p>
@@ -2682,7 +2717,7 @@
     <w:p>
       <w:pPr>
         <w:pStyle w:val="Heading2"/>
-        <w:spacing w:before="260" w:after="120"/>
+        <w:spacing w:after="120" w:before="260"/>
       </w:pPr>
       <w:r>
         <w:rPr>
@@ -2718,6 +2753,50 @@
         </w:rPr>
         <w:t xml:space="preserve">Viikon tavoite: Ohjaaja hyväksyy paketin rajauksen: jokainen pakollinen asset on GitHubissa omana issuenaan.</w:t>
       </w:r>
+    </w:p>
+    <w:p>
+      <w:pPr>
+        <w:spacing w:after="80"/>
+      </w:pPr>
+      <w:r>
+        <w:rPr>
+          <w:sz w:val="19"/>
+          <w:szCs w:val="19"/>
+        </w:rPr>
+        <w:t xml:space="preserve">Kuvaohje tai materiaali: </w:t>
+      </w:r>
+      <w:hyperlink w:history="1" r:id="rIdl-danfvm-jbmdah6kyrk6">
+        <w:r>
+          <w:rPr>
+            <w:rStyle w:val="Hyperlink"/>
+            <w:sz w:val="19"/>
+            <w:szCs w:val="19"/>
+          </w:rPr>
+          <w:t xml:space="preserve">Täytä Asset-pack-suunnitelma tällä sivulla</w:t>
+        </w:r>
+      </w:hyperlink>
+    </w:p>
+    <w:p>
+      <w:pPr>
+        <w:spacing w:after="80"/>
+      </w:pPr>
+      <w:r>
+        <w:rPr>
+          <w:sz w:val="19"/>
+          <w:szCs w:val="19"/>
+        </w:rPr>
+        <w:t xml:space="preserve">Kuvaohje tai materiaali: </w:t>
+      </w:r>
+      <w:hyperlink w:history="1" r:id="rIdhguqaqbk-rtyytmw60ql4">
+        <w:r>
+          <w:rPr>
+            <w:rStyle w:val="Hyperlink"/>
+            <w:sz w:val="19"/>
+            <w:szCs w:val="19"/>
+          </w:rPr>
+          <w:t xml:space="preserve">Avaa koko toimeksianto</w:t>
+        </w:r>
+      </w:hyperlink>
     </w:p>
     <w:p>
       <w:pPr>
@@ -3204,7 +3283,7 @@
     <w:p>
       <w:pPr>
         <w:pStyle w:val="Heading1"/>
-        <w:spacing w:before="320" w:after="160"/>
+        <w:spacing w:after="160" w:before="320"/>
       </w:pPr>
       <w:r>
         <w:rPr>
@@ -3218,7 +3297,7 @@
     <w:p>
       <w:pPr>
         <w:pStyle w:val="Heading2"/>
-        <w:spacing w:before="260" w:after="120"/>
+        <w:spacing w:after="120" w:before="260"/>
       </w:pPr>
       <w:r>
         <w:rPr>
@@ -3254,6 +3333,72 @@
         </w:rPr>
         <w:t xml:space="preserve">Viikon tavoite: Pelaaja näkee maailmassa kolme blokkia sinun omilla tekstuureillasi.</w:t>
       </w:r>
+    </w:p>
+    <w:p>
+      <w:pPr>
+        <w:spacing w:after="80"/>
+      </w:pPr>
+      <w:r>
+        <w:rPr>
+          <w:sz w:val="19"/>
+          <w:szCs w:val="19"/>
+        </w:rPr>
+        <w:t xml:space="preserve">Kuvaohje tai materiaali: </w:t>
+      </w:r>
+      <w:hyperlink w:history="1" r:id="rIdw5iz0wqat_cfedly4un4k">
+        <w:r>
+          <w:rPr>
+            <w:rStyle w:val="Hyperlink"/>
+            <w:sz w:val="19"/>
+            <w:szCs w:val="19"/>
+          </w:rPr>
+          <w:t xml:space="preserve">Piskel – piirrä pikselitekstuurit selaimessa</w:t>
+        </w:r>
+      </w:hyperlink>
+    </w:p>
+    <w:p>
+      <w:pPr>
+        <w:spacing w:after="80"/>
+      </w:pPr>
+      <w:r>
+        <w:rPr>
+          <w:sz w:val="19"/>
+          <w:szCs w:val="19"/>
+        </w:rPr>
+        <w:t xml:space="preserve">Kuvaohje tai materiaali: </w:t>
+      </w:r>
+      <w:hyperlink w:history="1" r:id="rIdgqecnonsg-b2f4ljf0rfu">
+        <w:r>
+          <w:rPr>
+            <w:rStyle w:val="Hyperlink"/>
+            <w:sz w:val="19"/>
+            <w:szCs w:val="19"/>
+          </w:rPr>
+          <w:t xml:space="preserve">Lospec – väripaletit</w:t>
+        </w:r>
+      </w:hyperlink>
+    </w:p>
+    <w:p>
+      <w:pPr>
+        <w:spacing w:after="80"/>
+      </w:pPr>
+      <w:r>
+        <w:rPr>
+          <w:sz w:val="19"/>
+          <w:szCs w:val="19"/>
+        </w:rPr>
+        <w:t xml:space="preserve">Kuvaohje tai materiaali: </w:t>
+      </w:r>
+      <w:hyperlink w:history="1" r:id="rIddbfe3bgdcxlwzfynciewg">
+        <w:r>
+          <w:rPr>
+            <w:rStyle w:val="Hyperlink"/>
+            <w:sz w:val="19"/>
+            <w:szCs w:val="19"/>
+          </w:rPr>
+          <w:t xml:space="preserve">Minecraft Wiki – resurssipaketin rakenne</w:t>
+        </w:r>
+      </w:hyperlink>
     </w:p>
     <w:p>
       <w:pPr>
@@ -3594,7 +3739,7 @@
     <w:p>
       <w:pPr>
         <w:pStyle w:val="Heading2"/>
-        <w:spacing w:before="260" w:after="120"/>
+        <w:spacing w:after="120" w:before="260"/>
       </w:pPr>
       <w:r>
         <w:rPr>
@@ -3983,7 +4128,7 @@
     <w:p>
       <w:pPr>
         <w:pStyle w:val="Heading2"/>
-        <w:spacing w:before="260" w:after="120"/>
+        <w:spacing w:after="120" w:before="260"/>
       </w:pPr>
       <w:r>
         <w:rPr>
@@ -4019,6 +4164,50 @@
         </w:rPr>
         <w:t xml:space="preserve">Viikon tavoite: Pelaaja voi asettaa maahan blokin, jolla on sinun Blockbenchissä tekemäsi 3D-muoto.</w:t>
       </w:r>
+    </w:p>
+    <w:p>
+      <w:pPr>
+        <w:spacing w:after="80"/>
+      </w:pPr>
+      <w:r>
+        <w:rPr>
+          <w:sz w:val="19"/>
+          <w:szCs w:val="19"/>
+        </w:rPr>
+        <w:t xml:space="preserve">Kuvaohje tai materiaali: </w:t>
+      </w:r>
+      <w:hyperlink w:history="1" r:id="rId7etnquj9kw0rzyy5mdvyi">
+        <w:r>
+          <w:rPr>
+            <w:rStyle w:val="Hyperlink"/>
+            <w:sz w:val="19"/>
+            <w:szCs w:val="19"/>
+          </w:rPr>
+          <w:t xml:space="preserve">Blockbench – lataa tai käytä selaimessa</w:t>
+        </w:r>
+      </w:hyperlink>
+    </w:p>
+    <w:p>
+      <w:pPr>
+        <w:spacing w:after="80"/>
+      </w:pPr>
+      <w:r>
+        <w:rPr>
+          <w:sz w:val="19"/>
+          <w:szCs w:val="19"/>
+        </w:rPr>
+        <w:t xml:space="preserve">Kuvaohje tai materiaali: </w:t>
+      </w:r>
+      <w:hyperlink w:history="1" r:id="rIdjnswmxpiig_gzxwp2saow">
+        <w:r>
+          <w:rPr>
+            <w:rStyle w:val="Hyperlink"/>
+            <w:sz w:val="19"/>
+            <w:szCs w:val="19"/>
+          </w:rPr>
+          <w:t xml:space="preserve">Blockbench Wiki – aloitusohjeet</w:t>
+        </w:r>
+      </w:hyperlink>
     </w:p>
     <w:p>
       <w:pPr>
@@ -4346,7 +4535,7 @@
     <w:p>
       <w:pPr>
         <w:pStyle w:val="Heading2"/>
-        <w:spacing w:before="260" w:after="120"/>
+        <w:spacing w:after="120" w:before="260"/>
       </w:pPr>
       <w:r>
         <w:rPr>
@@ -4735,7 +4924,7 @@
     <w:p>
       <w:pPr>
         <w:pStyle w:val="Heading2"/>
-        <w:spacing w:before="260" w:after="120"/>
+        <w:spacing w:after="120" w:before="260"/>
       </w:pPr>
       <w:r>
         <w:rPr>
@@ -4771,6 +4960,50 @@
         </w:rPr>
         <w:t xml:space="preserve">Viikon tavoite: Pelaaja kuulee paketin oman äänen ja näkee sen tekstityksen, ja äänen lisenssi sallii julkaisun.</w:t>
       </w:r>
+    </w:p>
+    <w:p>
+      <w:pPr>
+        <w:spacing w:after="80"/>
+      </w:pPr>
+      <w:r>
+        <w:rPr>
+          <w:sz w:val="19"/>
+          <w:szCs w:val="19"/>
+        </w:rPr>
+        <w:t xml:space="preserve">Kuvaohje tai materiaali: </w:t>
+      </w:r>
+      <w:hyperlink w:history="1" r:id="rIdmrgaq4ukzqjbkyerbb2cm">
+        <w:r>
+          <w:rPr>
+            <w:rStyle w:val="Hyperlink"/>
+            <w:sz w:val="19"/>
+            <w:szCs w:val="19"/>
+          </w:rPr>
+          <w:t xml:space="preserve">Freesound – CC-lisensoituja ääniä, tarkista lisenssi</w:t>
+        </w:r>
+      </w:hyperlink>
+    </w:p>
+    <w:p>
+      <w:pPr>
+        <w:spacing w:after="80"/>
+      </w:pPr>
+      <w:r>
+        <w:rPr>
+          <w:sz w:val="19"/>
+          <w:szCs w:val="19"/>
+        </w:rPr>
+        <w:t xml:space="preserve">Kuvaohje tai materiaali: </w:t>
+      </w:r>
+      <w:hyperlink w:history="1" r:id="rId5za7qffranrxkvxfi2g07">
+        <w:r>
+          <w:rPr>
+            <w:rStyle w:val="Hyperlink"/>
+            <w:sz w:val="19"/>
+            <w:szCs w:val="19"/>
+          </w:rPr>
+          <w:t xml:space="preserve">Minecraft Wiki – sounds.json</w:t>
+        </w:r>
+      </w:hyperlink>
     </w:p>
     <w:p>
       <w:pPr>
@@ -5163,7 +5396,7 @@
     <w:p>
       <w:pPr>
         <w:pStyle w:val="Heading1"/>
-        <w:spacing w:before="320" w:after="160"/>
+        <w:spacing w:after="160" w:before="320"/>
       </w:pPr>
       <w:r>
         <w:rPr>
@@ -5177,7 +5410,7 @@
     <w:p>
       <w:pPr>
         <w:pStyle w:val="Heading2"/>
-        <w:spacing w:before="260" w:after="120"/>
+        <w:spacing w:after="120" w:before="260"/>
       </w:pPr>
       <w:r>
         <w:rPr>
@@ -5579,7 +5812,7 @@
     <w:p>
       <w:pPr>
         <w:pStyle w:val="Heading2"/>
-        <w:spacing w:before="260" w:after="120"/>
+        <w:spacing w:after="120" w:before="260"/>
       </w:pPr>
       <w:r>
         <w:rPr>
@@ -5605,7 +5838,7 @@
     <w:p>
       <w:pPr>
         <w:pStyle w:val="Heading2"/>
-        <w:spacing w:before="260" w:after="120"/>
+        <w:spacing w:after="120" w:before="260"/>
       </w:pPr>
       <w:r>
         <w:rPr>
@@ -6007,7 +6240,7 @@
     <w:p>
       <w:pPr>
         <w:pStyle w:val="Heading2"/>
-        <w:spacing w:before="260" w:after="120"/>
+        <w:spacing w:after="120" w:before="260"/>
       </w:pPr>
       <w:r>
         <w:rPr>
@@ -6043,6 +6276,50 @@
         </w:rPr>
         <w:t xml:space="preserve">Viikon tavoite: Pelaaja valmistaa teemasi reseptin selviytymistilassa ja saa siitä saavutuksen ja palkinnon.</w:t>
       </w:r>
+    </w:p>
+    <w:p>
+      <w:pPr>
+        <w:spacing w:after="80"/>
+      </w:pPr>
+      <w:r>
+        <w:rPr>
+          <w:sz w:val="19"/>
+          <w:szCs w:val="19"/>
+        </w:rPr>
+        <w:t xml:space="preserve">Kuvaohje tai materiaali: </w:t>
+      </w:r>
+      <w:hyperlink w:history="1" r:id="rIdjjzflwnd8eqxntw9ehcru">
+        <w:r>
+          <w:rPr>
+            <w:rStyle w:val="Hyperlink"/>
+            <w:sz w:val="19"/>
+            <w:szCs w:val="19"/>
+          </w:rPr>
+          <w:t xml:space="preserve">Misode – reseptigeneraattori, tarkista rakenne</w:t>
+        </w:r>
+      </w:hyperlink>
+    </w:p>
+    <w:p>
+      <w:pPr>
+        <w:spacing w:after="80"/>
+      </w:pPr>
+      <w:r>
+        <w:rPr>
+          <w:sz w:val="19"/>
+          <w:szCs w:val="19"/>
+        </w:rPr>
+        <w:t xml:space="preserve">Kuvaohje tai materiaali: </w:t>
+      </w:r>
+      <w:hyperlink w:history="1" r:id="rIdlqy6y2r3rgetup3vgsje5">
+        <w:r>
+          <w:rPr>
+            <w:rStyle w:val="Hyperlink"/>
+            <w:sz w:val="19"/>
+            <w:szCs w:val="19"/>
+          </w:rPr>
+          <w:t xml:space="preserve">Misode – advancement-generaattori</w:t>
+        </w:r>
+      </w:hyperlink>
     </w:p>
     <w:p>
       <w:pPr>
@@ -6409,7 +6686,7 @@
     <w:p>
       <w:pPr>
         <w:pStyle w:val="Heading1"/>
-        <w:spacing w:before="320" w:after="160"/>
+        <w:spacing w:after="160" w:before="320"/>
       </w:pPr>
       <w:r>
         <w:rPr>
@@ -6423,7 +6700,7 @@
     <w:p>
       <w:pPr>
         <w:pStyle w:val="Heading2"/>
-        <w:spacing w:before="260" w:after="120"/>
+        <w:spacing w:after="120" w:before="260"/>
       </w:pPr>
       <w:r>
         <w:rPr>
@@ -6459,6 +6736,28 @@
         </w:rPr>
         <w:t xml:space="preserve">Viikon tavoite: Paketti on testattu 12 kirjatulla testitapauksella, ja kolme löydettyä virhettä on korjattu ja testattu uudelleen.</w:t>
       </w:r>
+    </w:p>
+    <w:p>
+      <w:pPr>
+        <w:spacing w:after="80"/>
+      </w:pPr>
+      <w:r>
+        <w:rPr>
+          <w:sz w:val="19"/>
+          <w:szCs w:val="19"/>
+        </w:rPr>
+        <w:t xml:space="preserve">Kuvaohje tai materiaali: </w:t>
+      </w:r>
+      <w:hyperlink w:history="1" r:id="rIdjemtfjefekywjenishkpr">
+        <w:r>
+          <w:rPr>
+            <w:rStyle w:val="Hyperlink"/>
+            <w:sz w:val="19"/>
+            <w:szCs w:val="19"/>
+          </w:rPr>
+          <w:t xml:space="preserve">Avaa näyttöaineisto</w:t>
+        </w:r>
+      </w:hyperlink>
     </w:p>
     <w:p>
       <w:pPr>
@@ -6838,7 +7137,7 @@
     <w:p>
       <w:pPr>
         <w:pStyle w:val="Heading2"/>
-        <w:spacing w:before="260" w:after="120"/>
+        <w:spacing w:after="120" w:before="260"/>
       </w:pPr>
       <w:r>
         <w:rPr>
@@ -7227,7 +7526,7 @@
     <w:p>
       <w:pPr>
         <w:pStyle w:val="Heading1"/>
-        <w:spacing w:before="320" w:after="160"/>
+        <w:spacing w:after="160" w:before="320"/>
       </w:pPr>
       <w:r>
         <w:rPr>
@@ -7241,7 +7540,7 @@
     <w:p>
       <w:pPr>
         <w:pStyle w:val="Heading2"/>
-        <w:spacing w:before="260" w:after="120"/>
+        <w:spacing w:after="120" w:before="260"/>
       </w:pPr>
       <w:r>
         <w:rPr>
@@ -7617,7 +7916,7 @@
     <w:p>
       <w:pPr>
         <w:pStyle w:val="Heading2"/>
-        <w:spacing w:before="260" w:after="120"/>
+        <w:spacing w:after="120" w:before="260"/>
       </w:pPr>
       <w:r>
         <w:rPr>
@@ -8126,7 +8425,7 @@
     <w:p>
       <w:pPr>
         <w:pStyle w:val="Heading2"/>
-        <w:spacing w:before="260" w:after="120"/>
+        <w:spacing w:after="120" w:before="260"/>
       </w:pPr>
       <w:r>
         <w:rPr>
@@ -8162,6 +8461,50 @@
         </w:rPr>
         <w:t xml:space="preserve">Viikon tavoite: Arvioija löytää jokaisen osaamisvaatimuksen työnäytteen yhdellä tarkalla linkillä.</w:t>
       </w:r>
+    </w:p>
+    <w:p>
+      <w:pPr>
+        <w:spacing w:after="80"/>
+      </w:pPr>
+      <w:r>
+        <w:rPr>
+          <w:sz w:val="19"/>
+          <w:szCs w:val="19"/>
+        </w:rPr>
+        <w:t xml:space="preserve">Kuvaohje tai materiaali: </w:t>
+      </w:r>
+      <w:hyperlink w:history="1" r:id="rIdujwelovdzll3mlmdnalx4">
+        <w:r>
+          <w:rPr>
+            <w:rStyle w:val="Hyperlink"/>
+            <w:sz w:val="19"/>
+            <w:szCs w:val="19"/>
+          </w:rPr>
+          <w:t xml:space="preserve">Avaa näyttömatriisi</w:t>
+        </w:r>
+      </w:hyperlink>
+    </w:p>
+    <w:p>
+      <w:pPr>
+        <w:spacing w:after="80"/>
+      </w:pPr>
+      <w:r>
+        <w:rPr>
+          <w:sz w:val="19"/>
+          <w:szCs w:val="19"/>
+        </w:rPr>
+        <w:t xml:space="preserve">Kuvaohje tai materiaali: </w:t>
+      </w:r>
+      <w:hyperlink w:history="1" r:id="rIda02s3aggtd4fptzt1qhob">
+        <w:r>
+          <w:rPr>
+            <w:rStyle w:val="Hyperlink"/>
+            <w:sz w:val="19"/>
+            <w:szCs w:val="19"/>
+          </w:rPr>
+          <w:t xml:space="preserve">Avaa ja lataa AI-loki</w:t>
+        </w:r>
+      </w:hyperlink>
     </w:p>
     <w:p>
       <w:pPr>
@@ -8656,7 +8999,7 @@
     <w:p>
       <w:pPr>
         <w:pStyle w:val="Heading1"/>
-        <w:spacing w:before="320" w:after="160"/>
+        <w:spacing w:after="160" w:before="320"/>
       </w:pPr>
       <w:r>
         <w:rPr>
@@ -8745,7 +9088,7 @@
     <w:p>
       <w:pPr>
         <w:pStyle w:val="Heading1"/>
-        <w:spacing w:before="320" w:after="160"/>
+        <w:spacing w:after="160" w:before="320"/>
       </w:pPr>
       <w:r>
         <w:rPr>
@@ -10597,7 +10940,7 @@
     <w:p>
       <w:pPr>
         <w:pStyle w:val="Heading1"/>
-        <w:spacing w:before="320" w:after="160"/>
+        <w:spacing w:after="160" w:before="320"/>
       </w:pPr>
       <w:r>
         <w:rPr>
@@ -10624,7 +10967,7 @@
     <w:p>
       <w:pPr>
         <w:pStyle w:val="Heading2"/>
-        <w:spacing w:before="260" w:after="120"/>
+        <w:spacing w:after="120" w:before="260"/>
       </w:pPr>
       <w:r>
         <w:rPr>
@@ -10770,7 +11113,7 @@
     <w:p>
       <w:pPr>
         <w:pStyle w:val="Heading2"/>
-        <w:spacing w:before="260" w:after="120"/>
+        <w:spacing w:after="120" w:before="260"/>
       </w:pPr>
       <w:r>
         <w:rPr>
@@ -10952,7 +11295,7 @@
     <w:p>
       <w:pPr>
         <w:pStyle w:val="Heading2"/>
-        <w:spacing w:before="260" w:after="120"/>
+        <w:spacing w:after="120" w:before="260"/>
       </w:pPr>
       <w:r>
         <w:rPr>
@@ -11074,6 +11417,43 @@
 
 <file path=word/comments.xml><?xml version="1.0" encoding="utf-8"?>
 <w:comments xmlns:cx="http://schemas.microsoft.com/office/drawing/2014/chartex" xmlns:cx1="http://schemas.microsoft.com/office/drawing/2015/9/8/chartex" xmlns:cx2="http://schemas.microsoft.com/office/drawing/2015/10/21/chartex" xmlns:cx3="http://schemas.microsoft.com/office/drawing/2016/5/9/chartex" xmlns:cx4="http://schemas.microsoft.com/office/drawing/2016/5/10/chartex" xmlns:cx5="http://schemas.microsoft.com/office/drawing/2016/5/11/chartex" xmlns:cx6="http://schemas.microsoft.com/office/drawing/2016/5/12/chartex" xmlns:cx7="http://schemas.microsoft.com/office/drawing/2016/5/13/chartex" xmlns:cx8="http://schemas.microsoft.com/office/drawing/2016/5/14/chartex" xmlns:mc="http://schemas.openxmlformats.org/markup-compatibility/2006" xmlns:aink="http://schemas.microsoft.com/office/drawing/2016/ink" xmlns:am3d="http://schemas.microsoft.com/office/drawing/2017/model3d" xmlns:o="urn:schemas-microsoft-com:office:office" xmlns:r="http://schemas.openxmlformats.org/officeDocument/2006/relationships" xmlns:m="http://schemas.openxmlformats.org/officeDocument/2006/math" xmlns:v="urn:schemas-microsoft-com:vml" xmlns:wp14="http://schemas.microsoft.com/office/word/2010/wordprocessingDrawing" xmlns:wp="http://schemas.openxmlformats.org/drawingml/2006/wordprocessingDrawing" xmlns:w10="urn:schemas-microsoft-com:office:word" xmlns:w="http://schemas.openxmlformats.org/wordprocessingml/2006/main" xmlns:w14="http://schemas.microsoft.com/office/word/2010/wordml" xmlns:w15="http://schemas.microsoft.com/office/word/2012/wordml" xmlns:w16cex="http://schemas.microsoft.com/office/word/2018/wordml/cex" xmlns:w16cid="http://schemas.microsoft.com/office/word/2016/wordml/cid" xmlns:w16="http://schemas.microsoft.com/office/word/2018/wordml" xmlns:w16sdtdh="http://schemas.microsoft.com/office/word/2020/wordml/sdtdatahash" xmlns:w16se="http://schemas.microsoft.com/office/word/2015/wordml/symex" xmlns:wpg="http://schemas.microsoft.com/office/word/2010/wordprocessingGroup" xmlns:wpi="http://schemas.microsoft.com/office/word/2010/wordprocessingInk" xmlns:wne="http://schemas.microsoft.com/office/word/2006/wordml" xmlns:wps="http://schemas.microsoft.com/office/word/2010/wordprocessingShape"/>
+</file>
+
+<file path=word/endnotes.xml><?xml version="1.0" encoding="utf-8"?>
+<w:endnotes xmlns:wpc="http://schemas.microsoft.com/office/word/2010/wordprocessingCanvas" xmlns:mc="http://schemas.openxmlformats.org/markup-compatibility/2006" xmlns:o="urn:schemas-microsoft-com:office:office" xmlns:r="http://schemas.openxmlformats.org/officeDocument/2006/relationships" xmlns:m="http://schemas.openxmlformats.org/officeDocument/2006/math" xmlns:v="urn:schemas-microsoft-com:vml" xmlns:wp14="http://schemas.microsoft.com/office/word/2010/wordprocessingDrawing" xmlns:wp="http://schemas.openxmlformats.org/drawingml/2006/wordprocessingDrawing" xmlns:w10="urn:schemas-microsoft-com:office:word" xmlns:w="http://schemas.openxmlformats.org/wordprocessingml/2006/main" xmlns:w14="http://schemas.microsoft.com/office/word/2010/wordml" xmlns:w15="http://schemas.microsoft.com/office/word/2012/wordml" xmlns:wpg="http://schemas.microsoft.com/office/word/2010/wordprocessingGroup" xmlns:wpi="http://schemas.microsoft.com/office/word/2010/wordprocessingInk" xmlns:wne="http://schemas.microsoft.com/office/word/2006/wordml" xmlns:wps="http://schemas.microsoft.com/office/word/2010/wordprocessingShape" mc:Ignorable="w14 w15 wp14">
+  <w:endnote w:type="separator" w:id="-1">
+    <w:p>
+      <w:pPr>
+        <w:spacing w:after="0" w:line="240" w:lineRule="auto"/>
+      </w:pPr>
+      <w:r>
+        <w:rPr>
+          <w:rStyle w:val="EndnoteReference"/>
+        </w:rPr>
+        <w:endnoteRef/>
+      </w:r>
+      <w:r>
+        <w:separator/>
+      </w:r>
+    </w:p>
+  </w:endnote>
+  <w:endnote w:type="continuationSeparator" w:id="0">
+    <w:p>
+      <w:pPr>
+        <w:spacing w:after="0" w:line="240" w:lineRule="auto"/>
+      </w:pPr>
+      <w:r>
+        <w:rPr>
+          <w:rStyle w:val="EndnoteReference"/>
+        </w:rPr>
+        <w:endnoteRef/>
+      </w:r>
+      <w:r>
+        <w:continuationSeparator/>
+      </w:r>
+    </w:p>
+  </w:endnote>
+</w:endnotes>
 </file>
 
 <file path=word/footnotes.xml><?xml version="1.0" encoding="utf-8"?>
@@ -11213,9 +11593,9 @@
   <w:docDefaults>
     <w:rPrDefault>
       <w:rPr>
+        <w:rFonts w:ascii="Calibri" w:cs="Calibri" w:eastAsia="Calibri" w:hAnsi="Calibri"/>
         <w:sz w:val="21"/>
         <w:szCs w:val="21"/>
-        <w:rFonts w:ascii="Calibri" w:cs="Calibri" w:eastAsia="Calibri" w:hAnsi="Calibri"/>
       </w:rPr>
     </w:rPrDefault>
     <w:pPrDefault/>
@@ -11313,8 +11693,8 @@
     <w:uiPriority w:val="99"/>
     <w:unhideWhenUsed/>
     <w:rPr>
+      <w:color w:val="0563C1"/>
       <w:u w:val="single"/>
-      <w:color w:val="0563C1"/>
     </w:rPr>
   </w:style>
   <w:style w:type="character" w:styleId="FootnoteReference">
@@ -11354,5 +11734,42 @@
       <w:szCs w:val="20"/>
     </w:rPr>
   </w:style>
+  <w:style w:type="character" w:styleId="EndnoteReference">
+    <w:name w:val="endnote reference"/>
+    <w:basedOn w:val="DefaultParagraphFont"/>
+    <w:uiPriority w:val="99"/>
+    <w:semiHidden/>
+    <w:unhideWhenUsed/>
+    <w:rPr>
+      <w:vertAlign w:val="superscript"/>
+    </w:rPr>
+  </w:style>
+  <w:style w:type="paragraph" w:styleId="EndnoteText">
+    <w:name w:val="endnote text"/>
+    <w:basedOn w:val="Normal"/>
+    <w:link w:val="EndnoteTextChar"/>
+    <w:uiPriority w:val="99"/>
+    <w:semiHidden/>
+    <w:unhideWhenUsed/>
+    <w:pPr>
+      <w:spacing w:after="0" w:line="240" w:lineRule="auto"/>
+    </w:pPr>
+    <w:rPr>
+      <w:sz w:val="20"/>
+      <w:szCs w:val="20"/>
+    </w:rPr>
+  </w:style>
+  <w:style w:type="character" w:styleId="EndnoteTextChar">
+    <w:name w:val="Endnote Text Char"/>
+    <w:basedOn w:val="DefaultParagraphFont"/>
+    <w:link w:val="EndnoteText"/>
+    <w:uiPriority w:val="99"/>
+    <w:semiHidden/>
+    <w:unhideWhenUsed/>
+    <w:rPr>
+      <w:sz w:val="20"/>
+      <w:szCs w:val="20"/>
+    </w:rPr>
+  </w:style>
 </w:styles>
 </file>
</xml_diff>